<commit_message>
Updated models get to account for models with no epochs.
</commit_message>
<xml_diff>
--- a/Word/diplomski_rad_word2007.docx
+++ b/Word/diplomski_rad_word2007.docx
@@ -841,84 +841,25 @@
     <w:p/>
     <w:p/>
     <w:p>
+      <w:r>
+        <w:t>Dato istraživanje poredi rješavanje problema dubokog učenja na primjeru detekcije raka pluća unutar Python i .NET okruženja, te analizira dobijene rezultate.</w:t>
+      </w:r>
+    </w:p>
+    <w:p>
+      <w:r>
+        <w:t>Rješavanje problema je implementirano na identičan način u oba okruženja uz strogo definisane parametre. Dati parametri definišu pravila poput identične implementacije konvolucione neuronske mreže u oba okruženja, korištenja istih hiperparametara (funkcija troška, optimizator, stopa učenja, veličina serije), istog početnog stanja neuronske mreže, te treniranja više puta u cilju smanjenja devijacija. Problem je riješen korištenjem TorchSharp za .NET i PyTorch za Python biblioteka. Implementirana je konvolucina neuronska mreža koja je trenirana pomoću javno dostupnih podataka sa platforme Kaggle. Orkestracija je realizovana uz pomoć .NET Aspire tehnologije, povezivanjem dva odvojena API interfejsa, te je kreirana web aplikacija koja omogućava treniranje, analizu i poređenje treniranih modela.</w:t>
+      </w:r>
+    </w:p>
+    <w:p/>
+    <w:p>
+      <w:r>
+        <w:t>Dobijeni rezultati demonstriraju činjenicu da su oba okruženja ostvarila gotovo identične performanse u smislu vremena treniranja modela, kao i samih metrika modela.</w:t>
+      </w:r>
+    </w:p>
+    <w:p/>
+    <w:p>
       <w:pPr>
         <w:pStyle w:val="Paragraf"/>
-      </w:pPr>
-      <w:r>
-        <w:t>Sažetak mora dati prikaz istraživanja provedenih u radu. Sažetak ne smije biti duži od jedne stranice i mora sadržavati ključne elemente:</w:t>
-      </w:r>
-    </w:p>
-    <w:p>
-      <w:pPr>
-        <w:pStyle w:val="Paragraf"/>
-        <w:numPr>
-          <w:ilvl w:val="0"/>
-          <w:numId w:val="1"/>
-        </w:numPr>
-        <w:ind w:left="584" w:hanging="357"/>
-      </w:pPr>
-      <w:r>
-        <w:t>Cilj istraživanja</w:t>
-      </w:r>
-    </w:p>
-    <w:p>
-      <w:pPr>
-        <w:pStyle w:val="Paragraf"/>
-        <w:numPr>
-          <w:ilvl w:val="0"/>
-          <w:numId w:val="1"/>
-        </w:numPr>
-        <w:ind w:left="584" w:hanging="357"/>
-      </w:pPr>
-      <w:r>
-        <w:t>Korištene metodologije</w:t>
-      </w:r>
-    </w:p>
-    <w:p>
-      <w:pPr>
-        <w:pStyle w:val="Paragraf"/>
-        <w:numPr>
-          <w:ilvl w:val="0"/>
-          <w:numId w:val="1"/>
-        </w:numPr>
-        <w:ind w:left="584" w:hanging="357"/>
-      </w:pPr>
-      <w:r>
-        <w:t>Glavne spoznaje i zaključak</w:t>
-      </w:r>
-    </w:p>
-    <w:p>
-      <w:pPr>
-        <w:pStyle w:val="Paragraf"/>
-      </w:pPr>
-      <w:r>
-        <w:t>Sažetak ne smije imati vizualne stavke</w:t>
-      </w:r>
-      <w:r>
-        <w:t xml:space="preserve"> </w:t>
-      </w:r>
-      <w:r>
-        <w:t>(slike, grafike itd.), referentne brojeve korištene</w:t>
-      </w:r>
-      <w:r>
-        <w:rPr>
-          <w:rFonts w:ascii="NimbusRomNo9L-Regu" w:hAnsi="NimbusRomNo9L-Regu" w:cs="NimbusRomNo9L-Regu"/>
-          <w:szCs w:val="24"/>
-        </w:rPr>
-        <w:t xml:space="preserve"> </w:t>
-      </w:r>
-      <w:r>
-        <w:t>literature i citate. Sažetak mora biti jedinstven prikaz rada i mora sadržavati glavne ključne riječi vezane za problem koji se obrađuje u radu. Sažetak mora početi na novoj stranici.</w:t>
-      </w:r>
-    </w:p>
-    <w:p>
-      <w:pPr>
-        <w:pStyle w:val="Paragraf"/>
-      </w:pPr>
-    </w:p>
-    <w:p>
-      <w:pPr>
-        <w:pStyle w:val="Paragraf"/>
         <w:rPr>
           <w:i/>
         </w:rPr>
@@ -936,7 +877,7 @@
         <w:rPr>
           <w:i/>
         </w:rPr>
-        <w:t>Prva, druga, treća.</w:t>
+        <w:t xml:space="preserve">duboko učenje, neurosnke mreže,.NET, TorchSharp, PyTorch </w:t>
       </w:r>
     </w:p>
     <w:p>
@@ -975,57 +916,70 @@
     <w:p/>
     <w:p>
       <w:pPr>
-        <w:pStyle w:val="Paragraf"/>
-      </w:pPr>
-      <w:r>
-        <w:t>The abstract shall provide a description of the investigation undertaken in the thesis. The Abstract shall not be longer than one page, and it must contain the following three critical elements:</w:t>
-      </w:r>
-    </w:p>
-    <w:p>
-      <w:pPr>
-        <w:pStyle w:val="Paragraf"/>
-        <w:numPr>
-          <w:ilvl w:val="0"/>
-          <w:numId w:val="6"/>
-        </w:numPr>
-        <w:ind w:left="527" w:hanging="357"/>
-      </w:pPr>
-      <w:r>
-        <w:t>A statement of purpose of the thesis and its objective</w:t>
-      </w:r>
-    </w:p>
-    <w:p>
-      <w:pPr>
-        <w:pStyle w:val="Paragraf"/>
-        <w:numPr>
-          <w:ilvl w:val="0"/>
-          <w:numId w:val="6"/>
-        </w:numPr>
-        <w:ind w:left="527" w:hanging="357"/>
-      </w:pPr>
-      <w:r>
-        <w:t>A statement of the methodology employed to conduct the investigation</w:t>
-      </w:r>
-    </w:p>
-    <w:p>
-      <w:pPr>
-        <w:pStyle w:val="Paragraf"/>
-        <w:numPr>
-          <w:ilvl w:val="0"/>
-          <w:numId w:val="6"/>
-        </w:numPr>
-        <w:ind w:left="527" w:hanging="357"/>
-      </w:pPr>
-      <w:r>
-        <w:t>A statement of the major findings and conclusions</w:t>
-      </w:r>
-    </w:p>
-    <w:p>
-      <w:pPr>
-        <w:pStyle w:val="Paragraf"/>
-      </w:pPr>
-      <w:r>
-        <w:t>The abstract shall not feature visual items, reference numbers, other types of documentation, and direct quotations. The abstract must be a unique representation of the thesis and must contain the main keywords related to the problem addressed in the thesis. Always begin the abstract on a new page.</w:t>
+        <w:rPr>
+          <w:lang w:val="en-US"/>
+        </w:rPr>
+      </w:pPr>
+      <w:bookmarkStart w:id="0" w:name="_Toc328604812"/>
+      <w:r>
+        <w:rPr>
+          <w:lang w:val="en-US"/>
+        </w:rPr>
+        <w:t>This research compares the resolution of a deep learning problem, specifically lung cancer detection, within Python and .NET environments, and analyzes the obtained results.</w:t>
+      </w:r>
+    </w:p>
+    <w:p>
+      <w:pPr>
+        <w:rPr>
+          <w:lang w:val="en-US"/>
+        </w:rPr>
+      </w:pPr>
+      <w:r>
+        <w:rPr>
+          <w:lang w:val="en-US"/>
+        </w:rPr>
+        <w:t xml:space="preserve">The problem-solving process was implemented identically in both environments using strictly defined parameters. These parameters established rules such as the identical implementation of a convolutional neural network in both environments, the use of the same hyperparameters (loss function, optimizer, learning rate, batch size), the same initial state of the neural network, and multiple training iterations to reduce deviations. The problem was solved using the </w:t>
+      </w:r>
+      <w:proofErr w:type="spellStart"/>
+      <w:r>
+        <w:rPr>
+          <w:lang w:val="en-US"/>
+        </w:rPr>
+        <w:t>TorchSharp</w:t>
+      </w:r>
+      <w:proofErr w:type="spellEnd"/>
+      <w:r>
+        <w:rPr>
+          <w:lang w:val="en-US"/>
+        </w:rPr>
+        <w:t xml:space="preserve"> library for .NET and </w:t>
+      </w:r>
+      <w:proofErr w:type="spellStart"/>
+      <w:r>
+        <w:rPr>
+          <w:lang w:val="en-US"/>
+        </w:rPr>
+        <w:t>PyTorch</w:t>
+      </w:r>
+      <w:proofErr w:type="spellEnd"/>
+      <w:r>
+        <w:rPr>
+          <w:lang w:val="en-US"/>
+        </w:rPr>
+        <w:t xml:space="preserve"> for Python. A convolutional neural network was implemented and trained using publicly available data from the Kaggle platform. Orchestration was realized using .NET Aspire technology by connecting two separate API interfaces, and a web application was created to enable the training, analysis, and comparison of the trained models.</w:t>
+      </w:r>
+    </w:p>
+    <w:p>
+      <w:pPr>
+        <w:rPr>
+          <w:lang w:val="en-US"/>
+        </w:rPr>
+      </w:pPr>
+      <w:r>
+        <w:rPr>
+          <w:lang w:val="en-US"/>
+        </w:rPr>
+        <w:t>The obtained results demonstrate that both environments achieved almost identical performance in terms of model training time, as well as the actual model metrics.</w:t>
       </w:r>
     </w:p>
     <w:p>
@@ -1044,7 +998,6 @@
           <w:szCs w:val="22"/>
         </w:rPr>
       </w:pPr>
-      <w:bookmarkStart w:id="0" w:name="_Toc328604812"/>
       <w:r>
         <w:rPr>
           <w:rFonts w:eastAsiaTheme="minorHAnsi" w:cstheme="minorBidi"/>
@@ -1076,6 +1029,7 @@
         </w:rPr>
         <w:t xml:space="preserve"> </w:t>
       </w:r>
+      <w:bookmarkEnd w:id="0"/>
       <w:r>
         <w:rPr>
           <w:rFonts w:eastAsiaTheme="minorHAnsi" w:cstheme="minorBidi"/>
@@ -1085,8 +1039,9 @@
           <w:sz w:val="24"/>
           <w:szCs w:val="22"/>
         </w:rPr>
-        <w:t>First, Second, Third</w:t>
-      </w:r>
+        <w:t xml:space="preserve">deep learning, neural networks, .NET, </w:t>
+      </w:r>
+      <w:proofErr w:type="spellStart"/>
       <w:r>
         <w:rPr>
           <w:rFonts w:eastAsiaTheme="minorHAnsi" w:cstheme="minorBidi"/>
@@ -1096,9 +1051,33 @@
           <w:sz w:val="24"/>
           <w:szCs w:val="22"/>
         </w:rPr>
-        <w:t>.</w:t>
-      </w:r>
-      <w:bookmarkEnd w:id="0"/>
+        <w:t>TorchSharp</w:t>
+      </w:r>
+      <w:proofErr w:type="spellEnd"/>
+      <w:r>
+        <w:rPr>
+          <w:rFonts w:eastAsiaTheme="minorHAnsi" w:cstheme="minorBidi"/>
+          <w:b w:val="0"/>
+          <w:bCs w:val="0"/>
+          <w:i/>
+          <w:sz w:val="24"/>
+          <w:szCs w:val="22"/>
+        </w:rPr>
+        <w:t xml:space="preserve">, </w:t>
+      </w:r>
+      <w:proofErr w:type="spellStart"/>
+      <w:r>
+        <w:rPr>
+          <w:rFonts w:eastAsiaTheme="minorHAnsi" w:cstheme="minorBidi"/>
+          <w:b w:val="0"/>
+          <w:bCs w:val="0"/>
+          <w:i/>
+          <w:sz w:val="24"/>
+          <w:szCs w:val="22"/>
+        </w:rPr>
+        <w:t>PyTorch</w:t>
+      </w:r>
+      <w:proofErr w:type="spellEnd"/>
     </w:p>
     <w:p>
       <w:pPr>
@@ -1166,7 +1145,7 @@
           <w:r>
             <w:fldChar w:fldCharType="separate"/>
           </w:r>
-          <w:hyperlink w:anchor="_Toc234577044" w:history="1">
+          <w:hyperlink w:anchor="_Toc234846016" w:history="1">
             <w:r>
               <w:rPr>
                 <w:rStyle w:val="Hyperlink"/>
@@ -1193,7 +1172,7 @@
                 <w:noProof/>
                 <w:webHidden/>
               </w:rPr>
-              <w:instrText xml:space="preserve"> PAGEREF _Toc234577044 \h </w:instrText>
+              <w:instrText xml:space="preserve"> PAGEREF _Toc234846016 \h </w:instrText>
             </w:r>
             <w:r>
               <w:rPr>
@@ -1238,7 +1217,7 @@
               <w:lang w:val="en-US"/>
             </w:rPr>
           </w:pPr>
-          <w:hyperlink w:anchor="_Toc234577045" w:history="1">
+          <w:hyperlink w:anchor="_Toc234846017" w:history="1">
             <w:r>
               <w:rPr>
                 <w:rStyle w:val="Hyperlink"/>
@@ -1281,7 +1260,7 @@
                 <w:noProof/>
                 <w:webHidden/>
               </w:rPr>
-              <w:instrText xml:space="preserve"> PAGEREF _Toc234577045 \h </w:instrText>
+              <w:instrText xml:space="preserve"> PAGEREF _Toc234846017 \h </w:instrText>
             </w:r>
             <w:r>
               <w:rPr>
@@ -1325,7 +1304,7 @@
               <w:lang w:val="en-US"/>
             </w:rPr>
           </w:pPr>
-          <w:hyperlink w:anchor="_Toc234577046" w:history="1">
+          <w:hyperlink w:anchor="_Toc234846018" w:history="1">
             <w:r>
               <w:rPr>
                 <w:rStyle w:val="Hyperlink"/>
@@ -1352,7 +1331,7 @@
                 <w:noProof/>
                 <w:webHidden/>
               </w:rPr>
-              <w:instrText xml:space="preserve"> PAGEREF _Toc234577046 \h </w:instrText>
+              <w:instrText xml:space="preserve"> PAGEREF _Toc234846018 \h </w:instrText>
             </w:r>
             <w:r>
               <w:rPr>
@@ -1397,7 +1376,7 @@
               <w:lang w:val="en-US"/>
             </w:rPr>
           </w:pPr>
-          <w:hyperlink w:anchor="_Toc234577047" w:history="1">
+          <w:hyperlink w:anchor="_Toc234846019" w:history="1">
             <w:r>
               <w:rPr>
                 <w:rStyle w:val="Hyperlink"/>
@@ -1440,7 +1419,7 @@
                 <w:noProof/>
                 <w:webHidden/>
               </w:rPr>
-              <w:instrText xml:space="preserve"> PAGEREF _Toc234577047 \h </w:instrText>
+              <w:instrText xml:space="preserve"> PAGEREF _Toc234846019 \h </w:instrText>
             </w:r>
             <w:r>
               <w:rPr>
@@ -1485,7 +1464,7 @@
               <w:lang w:val="en-US"/>
             </w:rPr>
           </w:pPr>
-          <w:hyperlink w:anchor="_Toc234577048" w:history="1">
+          <w:hyperlink w:anchor="_Toc234846020" w:history="1">
             <w:r>
               <w:rPr>
                 <w:rStyle w:val="Hyperlink"/>
@@ -1528,7 +1507,7 @@
                 <w:noProof/>
                 <w:webHidden/>
               </w:rPr>
-              <w:instrText xml:space="preserve"> PAGEREF _Toc234577048 \h </w:instrText>
+              <w:instrText xml:space="preserve"> PAGEREF _Toc234846020 \h </w:instrText>
             </w:r>
             <w:r>
               <w:rPr>
@@ -1573,7 +1552,7 @@
               <w:lang w:val="en-US"/>
             </w:rPr>
           </w:pPr>
-          <w:hyperlink w:anchor="_Toc234577049" w:history="1">
+          <w:hyperlink w:anchor="_Toc234846021" w:history="1">
             <w:r>
               <w:rPr>
                 <w:rStyle w:val="Hyperlink"/>
@@ -1616,7 +1595,7 @@
                 <w:noProof/>
                 <w:webHidden/>
               </w:rPr>
-              <w:instrText xml:space="preserve"> PAGEREF _Toc234577049 \h </w:instrText>
+              <w:instrText xml:space="preserve"> PAGEREF _Toc234846021 \h </w:instrText>
             </w:r>
             <w:r>
               <w:rPr>
@@ -1661,7 +1640,7 @@
               <w:lang w:val="en-US"/>
             </w:rPr>
           </w:pPr>
-          <w:hyperlink w:anchor="_Toc234577050" w:history="1">
+          <w:hyperlink w:anchor="_Toc234846022" w:history="1">
             <w:r>
               <w:rPr>
                 <w:rStyle w:val="Hyperlink"/>
@@ -1704,7 +1683,7 @@
                 <w:noProof/>
                 <w:webHidden/>
               </w:rPr>
-              <w:instrText xml:space="preserve"> PAGEREF _Toc234577050 \h </w:instrText>
+              <w:instrText xml:space="preserve"> PAGEREF _Toc234846022 \h </w:instrText>
             </w:r>
             <w:r>
               <w:rPr>
@@ -1749,7 +1728,7 @@
               <w:lang w:val="en-US"/>
             </w:rPr>
           </w:pPr>
-          <w:hyperlink w:anchor="_Toc234577051" w:history="1">
+          <w:hyperlink w:anchor="_Toc234846023" w:history="1">
             <w:r>
               <w:rPr>
                 <w:rStyle w:val="Hyperlink"/>
@@ -1792,7 +1771,7 @@
                 <w:noProof/>
                 <w:webHidden/>
               </w:rPr>
-              <w:instrText xml:space="preserve"> PAGEREF _Toc234577051 \h </w:instrText>
+              <w:instrText xml:space="preserve"> PAGEREF _Toc234846023 \h </w:instrText>
             </w:r>
             <w:r>
               <w:rPr>
@@ -1835,7 +1814,7 @@
               <w:lang w:val="en-US"/>
             </w:rPr>
           </w:pPr>
-          <w:hyperlink w:anchor="_Toc234577052" w:history="1">
+          <w:hyperlink w:anchor="_Toc234846024" w:history="1">
             <w:r>
               <w:rPr>
                 <w:rStyle w:val="Hyperlink"/>
@@ -1876,7 +1855,7 @@
                 <w:noProof/>
                 <w:webHidden/>
               </w:rPr>
-              <w:instrText xml:space="preserve"> PAGEREF _Toc234577052 \h </w:instrText>
+              <w:instrText xml:space="preserve"> PAGEREF _Toc234846024 \h </w:instrText>
             </w:r>
             <w:r>
               <w:rPr>
@@ -1919,7 +1898,7 @@
               <w:lang w:val="en-US"/>
             </w:rPr>
           </w:pPr>
-          <w:hyperlink w:anchor="_Toc234577053" w:history="1">
+          <w:hyperlink w:anchor="_Toc234846025" w:history="1">
             <w:r>
               <w:rPr>
                 <w:rStyle w:val="Hyperlink"/>
@@ -1960,7 +1939,7 @@
                 <w:noProof/>
                 <w:webHidden/>
               </w:rPr>
-              <w:instrText xml:space="preserve"> PAGEREF _Toc234577053 \h </w:instrText>
+              <w:instrText xml:space="preserve"> PAGEREF _Toc234846025 \h </w:instrText>
             </w:r>
             <w:r>
               <w:rPr>
@@ -2003,7 +1982,7 @@
               <w:lang w:val="en-US"/>
             </w:rPr>
           </w:pPr>
-          <w:hyperlink w:anchor="_Toc234577054" w:history="1">
+          <w:hyperlink w:anchor="_Toc234846026" w:history="1">
             <w:r>
               <w:rPr>
                 <w:rStyle w:val="Hyperlink"/>
@@ -2044,7 +2023,7 @@
                 <w:noProof/>
                 <w:webHidden/>
               </w:rPr>
-              <w:instrText xml:space="preserve"> PAGEREF _Toc234577054 \h </w:instrText>
+              <w:instrText xml:space="preserve"> PAGEREF _Toc234846026 \h </w:instrText>
             </w:r>
             <w:r>
               <w:rPr>
@@ -2088,7 +2067,7 @@
               <w:lang w:val="en-US"/>
             </w:rPr>
           </w:pPr>
-          <w:hyperlink w:anchor="_Toc234577055" w:history="1">
+          <w:hyperlink w:anchor="_Toc234846027" w:history="1">
             <w:r>
               <w:rPr>
                 <w:rStyle w:val="Hyperlink"/>
@@ -2115,7 +2094,7 @@
                 <w:noProof/>
                 <w:webHidden/>
               </w:rPr>
-              <w:instrText xml:space="preserve"> PAGEREF _Toc234577055 \h </w:instrText>
+              <w:instrText xml:space="preserve"> PAGEREF _Toc234846027 \h </w:instrText>
             </w:r>
             <w:r>
               <w:rPr>
@@ -2160,7 +2139,7 @@
               <w:lang w:val="en-US"/>
             </w:rPr>
           </w:pPr>
-          <w:hyperlink w:anchor="_Toc234577056" w:history="1">
+          <w:hyperlink w:anchor="_Toc234846028" w:history="1">
             <w:r>
               <w:rPr>
                 <w:rStyle w:val="Hyperlink"/>
@@ -2219,7 +2198,7 @@
                 <w:noProof/>
                 <w:webHidden/>
               </w:rPr>
-              <w:instrText xml:space="preserve"> PAGEREF _Toc234577056 \h </w:instrText>
+              <w:instrText xml:space="preserve"> PAGEREF _Toc234846028 \h </w:instrText>
             </w:r>
             <w:r>
               <w:rPr>
@@ -2264,7 +2243,7 @@
               <w:lang w:val="en-US"/>
             </w:rPr>
           </w:pPr>
-          <w:hyperlink w:anchor="_Toc234577057" w:history="1">
+          <w:hyperlink w:anchor="_Toc234846029" w:history="1">
             <w:r>
               <w:rPr>
                 <w:rStyle w:val="Hyperlink"/>
@@ -2323,7 +2302,7 @@
                 <w:noProof/>
                 <w:webHidden/>
               </w:rPr>
-              <w:instrText xml:space="preserve"> PAGEREF _Toc234577057 \h </w:instrText>
+              <w:instrText xml:space="preserve"> PAGEREF _Toc234846029 \h </w:instrText>
             </w:r>
             <w:r>
               <w:rPr>
@@ -2368,7 +2347,7 @@
               <w:lang w:val="en-US"/>
             </w:rPr>
           </w:pPr>
-          <w:hyperlink w:anchor="_Toc234577058" w:history="1">
+          <w:hyperlink w:anchor="_Toc234846030" w:history="1">
             <w:r>
               <w:rPr>
                 <w:rStyle w:val="Hyperlink"/>
@@ -2411,7 +2390,7 @@
                 <w:noProof/>
                 <w:webHidden/>
               </w:rPr>
-              <w:instrText xml:space="preserve"> PAGEREF _Toc234577058 \h </w:instrText>
+              <w:instrText xml:space="preserve"> PAGEREF _Toc234846030 \h </w:instrText>
             </w:r>
             <w:r>
               <w:rPr>
@@ -2456,7 +2435,7 @@
               <w:lang w:val="en-US"/>
             </w:rPr>
           </w:pPr>
-          <w:hyperlink w:anchor="_Toc234577059" w:history="1">
+          <w:hyperlink w:anchor="_Toc234846031" w:history="1">
             <w:r>
               <w:rPr>
                 <w:rStyle w:val="Hyperlink"/>
@@ -2499,7 +2478,7 @@
                 <w:noProof/>
                 <w:webHidden/>
               </w:rPr>
-              <w:instrText xml:space="preserve"> PAGEREF _Toc234577059 \h </w:instrText>
+              <w:instrText xml:space="preserve"> PAGEREF _Toc234846031 \h </w:instrText>
             </w:r>
             <w:r>
               <w:rPr>
@@ -2544,7 +2523,7 @@
               <w:lang w:val="en-US"/>
             </w:rPr>
           </w:pPr>
-          <w:hyperlink w:anchor="_Toc234577060" w:history="1">
+          <w:hyperlink w:anchor="_Toc234846032" w:history="1">
             <w:r>
               <w:rPr>
                 <w:rStyle w:val="Hyperlink"/>
@@ -2587,7 +2566,7 @@
                 <w:noProof/>
                 <w:webHidden/>
               </w:rPr>
-              <w:instrText xml:space="preserve"> PAGEREF _Toc234577060 \h </w:instrText>
+              <w:instrText xml:space="preserve"> PAGEREF _Toc234846032 \h </w:instrText>
             </w:r>
             <w:r>
               <w:rPr>
@@ -2632,7 +2611,7 @@
               <w:lang w:val="en-US"/>
             </w:rPr>
           </w:pPr>
-          <w:hyperlink w:anchor="_Toc234577061" w:history="1">
+          <w:hyperlink w:anchor="_Toc234846033" w:history="1">
             <w:r>
               <w:rPr>
                 <w:rStyle w:val="Hyperlink"/>
@@ -2675,7 +2654,7 @@
                 <w:noProof/>
                 <w:webHidden/>
               </w:rPr>
-              <w:instrText xml:space="preserve"> PAGEREF _Toc234577061 \h </w:instrText>
+              <w:instrText xml:space="preserve"> PAGEREF _Toc234846033 \h </w:instrText>
             </w:r>
             <w:r>
               <w:rPr>
@@ -2720,7 +2699,7 @@
               <w:lang w:val="en-US"/>
             </w:rPr>
           </w:pPr>
-          <w:hyperlink w:anchor="_Toc234577062" w:history="1">
+          <w:hyperlink w:anchor="_Toc234846034" w:history="1">
             <w:r>
               <w:rPr>
                 <w:rStyle w:val="Hyperlink"/>
@@ -2763,7 +2742,7 @@
                 <w:noProof/>
                 <w:webHidden/>
               </w:rPr>
-              <w:instrText xml:space="preserve"> PAGEREF _Toc234577062 \h </w:instrText>
+              <w:instrText xml:space="preserve"> PAGEREF _Toc234846034 \h </w:instrText>
             </w:r>
             <w:r>
               <w:rPr>
@@ -2808,7 +2787,7 @@
               <w:lang w:val="en-US"/>
             </w:rPr>
           </w:pPr>
-          <w:hyperlink w:anchor="_Toc234577063" w:history="1">
+          <w:hyperlink w:anchor="_Toc234846035" w:history="1">
             <w:r>
               <w:rPr>
                 <w:rStyle w:val="Hyperlink"/>
@@ -2851,7 +2830,7 @@
                 <w:noProof/>
                 <w:webHidden/>
               </w:rPr>
-              <w:instrText xml:space="preserve"> PAGEREF _Toc234577063 \h </w:instrText>
+              <w:instrText xml:space="preserve"> PAGEREF _Toc234846035 \h </w:instrText>
             </w:r>
             <w:r>
               <w:rPr>
@@ -2895,13 +2874,13 @@
               <w:lang w:val="en-US"/>
             </w:rPr>
           </w:pPr>
-          <w:hyperlink w:anchor="_Toc234577064" w:history="1">
+          <w:hyperlink w:anchor="_Toc234846036" w:history="1">
             <w:r>
               <w:rPr>
                 <w:rStyle w:val="Hyperlink"/>
                 <w:noProof/>
               </w:rPr>
-              <w:t>Poglavlje 4 Rezultati I analiza</w:t>
+              <w:t>Poglavlje 4 Rezultati i analiza</w:t>
             </w:r>
             <w:r>
               <w:rPr>
@@ -2922,7 +2901,7 @@
                 <w:noProof/>
                 <w:webHidden/>
               </w:rPr>
-              <w:instrText xml:space="preserve"> PAGEREF _Toc234577064 \h </w:instrText>
+              <w:instrText xml:space="preserve"> PAGEREF _Toc234846036 \h </w:instrText>
             </w:r>
             <w:r>
               <w:rPr>
@@ -2967,7 +2946,7 @@
               <w:lang w:val="en-US"/>
             </w:rPr>
           </w:pPr>
-          <w:hyperlink w:anchor="_Toc234577065" w:history="1">
+          <w:hyperlink w:anchor="_Toc234846037" w:history="1">
             <w:r>
               <w:rPr>
                 <w:rStyle w:val="Hyperlink"/>
@@ -3012,7 +2991,7 @@
                 <w:noProof/>
                 <w:webHidden/>
               </w:rPr>
-              <w:instrText xml:space="preserve"> PAGEREF _Toc234577065 \h </w:instrText>
+              <w:instrText xml:space="preserve"> PAGEREF _Toc234846037 \h </w:instrText>
             </w:r>
             <w:r>
               <w:rPr>
@@ -3057,7 +3036,7 @@
               <w:lang w:val="en-US"/>
             </w:rPr>
           </w:pPr>
-          <w:hyperlink w:anchor="_Toc234577066" w:history="1">
+          <w:hyperlink w:anchor="_Toc234846038" w:history="1">
             <w:r>
               <w:rPr>
                 <w:rStyle w:val="Hyperlink"/>
@@ -3102,7 +3081,7 @@
                 <w:noProof/>
                 <w:webHidden/>
               </w:rPr>
-              <w:instrText xml:space="preserve"> PAGEREF _Toc234577066 \h </w:instrText>
+              <w:instrText xml:space="preserve"> PAGEREF _Toc234846038 \h </w:instrText>
             </w:r>
             <w:r>
               <w:rPr>
@@ -3147,7 +3126,7 @@
               <w:lang w:val="en-US"/>
             </w:rPr>
           </w:pPr>
-          <w:hyperlink w:anchor="_Toc234577067" w:history="1">
+          <w:hyperlink w:anchor="_Toc234846039" w:history="1">
             <w:r>
               <w:rPr>
                 <w:rStyle w:val="Hyperlink"/>
@@ -3190,7 +3169,7 @@
                 <w:noProof/>
                 <w:webHidden/>
               </w:rPr>
-              <w:instrText xml:space="preserve"> PAGEREF _Toc234577067 \h </w:instrText>
+              <w:instrText xml:space="preserve"> PAGEREF _Toc234846039 \h </w:instrText>
             </w:r>
             <w:r>
               <w:rPr>
@@ -3235,7 +3214,7 @@
               <w:lang w:val="en-US"/>
             </w:rPr>
           </w:pPr>
-          <w:hyperlink w:anchor="_Toc234577068" w:history="1">
+          <w:hyperlink w:anchor="_Toc234846040" w:history="1">
             <w:r>
               <w:rPr>
                 <w:rStyle w:val="Hyperlink"/>
@@ -3278,7 +3257,7 @@
                 <w:noProof/>
                 <w:webHidden/>
               </w:rPr>
-              <w:instrText xml:space="preserve"> PAGEREF _Toc234577068 \h </w:instrText>
+              <w:instrText xml:space="preserve"> PAGEREF _Toc234846040 \h </w:instrText>
             </w:r>
             <w:r>
               <w:rPr>
@@ -3323,7 +3302,7 @@
               <w:lang w:val="en-US"/>
             </w:rPr>
           </w:pPr>
-          <w:hyperlink w:anchor="_Toc234577069" w:history="1">
+          <w:hyperlink w:anchor="_Toc234846041" w:history="1">
             <w:r>
               <w:rPr>
                 <w:rStyle w:val="Hyperlink"/>
@@ -3366,7 +3345,7 @@
                 <w:noProof/>
                 <w:webHidden/>
               </w:rPr>
-              <w:instrText xml:space="preserve"> PAGEREF _Toc234577069 \h </w:instrText>
+              <w:instrText xml:space="preserve"> PAGEREF _Toc234846041 \h </w:instrText>
             </w:r>
             <w:r>
               <w:rPr>
@@ -3411,7 +3390,7 @@
               <w:lang w:val="en-US"/>
             </w:rPr>
           </w:pPr>
-          <w:hyperlink w:anchor="_Toc234577070" w:history="1">
+          <w:hyperlink w:anchor="_Toc234846042" w:history="1">
             <w:r>
               <w:rPr>
                 <w:rStyle w:val="Hyperlink"/>
@@ -3454,7 +3433,7 @@
                 <w:noProof/>
                 <w:webHidden/>
               </w:rPr>
-              <w:instrText xml:space="preserve"> PAGEREF _Toc234577070 \h </w:instrText>
+              <w:instrText xml:space="preserve"> PAGEREF _Toc234846042 \h </w:instrText>
             </w:r>
             <w:r>
               <w:rPr>
@@ -3499,7 +3478,7 @@
               <w:lang w:val="en-US"/>
             </w:rPr>
           </w:pPr>
-          <w:hyperlink w:anchor="_Toc234577071" w:history="1">
+          <w:hyperlink w:anchor="_Toc234846043" w:history="1">
             <w:r>
               <w:rPr>
                 <w:rStyle w:val="Hyperlink"/>
@@ -3542,7 +3521,7 @@
                 <w:noProof/>
                 <w:webHidden/>
               </w:rPr>
-              <w:instrText xml:space="preserve"> PAGEREF _Toc234577071 \h </w:instrText>
+              <w:instrText xml:space="preserve"> PAGEREF _Toc234846043 \h </w:instrText>
             </w:r>
             <w:r>
               <w:rPr>
@@ -3586,7 +3565,7 @@
               <w:lang w:val="en-US"/>
             </w:rPr>
           </w:pPr>
-          <w:hyperlink w:anchor="_Toc234577072" w:history="1">
+          <w:hyperlink w:anchor="_Toc234846044" w:history="1">
             <w:r>
               <w:rPr>
                 <w:rStyle w:val="Hyperlink"/>
@@ -3613,7 +3592,7 @@
                 <w:noProof/>
                 <w:webHidden/>
               </w:rPr>
-              <w:instrText xml:space="preserve"> PAGEREF _Toc234577072 \h </w:instrText>
+              <w:instrText xml:space="preserve"> PAGEREF _Toc234846044 \h </w:instrText>
             </w:r>
             <w:r>
               <w:rPr>
@@ -3680,16 +3659,6 @@
     </w:p>
     <w:p>
       <w:pPr>
-        <w:spacing w:line="276" w:lineRule="auto"/>
-        <w:rPr>
-          <w:b/>
-          <w:sz w:val="52"/>
-          <w:szCs w:val="52"/>
-        </w:rPr>
-      </w:pPr>
-    </w:p>
-    <w:p>
-      <w:pPr>
         <w:pStyle w:val="TableofFigures"/>
         <w:tabs>
           <w:tab w:val="right" w:leader="dot" w:pos="9350"/>
@@ -3698,25 +3667,40 @@
           <w:rFonts w:asciiTheme="minorHAnsi" w:eastAsiaTheme="minorEastAsia" w:hAnsiTheme="minorHAnsi"/>
           <w:noProof/>
           <w:sz w:val="22"/>
-          <w:lang w:eastAsia="hr-HR"/>
-        </w:rPr>
-      </w:pPr>
-      <w:r>
+          <w:lang w:val="en-US"/>
+        </w:rPr>
+      </w:pPr>
+      <w:r>
+        <w:rPr>
+          <w:b/>
+          <w:sz w:val="52"/>
+          <w:szCs w:val="52"/>
+        </w:rPr>
         <w:fldChar w:fldCharType="begin"/>
       </w:r>
       <w:r>
+        <w:rPr>
+          <w:b/>
+          <w:sz w:val="52"/>
+          <w:szCs w:val="52"/>
+        </w:rPr>
         <w:instrText xml:space="preserve"> TOC \h \z \c "Slika" </w:instrText>
       </w:r>
       <w:r>
+        <w:rPr>
+          <w:b/>
+          <w:sz w:val="52"/>
+          <w:szCs w:val="52"/>
+        </w:rPr>
         <w:fldChar w:fldCharType="separate"/>
       </w:r>
-      <w:hyperlink w:anchor="_Toc329251894" w:history="1">
+      <w:hyperlink w:anchor="_Toc234846084" w:history="1">
         <w:r>
           <w:rPr>
             <w:rStyle w:val="Hyperlink"/>
             <w:noProof/>
           </w:rPr>
-          <w:t>Slika 1.1 Primjer rasterske slike</w:t>
+          <w:t>Slika 1. Nadzorna ploča aplikacije</w:t>
         </w:r>
         <w:r>
           <w:rPr>
@@ -3737,7 +3721,7 @@
             <w:noProof/>
             <w:webHidden/>
           </w:rPr>
-          <w:instrText xml:space="preserve"> PAGEREF _Toc329251894 \h </w:instrText>
+          <w:instrText xml:space="preserve"> PAGEREF _Toc234846084 \h </w:instrText>
         </w:r>
         <w:r>
           <w:rPr>
@@ -3757,7 +3741,7 @@
             <w:noProof/>
             <w:webHidden/>
           </w:rPr>
-          <w:t>3</w:t>
+          <w:t>26</w:t>
         </w:r>
         <w:r>
           <w:rPr>
@@ -3778,16 +3762,16 @@
           <w:rFonts w:asciiTheme="minorHAnsi" w:eastAsiaTheme="minorEastAsia" w:hAnsiTheme="minorHAnsi"/>
           <w:noProof/>
           <w:sz w:val="22"/>
-          <w:lang w:eastAsia="hr-HR"/>
-        </w:rPr>
-      </w:pPr>
-      <w:hyperlink w:anchor="_Toc329251895" w:history="1">
+          <w:lang w:val="en-US"/>
+        </w:rPr>
+      </w:pPr>
+      <w:hyperlink w:anchor="_Toc234846085" w:history="1">
         <w:r>
           <w:rPr>
             <w:rStyle w:val="Hyperlink"/>
             <w:noProof/>
           </w:rPr>
-          <w:t>Slika 1.2 Primjer vektorske slike</w:t>
+          <w:t>Slika 2. Korisnički interfejs za treniranje modela</w:t>
         </w:r>
         <w:r>
           <w:rPr>
@@ -3808,7 +3792,7 @@
             <w:noProof/>
             <w:webHidden/>
           </w:rPr>
-          <w:instrText xml:space="preserve"> PAGEREF _Toc329251895 \h </w:instrText>
+          <w:instrText xml:space="preserve"> PAGEREF _Toc234846085 \h </w:instrText>
         </w:r>
         <w:r>
           <w:rPr>
@@ -3828,7 +3812,7 @@
             <w:noProof/>
             <w:webHidden/>
           </w:rPr>
-          <w:t>3</w:t>
+          <w:t>26</w:t>
         </w:r>
         <w:r>
           <w:rPr>
@@ -3849,16 +3833,16 @@
           <w:rFonts w:asciiTheme="minorHAnsi" w:eastAsiaTheme="minorEastAsia" w:hAnsiTheme="minorHAnsi"/>
           <w:noProof/>
           <w:sz w:val="22"/>
-          <w:lang w:eastAsia="hr-HR"/>
-        </w:rPr>
-      </w:pPr>
-      <w:hyperlink w:anchor="_Toc329251896" w:history="1">
+          <w:lang w:val="en-US"/>
+        </w:rPr>
+      </w:pPr>
+      <w:hyperlink w:anchor="_Toc234846086" w:history="1">
         <w:r>
           <w:rPr>
             <w:rStyle w:val="Hyperlink"/>
             <w:noProof/>
           </w:rPr>
-          <w:t>Slika 1.3 Primjer grafa (vektorska slika)</w:t>
+          <w:t>Slika 3. Korisnički interfejs za evaluaciju modela</w:t>
         </w:r>
         <w:r>
           <w:rPr>
@@ -3879,7 +3863,7 @@
             <w:noProof/>
             <w:webHidden/>
           </w:rPr>
-          <w:instrText xml:space="preserve"> PAGEREF _Toc329251896 \h </w:instrText>
+          <w:instrText xml:space="preserve"> PAGEREF _Toc234846086 \h </w:instrText>
         </w:r>
         <w:r>
           <w:rPr>
@@ -3899,7 +3883,7 @@
             <w:noProof/>
             <w:webHidden/>
           </w:rPr>
-          <w:t>3</w:t>
+          <w:t>27</w:t>
         </w:r>
         <w:r>
           <w:rPr>
@@ -3920,16 +3904,16 @@
           <w:rFonts w:asciiTheme="minorHAnsi" w:eastAsiaTheme="minorEastAsia" w:hAnsiTheme="minorHAnsi"/>
           <w:noProof/>
           <w:sz w:val="22"/>
-          <w:lang w:eastAsia="hr-HR"/>
-        </w:rPr>
-      </w:pPr>
-      <w:hyperlink w:anchor="_Toc329251897" w:history="1">
+          <w:lang w:val="en-US"/>
+        </w:rPr>
+      </w:pPr>
+      <w:hyperlink w:anchor="_Toc234846087" w:history="1">
         <w:r>
           <w:rPr>
             <w:rStyle w:val="Hyperlink"/>
             <w:noProof/>
           </w:rPr>
-          <w:t>Slika 1.4 Primjer slika pored slike</w:t>
+          <w:t>Slika 4. Korisnički interfejs za pregled modela</w:t>
         </w:r>
         <w:r>
           <w:rPr>
@@ -3950,7 +3934,7 @@
             <w:noProof/>
             <w:webHidden/>
           </w:rPr>
-          <w:instrText xml:space="preserve"> PAGEREF _Toc329251897 \h </w:instrText>
+          <w:instrText xml:space="preserve"> PAGEREF _Toc234846087 \h </w:instrText>
         </w:r>
         <w:r>
           <w:rPr>
@@ -3970,7 +3954,7 @@
             <w:noProof/>
             <w:webHidden/>
           </w:rPr>
-          <w:t>4</w:t>
+          <w:t>27</w:t>
         </w:r>
         <w:r>
           <w:rPr>
@@ -3991,16 +3975,16 @@
           <w:rFonts w:asciiTheme="minorHAnsi" w:eastAsiaTheme="minorEastAsia" w:hAnsiTheme="minorHAnsi"/>
           <w:noProof/>
           <w:sz w:val="22"/>
-          <w:lang w:eastAsia="hr-HR"/>
-        </w:rPr>
-      </w:pPr>
-      <w:hyperlink w:anchor="_Toc329251898" w:history="1">
+          <w:lang w:val="en-US"/>
+        </w:rPr>
+      </w:pPr>
+      <w:hyperlink w:anchor="_Toc234846088" w:history="1">
         <w:r>
           <w:rPr>
             <w:rStyle w:val="Hyperlink"/>
             <w:noProof/>
           </w:rPr>
-          <w:t>Dijagram 1.5 Primjer</w:t>
+          <w:t>Slika 5. Korisnički interfejs za poređenje modela</w:t>
         </w:r>
         <w:r>
           <w:rPr>
@@ -4021,7 +4005,7 @@
             <w:noProof/>
             <w:webHidden/>
           </w:rPr>
-          <w:instrText xml:space="preserve"> PAGEREF _Toc329251898 \h </w:instrText>
+          <w:instrText xml:space="preserve"> PAGEREF _Toc234846088 \h </w:instrText>
         </w:r>
         <w:r>
           <w:rPr>
@@ -4041,7 +4025,7 @@
             <w:noProof/>
             <w:webHidden/>
           </w:rPr>
-          <w:t>4</w:t>
+          <w:t>28</w:t>
         </w:r>
         <w:r>
           <w:rPr>
@@ -4054,11 +4038,476 @@
     </w:p>
     <w:p>
       <w:pPr>
+        <w:pStyle w:val="TableofFigures"/>
+        <w:tabs>
+          <w:tab w:val="right" w:leader="dot" w:pos="9350"/>
+        </w:tabs>
+        <w:rPr>
+          <w:rFonts w:asciiTheme="minorHAnsi" w:eastAsiaTheme="minorEastAsia" w:hAnsiTheme="minorHAnsi"/>
+          <w:noProof/>
+          <w:sz w:val="22"/>
+          <w:lang w:val="en-US"/>
+        </w:rPr>
+      </w:pPr>
+      <w:hyperlink w:anchor="_Toc234846089" w:history="1">
+        <w:r>
+          <w:rPr>
+            <w:rStyle w:val="Hyperlink"/>
+            <w:noProof/>
+          </w:rPr>
+          <w:t>Slika 6. Pore</w:t>
+        </w:r>
+        <w:r>
+          <w:rPr>
+            <w:rStyle w:val="Hyperlink"/>
+            <w:noProof/>
+            <w:lang w:val="bs-Latn-BA"/>
+          </w:rPr>
+          <w:t>đenje</w:t>
+        </w:r>
+        <w:r>
+          <w:rPr>
+            <w:rStyle w:val="Hyperlink"/>
+            <w:noProof/>
+          </w:rPr>
+          <w:t xml:space="preserve"> makro odziva modela</w:t>
+        </w:r>
+        <w:r>
+          <w:rPr>
+            <w:noProof/>
+            <w:webHidden/>
+          </w:rPr>
+          <w:tab/>
+        </w:r>
+        <w:r>
+          <w:rPr>
+            <w:noProof/>
+            <w:webHidden/>
+          </w:rPr>
+          <w:fldChar w:fldCharType="begin"/>
+        </w:r>
+        <w:r>
+          <w:rPr>
+            <w:noProof/>
+            <w:webHidden/>
+          </w:rPr>
+          <w:instrText xml:space="preserve"> PAGEREF _Toc234846089 \h </w:instrText>
+        </w:r>
+        <w:r>
+          <w:rPr>
+            <w:noProof/>
+            <w:webHidden/>
+          </w:rPr>
+        </w:r>
+        <w:r>
+          <w:rPr>
+            <w:noProof/>
+            <w:webHidden/>
+          </w:rPr>
+          <w:fldChar w:fldCharType="separate"/>
+        </w:r>
+        <w:r>
+          <w:rPr>
+            <w:noProof/>
+            <w:webHidden/>
+          </w:rPr>
+          <w:t>32</w:t>
+        </w:r>
+        <w:r>
+          <w:rPr>
+            <w:noProof/>
+            <w:webHidden/>
+          </w:rPr>
+          <w:fldChar w:fldCharType="end"/>
+        </w:r>
+      </w:hyperlink>
+    </w:p>
+    <w:p>
+      <w:pPr>
+        <w:pStyle w:val="TableofFigures"/>
+        <w:tabs>
+          <w:tab w:val="right" w:leader="dot" w:pos="9350"/>
+        </w:tabs>
+        <w:rPr>
+          <w:rFonts w:asciiTheme="minorHAnsi" w:eastAsiaTheme="minorEastAsia" w:hAnsiTheme="minorHAnsi"/>
+          <w:noProof/>
+          <w:sz w:val="22"/>
+          <w:lang w:val="en-US"/>
+        </w:rPr>
+      </w:pPr>
+      <w:hyperlink w:anchor="_Toc234846090" w:history="1">
+        <w:r>
+          <w:rPr>
+            <w:rStyle w:val="Hyperlink"/>
+            <w:noProof/>
+          </w:rPr>
+          <w:t>Slika 7. Poređenje makro F1 mjera modela</w:t>
+        </w:r>
+        <w:r>
+          <w:rPr>
+            <w:noProof/>
+            <w:webHidden/>
+          </w:rPr>
+          <w:tab/>
+        </w:r>
+        <w:r>
+          <w:rPr>
+            <w:noProof/>
+            <w:webHidden/>
+          </w:rPr>
+          <w:fldChar w:fldCharType="begin"/>
+        </w:r>
+        <w:r>
+          <w:rPr>
+            <w:noProof/>
+            <w:webHidden/>
+          </w:rPr>
+          <w:instrText xml:space="preserve"> PAGEREF _Toc234846090 \h </w:instrText>
+        </w:r>
+        <w:r>
+          <w:rPr>
+            <w:noProof/>
+            <w:webHidden/>
+          </w:rPr>
+        </w:r>
+        <w:r>
+          <w:rPr>
+            <w:noProof/>
+            <w:webHidden/>
+          </w:rPr>
+          <w:fldChar w:fldCharType="separate"/>
+        </w:r>
+        <w:r>
+          <w:rPr>
+            <w:noProof/>
+            <w:webHidden/>
+          </w:rPr>
+          <w:t>33</w:t>
+        </w:r>
+        <w:r>
+          <w:rPr>
+            <w:noProof/>
+            <w:webHidden/>
+          </w:rPr>
+          <w:fldChar w:fldCharType="end"/>
+        </w:r>
+      </w:hyperlink>
+    </w:p>
+    <w:p>
+      <w:pPr>
+        <w:pStyle w:val="TableofFigures"/>
+        <w:tabs>
+          <w:tab w:val="right" w:leader="dot" w:pos="9350"/>
+        </w:tabs>
+        <w:rPr>
+          <w:rFonts w:asciiTheme="minorHAnsi" w:eastAsiaTheme="minorEastAsia" w:hAnsiTheme="minorHAnsi"/>
+          <w:noProof/>
+          <w:sz w:val="22"/>
+          <w:lang w:val="en-US"/>
+        </w:rPr>
+      </w:pPr>
+      <w:hyperlink w:anchor="_Toc234846091" w:history="1">
+        <w:r>
+          <w:rPr>
+            <w:rStyle w:val="Hyperlink"/>
+            <w:noProof/>
+          </w:rPr>
+          <w:t>Slika 8. Poređenje odziva malignih klasa modela</w:t>
+        </w:r>
+        <w:r>
+          <w:rPr>
+            <w:noProof/>
+            <w:webHidden/>
+          </w:rPr>
+          <w:tab/>
+        </w:r>
+        <w:r>
+          <w:rPr>
+            <w:noProof/>
+            <w:webHidden/>
+          </w:rPr>
+          <w:fldChar w:fldCharType="begin"/>
+        </w:r>
+        <w:r>
+          <w:rPr>
+            <w:noProof/>
+            <w:webHidden/>
+          </w:rPr>
+          <w:instrText xml:space="preserve"> PAGEREF _Toc234846091 \h </w:instrText>
+        </w:r>
+        <w:r>
+          <w:rPr>
+            <w:noProof/>
+            <w:webHidden/>
+          </w:rPr>
+        </w:r>
+        <w:r>
+          <w:rPr>
+            <w:noProof/>
+            <w:webHidden/>
+          </w:rPr>
+          <w:fldChar w:fldCharType="separate"/>
+        </w:r>
+        <w:r>
+          <w:rPr>
+            <w:noProof/>
+            <w:webHidden/>
+          </w:rPr>
+          <w:t>34</w:t>
+        </w:r>
+        <w:r>
+          <w:rPr>
+            <w:noProof/>
+            <w:webHidden/>
+          </w:rPr>
+          <w:fldChar w:fldCharType="end"/>
+        </w:r>
+      </w:hyperlink>
+    </w:p>
+    <w:p>
+      <w:pPr>
+        <w:pStyle w:val="TableofFigures"/>
+        <w:tabs>
+          <w:tab w:val="right" w:leader="dot" w:pos="9350"/>
+        </w:tabs>
+        <w:rPr>
+          <w:rFonts w:asciiTheme="minorHAnsi" w:eastAsiaTheme="minorEastAsia" w:hAnsiTheme="minorHAnsi"/>
+          <w:noProof/>
+          <w:sz w:val="22"/>
+          <w:lang w:val="en-US"/>
+        </w:rPr>
+      </w:pPr>
+      <w:hyperlink w:anchor="_Toc234846092" w:history="1">
+        <w:r>
+          <w:rPr>
+            <w:rStyle w:val="Hyperlink"/>
+            <w:noProof/>
+          </w:rPr>
+          <w:t>Slika 9. Poređenje tačnosti modela</w:t>
+        </w:r>
+        <w:r>
+          <w:rPr>
+            <w:noProof/>
+            <w:webHidden/>
+          </w:rPr>
+          <w:tab/>
+        </w:r>
+        <w:r>
+          <w:rPr>
+            <w:noProof/>
+            <w:webHidden/>
+          </w:rPr>
+          <w:fldChar w:fldCharType="begin"/>
+        </w:r>
+        <w:r>
+          <w:rPr>
+            <w:noProof/>
+            <w:webHidden/>
+          </w:rPr>
+          <w:instrText xml:space="preserve"> PAGEREF _Toc234846092 \h </w:instrText>
+        </w:r>
+        <w:r>
+          <w:rPr>
+            <w:noProof/>
+            <w:webHidden/>
+          </w:rPr>
+        </w:r>
+        <w:r>
+          <w:rPr>
+            <w:noProof/>
+            <w:webHidden/>
+          </w:rPr>
+          <w:fldChar w:fldCharType="separate"/>
+        </w:r>
+        <w:r>
+          <w:rPr>
+            <w:noProof/>
+            <w:webHidden/>
+          </w:rPr>
+          <w:t>35</w:t>
+        </w:r>
+        <w:r>
+          <w:rPr>
+            <w:noProof/>
+            <w:webHidden/>
+          </w:rPr>
+          <w:fldChar w:fldCharType="end"/>
+        </w:r>
+      </w:hyperlink>
+    </w:p>
+    <w:p>
+      <w:pPr>
+        <w:pStyle w:val="TableofFigures"/>
+        <w:tabs>
+          <w:tab w:val="right" w:leader="dot" w:pos="9350"/>
+        </w:tabs>
+        <w:rPr>
+          <w:rFonts w:asciiTheme="minorHAnsi" w:eastAsiaTheme="minorEastAsia" w:hAnsiTheme="minorHAnsi"/>
+          <w:noProof/>
+          <w:sz w:val="22"/>
+          <w:lang w:val="en-US"/>
+        </w:rPr>
+      </w:pPr>
+      <w:hyperlink w:anchor="_Toc234846093" w:history="1">
+        <w:r>
+          <w:rPr>
+            <w:rStyle w:val="Hyperlink"/>
+            <w:noProof/>
+          </w:rPr>
+          <w:t>Slika 10. Funkcija troška na validacijskom setu</w:t>
+        </w:r>
+        <w:r>
+          <w:rPr>
+            <w:noProof/>
+            <w:webHidden/>
+          </w:rPr>
+          <w:tab/>
+        </w:r>
+        <w:r>
+          <w:rPr>
+            <w:noProof/>
+            <w:webHidden/>
+          </w:rPr>
+          <w:fldChar w:fldCharType="begin"/>
+        </w:r>
+        <w:r>
+          <w:rPr>
+            <w:noProof/>
+            <w:webHidden/>
+          </w:rPr>
+          <w:instrText xml:space="preserve"> PAGEREF _Toc234846093 \h </w:instrText>
+        </w:r>
+        <w:r>
+          <w:rPr>
+            <w:noProof/>
+            <w:webHidden/>
+          </w:rPr>
+        </w:r>
+        <w:r>
+          <w:rPr>
+            <w:noProof/>
+            <w:webHidden/>
+          </w:rPr>
+          <w:fldChar w:fldCharType="separate"/>
+        </w:r>
+        <w:r>
+          <w:rPr>
+            <w:noProof/>
+            <w:webHidden/>
+          </w:rPr>
+          <w:t>36</w:t>
+        </w:r>
+        <w:r>
+          <w:rPr>
+            <w:noProof/>
+            <w:webHidden/>
+          </w:rPr>
+          <w:fldChar w:fldCharType="end"/>
+        </w:r>
+      </w:hyperlink>
+    </w:p>
+    <w:p>
+      <w:pPr>
+        <w:pStyle w:val="TableofFigures"/>
+        <w:tabs>
+          <w:tab w:val="right" w:leader="dot" w:pos="9350"/>
+        </w:tabs>
+        <w:rPr>
+          <w:rFonts w:asciiTheme="minorHAnsi" w:eastAsiaTheme="minorEastAsia" w:hAnsiTheme="minorHAnsi"/>
+          <w:noProof/>
+          <w:sz w:val="22"/>
+          <w:lang w:val="en-US"/>
+        </w:rPr>
+      </w:pPr>
+      <w:hyperlink w:anchor="_Toc234846094" w:history="1">
+        <w:r>
+          <w:rPr>
+            <w:rStyle w:val="Hyperlink"/>
+            <w:noProof/>
+          </w:rPr>
+          <w:t>Slika 11. Funk</w:t>
+        </w:r>
+        <w:r>
+          <w:rPr>
+            <w:rStyle w:val="Hyperlink"/>
+            <w:noProof/>
+          </w:rPr>
+          <w:t>c</w:t>
+        </w:r>
+        <w:r>
+          <w:rPr>
+            <w:rStyle w:val="Hyperlink"/>
+            <w:noProof/>
+          </w:rPr>
+          <w:t>ija troška na trening setu</w:t>
+        </w:r>
+        <w:r>
+          <w:rPr>
+            <w:noProof/>
+            <w:webHidden/>
+          </w:rPr>
+          <w:tab/>
+        </w:r>
+        <w:r>
+          <w:rPr>
+            <w:noProof/>
+            <w:webHidden/>
+          </w:rPr>
+          <w:fldChar w:fldCharType="begin"/>
+        </w:r>
+        <w:r>
+          <w:rPr>
+            <w:noProof/>
+            <w:webHidden/>
+          </w:rPr>
+          <w:instrText xml:space="preserve"> PAGEREF _Toc234846094 \h </w:instrText>
+        </w:r>
+        <w:r>
+          <w:rPr>
+            <w:noProof/>
+            <w:webHidden/>
+          </w:rPr>
+        </w:r>
+        <w:r>
+          <w:rPr>
+            <w:noProof/>
+            <w:webHidden/>
+          </w:rPr>
+          <w:fldChar w:fldCharType="separate"/>
+        </w:r>
+        <w:r>
+          <w:rPr>
+            <w:noProof/>
+            <w:webHidden/>
+          </w:rPr>
+          <w:t>36</w:t>
+        </w:r>
+        <w:r>
+          <w:rPr>
+            <w:noProof/>
+            <w:webHidden/>
+          </w:rPr>
+          <w:fldChar w:fldCharType="end"/>
+        </w:r>
+      </w:hyperlink>
+    </w:p>
+    <w:p>
+      <w:pPr>
         <w:spacing w:line="276" w:lineRule="auto"/>
       </w:pPr>
       <w:r>
+        <w:rPr>
+          <w:b/>
+          <w:sz w:val="52"/>
+          <w:szCs w:val="52"/>
+        </w:rPr>
         <w:fldChar w:fldCharType="end"/>
       </w:r>
+    </w:p>
+    <w:p>
+      <w:pPr>
+        <w:spacing w:line="276" w:lineRule="auto"/>
+      </w:pPr>
     </w:p>
     <w:p>
       <w:pPr>
@@ -4318,7 +4767,7 @@
       <w:pPr>
         <w:pStyle w:val="Heading1"/>
       </w:pPr>
-      <w:bookmarkStart w:id="1" w:name="_Toc234577044"/>
+      <w:bookmarkStart w:id="1" w:name="_Toc234846016"/>
       <w:proofErr w:type="spellStart"/>
       <w:r>
         <w:lastRenderedPageBreak/>
@@ -4435,7 +4884,7 @@
       <w:pPr>
         <w:pStyle w:val="Heading2"/>
       </w:pPr>
-      <w:bookmarkStart w:id="2" w:name="_Toc234577045"/>
+      <w:bookmarkStart w:id="2" w:name="_Toc234846017"/>
       <w:r>
         <w:lastRenderedPageBreak/>
         <w:t>Cilj Rada</w:t>
@@ -5422,7 +5871,7 @@
       <w:pPr>
         <w:pStyle w:val="Heading1"/>
       </w:pPr>
-      <w:bookmarkStart w:id="3" w:name="_Toc234577046"/>
+      <w:bookmarkStart w:id="3" w:name="_Toc234846018"/>
       <w:proofErr w:type="spellStart"/>
       <w:r>
         <w:lastRenderedPageBreak/>
@@ -5448,7 +5897,7 @@
       <w:pPr>
         <w:pStyle w:val="Heading2"/>
       </w:pPr>
-      <w:bookmarkStart w:id="4" w:name="_Toc234577047"/>
+      <w:bookmarkStart w:id="4" w:name="_Toc234846019"/>
       <w:r>
         <w:t>Šta su neuronske mreže?</w:t>
       </w:r>
@@ -5648,7 +6097,7 @@
       <w:pPr>
         <w:pStyle w:val="Heading2"/>
       </w:pPr>
-      <w:bookmarkStart w:id="5" w:name="_Toc234577048"/>
+      <w:bookmarkStart w:id="5" w:name="_Toc234846020"/>
       <w:r>
         <w:lastRenderedPageBreak/>
         <w:t>Kako neuronska mreža uči?</w:t>
@@ -6008,7 +6457,7 @@
       <w:pPr>
         <w:pStyle w:val="Heading2"/>
       </w:pPr>
-      <w:bookmarkStart w:id="6" w:name="_Toc234577049"/>
+      <w:bookmarkStart w:id="6" w:name="_Toc234846021"/>
       <w:r>
         <w:lastRenderedPageBreak/>
         <w:t>CNN – Konvolucione neuronske mreže</w:t>
@@ -6293,7 +6742,7 @@
       <w:pPr>
         <w:pStyle w:val="Heading2"/>
       </w:pPr>
-      <w:bookmarkStart w:id="7" w:name="_Toc234577050"/>
+      <w:bookmarkStart w:id="7" w:name="_Toc234846022"/>
       <w:r>
         <w:lastRenderedPageBreak/>
         <w:t>PyTorch vs. TorchSharp</w:t>
@@ -6370,7 +6819,7 @@
       <w:pPr>
         <w:pStyle w:val="Heading2"/>
       </w:pPr>
-      <w:bookmarkStart w:id="8" w:name="_Toc234577051"/>
+      <w:bookmarkStart w:id="8" w:name="_Toc234846023"/>
       <w:r>
         <w:lastRenderedPageBreak/>
         <w:t>Metrike modela</w:t>
@@ -6392,7 +6841,7 @@
       <w:pPr>
         <w:pStyle w:val="Heading3"/>
       </w:pPr>
-      <w:bookmarkStart w:id="9" w:name="_Toc234577052"/>
+      <w:bookmarkStart w:id="9" w:name="_Toc234846024"/>
       <w:r>
         <w:t>Brzina treniranja</w:t>
       </w:r>
@@ -6428,7 +6877,7 @@
       <w:pPr>
         <w:pStyle w:val="Heading3"/>
       </w:pPr>
-      <w:bookmarkStart w:id="10" w:name="_Toc234577053"/>
+      <w:bookmarkStart w:id="10" w:name="_Toc234846025"/>
       <w:r>
         <w:t>Klasifikacijske metrike</w:t>
       </w:r>
@@ -7134,7 +7583,7 @@
       <w:pPr>
         <w:pStyle w:val="Heading3"/>
       </w:pPr>
-      <w:bookmarkStart w:id="11" w:name="_Toc234577054"/>
+      <w:bookmarkStart w:id="11" w:name="_Toc234846026"/>
       <w:r>
         <w:t>Metrike za više</w:t>
       </w:r>
@@ -8417,7 +8866,7 @@
       <w:pPr>
         <w:pStyle w:val="Heading1"/>
       </w:pPr>
-      <w:bookmarkStart w:id="12" w:name="_Toc234577055"/>
+      <w:bookmarkStart w:id="12" w:name="_Toc234846027"/>
       <w:proofErr w:type="spellStart"/>
       <w:r>
         <w:lastRenderedPageBreak/>
@@ -8454,7 +8903,7 @@
       <w:pPr>
         <w:pStyle w:val="Heading2"/>
       </w:pPr>
-      <w:bookmarkStart w:id="13" w:name="_Toc234577056"/>
+      <w:bookmarkStart w:id="13" w:name="_Toc234846028"/>
       <w:r>
         <w:t>Korišteni skup podataka (</w:t>
       </w:r>
@@ -8849,7 +9298,7 @@
       <w:pPr>
         <w:pStyle w:val="Heading2"/>
       </w:pPr>
-      <w:bookmarkStart w:id="14" w:name="_Toc234577057"/>
+      <w:bookmarkStart w:id="14" w:name="_Toc234846029"/>
       <w:r>
         <w:lastRenderedPageBreak/>
         <w:t>Preprocesiranje slika (</w:t>
@@ -9025,7 +9474,7 @@
       <w:pPr>
         <w:pStyle w:val="Heading2"/>
       </w:pPr>
-      <w:bookmarkStart w:id="15" w:name="_Toc234577058"/>
+      <w:bookmarkStart w:id="15" w:name="_Toc234846030"/>
       <w:r>
         <w:lastRenderedPageBreak/>
         <w:t>Razdvajanje podataka na skup za treniranje i validaciju</w:t>
@@ -9105,7 +9554,7 @@
       <w:pPr>
         <w:pStyle w:val="Heading2"/>
       </w:pPr>
-      <w:bookmarkStart w:id="16" w:name="_Toc234577059"/>
+      <w:bookmarkStart w:id="16" w:name="_Toc234846031"/>
       <w:r>
         <w:lastRenderedPageBreak/>
         <w:t xml:space="preserve">Dizajn i arhitektura CNN modela, </w:t>
@@ -13713,7 +14162,7 @@
       <w:pPr>
         <w:pStyle w:val="Heading2"/>
       </w:pPr>
-      <w:bookmarkStart w:id="17" w:name="_Toc234577060"/>
+      <w:bookmarkStart w:id="17" w:name="_Toc234846032"/>
       <w:r>
         <w:lastRenderedPageBreak/>
         <w:t>Broj epoha i veličina serije</w:t>
@@ -13889,7 +14338,7 @@
       <w:pPr>
         <w:pStyle w:val="Heading2"/>
       </w:pPr>
-      <w:bookmarkStart w:id="18" w:name="_Toc234577061"/>
+      <w:bookmarkStart w:id="18" w:name="_Toc234846033"/>
       <w:r>
         <w:lastRenderedPageBreak/>
         <w:t>Orkestracija i .NET Aspire</w:t>
@@ -13984,7 +14433,7 @@
       <w:pPr>
         <w:pStyle w:val="Heading2"/>
       </w:pPr>
-      <w:bookmarkStart w:id="19" w:name="_Toc234577062"/>
+      <w:bookmarkStart w:id="19" w:name="_Toc234846034"/>
       <w:r>
         <w:lastRenderedPageBreak/>
         <w:t>Korisnički</w:t>
@@ -14084,6 +14533,7 @@
         <w:pStyle w:val="Caption"/>
         <w:jc w:val="center"/>
       </w:pPr>
+      <w:bookmarkStart w:id="20" w:name="_Toc234846084"/>
       <w:r>
         <w:t xml:space="preserve">Slika </w:t>
       </w:r>
@@ -14108,6 +14558,7 @@
       <w:r>
         <w:t>. Nadzorna ploča aplikacije</w:t>
       </w:r>
+      <w:bookmarkEnd w:id="20"/>
     </w:p>
     <w:p>
       <w:r>
@@ -14176,6 +14627,7 @@
         <w:pStyle w:val="Caption"/>
         <w:jc w:val="center"/>
       </w:pPr>
+      <w:bookmarkStart w:id="21" w:name="_Toc234846085"/>
       <w:r>
         <w:t xml:space="preserve">Slika </w:t>
       </w:r>
@@ -14200,6 +14652,7 @@
       <w:r>
         <w:t>. Korisnički interfejs za treniranje modela</w:t>
       </w:r>
+      <w:bookmarkEnd w:id="21"/>
     </w:p>
     <w:p>
       <w:r>
@@ -14270,6 +14723,7 @@
         <w:pStyle w:val="Caption"/>
         <w:jc w:val="center"/>
       </w:pPr>
+      <w:bookmarkStart w:id="22" w:name="_Toc234846086"/>
       <w:r>
         <w:t xml:space="preserve">Slika </w:t>
       </w:r>
@@ -14294,6 +14748,7 @@
       <w:r>
         <w:t>. Korisnički interfejs za evaluaciju modela</w:t>
       </w:r>
+      <w:bookmarkEnd w:id="22"/>
     </w:p>
     <w:p>
       <w:r>
@@ -14363,6 +14818,7 @@
         <w:pStyle w:val="Caption"/>
         <w:jc w:val="center"/>
       </w:pPr>
+      <w:bookmarkStart w:id="23" w:name="_Toc234846087"/>
       <w:r>
         <w:t xml:space="preserve">Slika </w:t>
       </w:r>
@@ -14387,6 +14843,7 @@
       <w:r>
         <w:t>. Korisnički interfejs za pregled modela</w:t>
       </w:r>
+      <w:bookmarkEnd w:id="23"/>
     </w:p>
     <w:p/>
     <w:p>
@@ -14466,6 +14923,7 @@
           <w:lang w:val="de-DE"/>
         </w:rPr>
       </w:pPr>
+      <w:bookmarkStart w:id="24" w:name="_Toc234846088"/>
       <w:r>
         <w:t xml:space="preserve">Slika </w:t>
       </w:r>
@@ -14490,6 +14948,7 @@
       <w:r>
         <w:t>. Korisnički interfejs za poređenje modela</w:t>
       </w:r>
+      <w:bookmarkEnd w:id="24"/>
     </w:p>
     <w:p>
       <w:pPr>
@@ -14514,12 +14973,12 @@
       <w:pPr>
         <w:pStyle w:val="Heading2"/>
       </w:pPr>
-      <w:bookmarkStart w:id="20" w:name="_Toc234577063"/>
+      <w:bookmarkStart w:id="25" w:name="_Toc234846035"/>
       <w:r>
         <w:lastRenderedPageBreak/>
         <w:t>Metodologija testiranja i kontrola varijabli</w:t>
       </w:r>
-      <w:bookmarkEnd w:id="20"/>
+      <w:bookmarkEnd w:id="25"/>
     </w:p>
     <w:p>
       <w:pPr>
@@ -15901,7 +16360,7 @@
       <w:pPr>
         <w:pStyle w:val="Heading1"/>
       </w:pPr>
-      <w:bookmarkStart w:id="21" w:name="_Toc234577064"/>
+      <w:bookmarkStart w:id="26" w:name="_Toc234846036"/>
       <w:proofErr w:type="spellStart"/>
       <w:r>
         <w:lastRenderedPageBreak/>
@@ -15923,7 +16382,7 @@
       <w:r>
         <w:t>analiza</w:t>
       </w:r>
-      <w:bookmarkEnd w:id="21"/>
+      <w:bookmarkEnd w:id="26"/>
       <w:proofErr w:type="spellEnd"/>
     </w:p>
     <w:p>
@@ -15970,14 +16429,14 @@
           <w:lang w:val="bs-Latn-BA"/>
         </w:rPr>
       </w:pPr>
-      <w:bookmarkStart w:id="22" w:name="_Toc234577065"/>
+      <w:bookmarkStart w:id="27" w:name="_Toc234846037"/>
       <w:r>
         <w:rPr>
           <w:lang w:val="bs-Latn-BA"/>
         </w:rPr>
         <w:t>Vrijeme treniranja</w:t>
       </w:r>
-      <w:bookmarkEnd w:id="22"/>
+      <w:bookmarkEnd w:id="27"/>
     </w:p>
     <w:p>
       <w:pPr>
@@ -16298,14 +16757,14 @@
           <w:lang w:val="bs-Latn-BA"/>
         </w:rPr>
       </w:pPr>
-      <w:bookmarkStart w:id="23" w:name="_Toc234577066"/>
+      <w:bookmarkStart w:id="28" w:name="_Toc234846038"/>
       <w:r>
         <w:rPr>
           <w:lang w:val="bs-Latn-BA"/>
         </w:rPr>
         <w:t>Vrijeme analize slike</w:t>
       </w:r>
-      <w:bookmarkEnd w:id="23"/>
+      <w:bookmarkEnd w:id="28"/>
     </w:p>
     <w:p>
       <w:pPr>
@@ -16354,12 +16813,12 @@
       <w:pPr>
         <w:pStyle w:val="Heading2"/>
       </w:pPr>
-      <w:bookmarkStart w:id="24" w:name="_Toc234577067"/>
+      <w:bookmarkStart w:id="29" w:name="_Toc234846039"/>
       <w:r>
         <w:lastRenderedPageBreak/>
         <w:t>Makro odziv</w:t>
       </w:r>
-      <w:bookmarkEnd w:id="24"/>
+      <w:bookmarkEnd w:id="29"/>
       <w:r>
         <w:t xml:space="preserve"> </w:t>
       </w:r>
@@ -16606,7 +17065,8 @@
         <w:pStyle w:val="Caption"/>
         <w:jc w:val="center"/>
       </w:pPr>
-      <w:bookmarkStart w:id="25" w:name="_Hlk234154236"/>
+      <w:bookmarkStart w:id="30" w:name="_Hlk234154236"/>
+      <w:bookmarkStart w:id="31" w:name="_Toc234846089"/>
       <w:r>
         <w:t xml:space="preserve">Slika </w:t>
       </w:r>
@@ -16649,8 +17109,9 @@
       <w:r>
         <w:t xml:space="preserve"> makro odziva modela</w:t>
       </w:r>
-    </w:p>
-    <w:bookmarkEnd w:id="25"/>
+      <w:bookmarkEnd w:id="31"/>
+    </w:p>
+    <w:bookmarkEnd w:id="30"/>
     <w:p/>
     <w:p/>
     <w:p/>
@@ -16658,12 +17119,12 @@
       <w:pPr>
         <w:pStyle w:val="Heading2"/>
       </w:pPr>
-      <w:bookmarkStart w:id="26" w:name="_Toc234577068"/>
+      <w:bookmarkStart w:id="32" w:name="_Toc234846040"/>
       <w:r>
         <w:lastRenderedPageBreak/>
         <w:t>Makro F1 mjera</w:t>
       </w:r>
-      <w:bookmarkEnd w:id="26"/>
+      <w:bookmarkEnd w:id="32"/>
     </w:p>
     <w:p/>
     <w:p>
@@ -16960,6 +17421,7 @@
         <w:pStyle w:val="Caption"/>
         <w:jc w:val="center"/>
       </w:pPr>
+      <w:bookmarkStart w:id="33" w:name="_Toc234846090"/>
       <w:r>
         <w:t xml:space="preserve">Slika </w:t>
       </w:r>
@@ -16996,6 +17458,7 @@
       <w:r>
         <w:t xml:space="preserve"> modela</w:t>
       </w:r>
+      <w:bookmarkEnd w:id="33"/>
     </w:p>
     <w:p>
       <w:pPr>
@@ -17021,12 +17484,12 @@
       <w:pPr>
         <w:pStyle w:val="Heading2"/>
       </w:pPr>
-      <w:bookmarkStart w:id="27" w:name="_Toc234577069"/>
+      <w:bookmarkStart w:id="34" w:name="_Toc234846041"/>
       <w:r>
         <w:lastRenderedPageBreak/>
         <w:t>Odziv maligne klase</w:t>
       </w:r>
-      <w:bookmarkEnd w:id="27"/>
+      <w:bookmarkEnd w:id="34"/>
     </w:p>
     <w:p>
       <w:pPr>
@@ -17276,6 +17739,7 @@
         <w:pStyle w:val="Caption"/>
         <w:jc w:val="center"/>
       </w:pPr>
+      <w:bookmarkStart w:id="35" w:name="_Toc234846091"/>
       <w:r>
         <w:t xml:space="preserve">Slika </w:t>
       </w:r>
@@ -17312,6 +17776,7 @@
       <w:r>
         <w:t xml:space="preserve"> modela</w:t>
       </w:r>
+      <w:bookmarkEnd w:id="35"/>
     </w:p>
     <w:p>
       <w:pPr>
@@ -17337,12 +17802,12 @@
       <w:pPr>
         <w:pStyle w:val="Heading2"/>
       </w:pPr>
-      <w:bookmarkStart w:id="28" w:name="_Toc234577070"/>
+      <w:bookmarkStart w:id="36" w:name="_Toc234846042"/>
       <w:r>
         <w:lastRenderedPageBreak/>
         <w:t>Tačnost</w:t>
       </w:r>
-      <w:bookmarkEnd w:id="28"/>
+      <w:bookmarkEnd w:id="36"/>
     </w:p>
     <w:p>
       <w:pPr>
@@ -17664,6 +18129,7 @@
         <w:pStyle w:val="Caption"/>
         <w:jc w:val="center"/>
       </w:pPr>
+      <w:bookmarkStart w:id="37" w:name="_Toc234846092"/>
       <w:r>
         <w:t xml:space="preserve">Slika </w:t>
       </w:r>
@@ -17700,6 +18166,7 @@
       <w:r>
         <w:t>modela</w:t>
       </w:r>
+      <w:bookmarkEnd w:id="37"/>
     </w:p>
     <w:p>
       <w:pPr>
@@ -17788,6 +18255,7 @@
         <w:pStyle w:val="Caption"/>
         <w:jc w:val="center"/>
       </w:pPr>
+      <w:bookmarkStart w:id="38" w:name="_Toc234846093"/>
       <w:r>
         <w:t xml:space="preserve">Slika </w:t>
       </w:r>
@@ -17812,6 +18280,7 @@
       <w:r>
         <w:t>. Funkcija troška na validacijskom setu</w:t>
       </w:r>
+      <w:bookmarkEnd w:id="38"/>
     </w:p>
     <w:p>
       <w:pPr>
@@ -17882,6 +18351,7 @@
           <w:lang w:val="en-US"/>
         </w:rPr>
       </w:pPr>
+      <w:bookmarkStart w:id="39" w:name="_Toc234846094"/>
       <w:r>
         <w:t xml:space="preserve">Slika </w:t>
       </w:r>
@@ -17906,6 +18376,7 @@
       <w:r>
         <w:t>. Funkcija troška na trening setu</w:t>
       </w:r>
+      <w:bookmarkEnd w:id="39"/>
     </w:p>
     <w:p>
       <w:pPr>
@@ -17932,12 +18403,12 @@
       <w:pPr>
         <w:pStyle w:val="Heading2"/>
       </w:pPr>
-      <w:bookmarkStart w:id="29" w:name="_Toc234577071"/>
+      <w:bookmarkStart w:id="40" w:name="_Toc234846043"/>
       <w:r>
         <w:lastRenderedPageBreak/>
         <w:t>Analiza rezultata</w:t>
       </w:r>
-      <w:bookmarkEnd w:id="29"/>
+      <w:bookmarkEnd w:id="40"/>
     </w:p>
     <w:p>
       <w:pPr>
@@ -18255,12 +18726,12 @@
       <w:pPr>
         <w:pStyle w:val="Heading1"/>
       </w:pPr>
-      <w:bookmarkStart w:id="30" w:name="_Toc234577072"/>
+      <w:bookmarkStart w:id="41" w:name="_Toc234846044"/>
       <w:r>
         <w:lastRenderedPageBreak/>
         <w:t>Zaključak</w:t>
       </w:r>
-      <w:bookmarkEnd w:id="30"/>
+      <w:bookmarkEnd w:id="41"/>
     </w:p>
     <w:p>
       <w:pPr>
@@ -18353,6 +18824,7 @@
                   <w:rFonts w:asciiTheme="minorHAnsi" w:hAnsiTheme="minorHAnsi"/>
                   <w:noProof/>
                   <w:sz w:val="22"/>
+                  <w:lang w:val="en-US"/>
                 </w:rPr>
               </w:pPr>
               <w:r>
@@ -18383,6 +18855,7 @@
               </w:tblGrid>
               <w:tr>
                 <w:trPr>
+                  <w:divId w:val="1705058161"/>
                   <w:tblCellSpacing w:w="15" w:type="dxa"/>
                 </w:trPr>
                 <w:tc>
@@ -18394,8 +18867,8 @@
                     <w:pPr>
                       <w:pStyle w:val="Bibliography"/>
                       <w:rPr>
-                        <w:rFonts w:eastAsiaTheme="minorEastAsia"/>
                         <w:noProof/>
+                        <w:szCs w:val="24"/>
                       </w:rPr>
                     </w:pPr>
                     <w:r>
@@ -18415,7 +18888,6 @@
                     <w:pPr>
                       <w:pStyle w:val="Bibliography"/>
                       <w:rPr>
-                        <w:rFonts w:eastAsiaTheme="minorEastAsia"/>
                         <w:noProof/>
                       </w:rPr>
                     </w:pPr>
@@ -18423,7 +18895,67 @@
                       <w:rPr>
                         <w:noProof/>
                       </w:rPr>
-                      <w:t xml:space="preserve">H. F. a. O. Hooijen, "Power Line Communications: An Overview," </w:t>
+                      <w:t xml:space="preserve">R. Ziemer, »An overview of modulation and coding for wireless communications,« </w:t>
+                    </w:r>
+                    <w:r>
+                      <w:rPr>
+                        <w:i/>
+                        <w:iCs/>
+                        <w:noProof/>
+                      </w:rPr>
+                      <w:t xml:space="preserve">46th Vehicular Technology Conference, </w:t>
+                    </w:r>
+                    <w:r>
+                      <w:rPr>
+                        <w:noProof/>
+                      </w:rPr>
+                      <w:t xml:space="preserve">pp. 26-30, 1996. </w:t>
+                    </w:r>
+                  </w:p>
+                </w:tc>
+              </w:tr>
+              <w:tr>
+                <w:trPr>
+                  <w:divId w:val="1705058161"/>
+                  <w:tblCellSpacing w:w="15" w:type="dxa"/>
+                </w:trPr>
+                <w:tc>
+                  <w:tcPr>
+                    <w:tcW w:w="50" w:type="pct"/>
+                    <w:hideMark/>
+                  </w:tcPr>
+                  <w:p>
+                    <w:pPr>
+                      <w:pStyle w:val="Bibliography"/>
+                      <w:rPr>
+                        <w:noProof/>
+                      </w:rPr>
+                    </w:pPr>
+                    <w:r>
+                      <w:rPr>
+                        <w:noProof/>
+                      </w:rPr>
+                      <w:t xml:space="preserve">[2] </w:t>
+                    </w:r>
+                  </w:p>
+                </w:tc>
+                <w:tc>
+                  <w:tcPr>
+                    <w:tcW w:w="0" w:type="auto"/>
+                    <w:hideMark/>
+                  </w:tcPr>
+                  <w:p>
+                    <w:pPr>
+                      <w:pStyle w:val="Bibliography"/>
+                      <w:rPr>
+                        <w:noProof/>
+                      </w:rPr>
+                    </w:pPr>
+                    <w:r>
+                      <w:rPr>
+                        <w:noProof/>
+                      </w:rPr>
+                      <w:t xml:space="preserve">H. F. a. O. Hooijen, »Power Line Communications: An Overview,« </w:t>
                     </w:r>
                     <w:r>
                       <w:rPr>
@@ -18444,6 +18976,7 @@
               </w:tr>
               <w:tr>
                 <w:trPr>
+                  <w:divId w:val="1705058161"/>
                   <w:tblCellSpacing w:w="15" w:type="dxa"/>
                 </w:trPr>
                 <w:tc>
@@ -18455,68 +18988,6 @@
                     <w:pPr>
                       <w:pStyle w:val="Bibliography"/>
                       <w:rPr>
-                        <w:rFonts w:eastAsiaTheme="minorEastAsia"/>
-                        <w:noProof/>
-                      </w:rPr>
-                    </w:pPr>
-                    <w:r>
-                      <w:rPr>
-                        <w:noProof/>
-                      </w:rPr>
-                      <w:t xml:space="preserve">[2] </w:t>
-                    </w:r>
-                  </w:p>
-                </w:tc>
-                <w:tc>
-                  <w:tcPr>
-                    <w:tcW w:w="0" w:type="auto"/>
-                    <w:hideMark/>
-                  </w:tcPr>
-                  <w:p>
-                    <w:pPr>
-                      <w:pStyle w:val="Bibliography"/>
-                      <w:rPr>
-                        <w:rFonts w:eastAsiaTheme="minorEastAsia"/>
-                        <w:noProof/>
-                      </w:rPr>
-                    </w:pPr>
-                    <w:r>
-                      <w:rPr>
-                        <w:noProof/>
-                      </w:rPr>
-                      <w:t xml:space="preserve">R. Ziemer, "An overview of modulation and coding for wireless communications," </w:t>
-                    </w:r>
-                    <w:r>
-                      <w:rPr>
-                        <w:i/>
-                        <w:iCs/>
-                        <w:noProof/>
-                      </w:rPr>
-                      <w:t xml:space="preserve">46th Vehicular Technology Conference, </w:t>
-                    </w:r>
-                    <w:r>
-                      <w:rPr>
-                        <w:noProof/>
-                      </w:rPr>
-                      <w:t xml:space="preserve">pp. 26-30, 1996. </w:t>
-                    </w:r>
-                  </w:p>
-                </w:tc>
-              </w:tr>
-              <w:tr>
-                <w:trPr>
-                  <w:tblCellSpacing w:w="15" w:type="dxa"/>
-                </w:trPr>
-                <w:tc>
-                  <w:tcPr>
-                    <w:tcW w:w="50" w:type="pct"/>
-                    <w:hideMark/>
-                  </w:tcPr>
-                  <w:p>
-                    <w:pPr>
-                      <w:pStyle w:val="Bibliography"/>
-                      <w:rPr>
-                        <w:rFonts w:eastAsiaTheme="minorEastAsia"/>
                         <w:noProof/>
                       </w:rPr>
                     </w:pPr>
@@ -18537,7 +19008,6 @@
                     <w:pPr>
                       <w:pStyle w:val="Bibliography"/>
                       <w:rPr>
-                        <w:rFonts w:eastAsiaTheme="minorEastAsia"/>
                         <w:noProof/>
                       </w:rPr>
                     </w:pPr>
@@ -18545,7 +19015,7 @@
                       <w:rPr>
                         <w:noProof/>
                       </w:rPr>
-                      <w:t>"IEEE P1901 Working Group 2010," Standard for Broadband over Powerline Networks:, [Online]. Available: http://grouper.ieee.org/groups/1901/.</w:t>
+                      <w:t>»IEEE P1901 Working Group 2010,« Standard for Broadband over Powerline Networks:, [Mrežno]. Available: http://grouper.ieee.org/groups/1901/.</w:t>
                     </w:r>
                   </w:p>
                 </w:tc>
@@ -18553,6 +19023,7 @@
             </w:tbl>
             <w:p>
               <w:pPr>
+                <w:divId w:val="1705058161"/>
                 <w:rPr>
                   <w:rFonts w:eastAsia="Times New Roman"/>
                   <w:noProof/>
@@ -18575,53 +19046,6 @@
       <w:r>
         <w:br w:type="page"/>
       </w:r>
-    </w:p>
-    <w:p>
-      <w:pPr>
-        <w:rPr>
-          <w:b/>
-          <w:sz w:val="52"/>
-          <w:szCs w:val="52"/>
-        </w:rPr>
-      </w:pPr>
-      <w:r>
-        <w:rPr>
-          <w:b/>
-          <w:sz w:val="52"/>
-          <w:szCs w:val="52"/>
-        </w:rPr>
-        <w:lastRenderedPageBreak/>
-        <w:t>Dodatak</w:t>
-      </w:r>
-    </w:p>
-    <w:p>
-      <w:pPr>
-        <w:rPr>
-          <w:b/>
-          <w:sz w:val="52"/>
-          <w:szCs w:val="52"/>
-        </w:rPr>
-      </w:pPr>
-    </w:p>
-    <w:p>
-      <w:r>
-        <w:t xml:space="preserve">O ovoj sekciji možete ubaciti ostale sadržaje koji se ne bi trebali naći u glavnom tekstu. Primjer za to su: dodatne tabele, matematički proračuni, grafikoni, izvorni kod programa </w:t>
-      </w:r>
-      <w:r>
-        <w:t>i</w:t>
-      </w:r>
-      <w:r>
-        <w:t xml:space="preserve"> sl.</w:t>
-      </w:r>
-    </w:p>
-    <w:p>
-      <w:pPr>
-        <w:rPr>
-          <w:b/>
-          <w:sz w:val="52"/>
-          <w:szCs w:val="52"/>
-        </w:rPr>
-      </w:pPr>
     </w:p>
     <w:p/>
     <w:sectPr>
@@ -23977,12 +24401,11 @@
 </file>
 
 <file path=customXml/item1.xml><?xml version="1.0" encoding="utf-8"?>
-<b:Sources xmlns:b="http://schemas.openxmlformats.org/officeDocument/2006/bibliography" xmlns="http://schemas.openxmlformats.org/officeDocument/2006/bibliography" SelectedStyle="\IEEE2006OfficeOnline.xsl" StyleName="IEEE 2006">
+<b:Sources xmlns:b="http://schemas.openxmlformats.org/officeDocument/2006/bibliography" xmlns="http://schemas.openxmlformats.org/officeDocument/2006/bibliography" SelectedStyle="\IEEE2006OfficeOnline.xsl" StyleName="IEEE" Version="2006">
   <b:Source>
     <b:Tag>REZ96</b:Tag>
     <b:SourceType>JournalArticle</b:SourceType>
     <b:Guid>{D2538DC3-9D87-4349-95FC-6B2AF20451EF}</b:Guid>
-    <b:LCID>0</b:LCID>
     <b:Author>
       <b:Author>
         <b:NameList>
@@ -23997,13 +24420,12 @@
     <b:Year>1996</b:Year>
     <b:JournalName>46th Vehicular Technology Conference</b:JournalName>
     <b:Pages>26-30</b:Pages>
-    <b:RefOrder>2</b:RefOrder>
+    <b:RefOrder>1</b:RefOrder>
   </b:Source>
   <b:Source>
     <b:Tag>HCF95</b:Tag>
     <b:SourceType>JournalArticle</b:SourceType>
     <b:Guid>{EE75808D-763F-42A5-AD4B-8E3E88E97648}</b:Guid>
-    <b:LCID>0</b:LCID>
     <b:Author>
       <b:Author>
         <b:NameList>
@@ -24019,13 +24441,12 @@
     <b:JournalName>The Transactions on of The S.A. Electrical Engineers</b:JournalName>
     <b:Year>1995</b:Year>
     <b:Pages>154-161</b:Pages>
-    <b:RefOrder>1</b:RefOrder>
+    <b:RefOrder>2</b:RefOrder>
   </b:Source>
   <b:Source>
     <b:Tag>IEE</b:Tag>
     <b:SourceType>InternetSite</b:SourceType>
     <b:Guid>{1F430EA9-B634-457A-B7C5-E749FEAB2441}</b:Guid>
-    <b:LCID>0</b:LCID>
     <b:Title>IEEE P1901 Working Group 2010</b:Title>
     <b:ProductionCompany>Standard for Broadband over Powerline Networks:</b:ProductionCompany>
     <b:URL>http://grouper.ieee.org/groups/1901/</b:URL>
@@ -24035,7 +24456,7 @@
 </file>
 
 <file path=customXml/itemProps1.xml><?xml version="1.0" encoding="utf-8"?>
-<ds:datastoreItem xmlns:ds="http://schemas.openxmlformats.org/officeDocument/2006/customXml" ds:itemID="{D5E11F55-D52C-498B-BA00-DD09C40664BA}">
+<ds:datastoreItem xmlns:ds="http://schemas.openxmlformats.org/officeDocument/2006/customXml" ds:itemID="{8C26FFCD-02B8-4C1B-A44B-FD143588CAFC}">
   <ds:schemaRefs>
     <ds:schemaRef ds:uri="http://schemas.openxmlformats.org/officeDocument/2006/bibliography"/>
   </ds:schemaRefs>

</xml_diff>

<commit_message>
Fixed python training to save training time properly.
</commit_message>
<xml_diff>
--- a/Word/diplomski_rad_word2007.docx
+++ b/Word/diplomski_rad_word2007.docx
@@ -4425,21 +4425,7 @@
             <w:rStyle w:val="Hyperlink"/>
             <w:noProof/>
           </w:rPr>
-          <w:t>Slika 11. Funk</w:t>
-        </w:r>
-        <w:r>
-          <w:rPr>
-            <w:rStyle w:val="Hyperlink"/>
-            <w:noProof/>
-          </w:rPr>
-          <w:t>c</w:t>
-        </w:r>
-        <w:r>
-          <w:rPr>
-            <w:rStyle w:val="Hyperlink"/>
-            <w:noProof/>
-          </w:rPr>
-          <w:t>ija troška na trening setu</w:t>
+          <w:t>Slika 11. Funkcija troška na trening setu</w:t>
         </w:r>
         <w:r>
           <w:rPr>
@@ -16643,19 +16629,13 @@
         <w:rPr>
           <w:lang w:val="bs-Latn-BA"/>
         </w:rPr>
-        <w:t>6</w:t>
+        <w:t>5,88</w:t>
       </w:r>
       <w:r>
         <w:rPr>
           <w:lang w:val="bs-Latn-BA"/>
         </w:rPr>
-        <w:t>,</w:t>
-      </w:r>
-      <w:r>
-        <w:rPr>
-          <w:lang w:val="bs-Latn-BA"/>
-        </w:rPr>
-        <w:t>33 minuta</w:t>
+        <w:t xml:space="preserve"> minuta</w:t>
       </w:r>
     </w:p>
     <w:p>
@@ -16728,19 +16708,31 @@
         <w:rPr>
           <w:lang w:val="bs-Latn-BA"/>
         </w:rPr>
-        <w:t>Prosječno vrijeme treniranja Python modela iznosi 6</w:t>
+        <w:t xml:space="preserve">Prosječno vrijeme treniranja Python modela iznosi </w:t>
       </w:r>
       <w:r>
         <w:rPr>
           <w:lang w:val="bs-Latn-BA"/>
         </w:rPr>
-        <w:t>,</w:t>
+        <w:t>5,93</w:t>
       </w:r>
       <w:r>
         <w:rPr>
           <w:lang w:val="bs-Latn-BA"/>
         </w:rPr>
-        <w:t>08 minuta ili 365 sekundi.</w:t>
+        <w:t xml:space="preserve"> minuta ili 3</w:t>
+      </w:r>
+      <w:r>
+        <w:rPr>
+          <w:lang w:val="bs-Latn-BA"/>
+        </w:rPr>
+        <w:t>56</w:t>
+      </w:r>
+      <w:r>
+        <w:rPr>
+          <w:lang w:val="bs-Latn-BA"/>
+        </w:rPr>
+        <w:t xml:space="preserve"> sekundi.</w:t>
       </w:r>
     </w:p>
     <w:p>
@@ -16942,13 +16934,10 @@
         </w:numPr>
       </w:pPr>
       <w:r>
-        <w:t>7</w:t>
-      </w:r>
-      <w:r>
-        <w:t>6,</w:t>
-      </w:r>
-      <w:r>
-        <w:t>30%</w:t>
+        <w:t>80.19</w:t>
+      </w:r>
+      <w:r>
+        <w:t>%</w:t>
       </w:r>
     </w:p>
     <w:p>
@@ -16989,13 +16978,13 @@
     </w:p>
     <w:p>
       <w:r>
-        <w:t>Prosječna vrijednost makro odziva dobijenih Python modela iznosi 78</w:t>
-      </w:r>
-      <w:r>
-        <w:t>,</w:t>
-      </w:r>
-      <w:r>
-        <w:t>66%.</w:t>
+        <w:t>Prosječna vrijednost makro odziva dobijenih Python modela iznosi 7</w:t>
+      </w:r>
+      <w:r>
+        <w:t>9,95</w:t>
+      </w:r>
+      <w:r>
+        <w:t>%.</w:t>
       </w:r>
     </w:p>
     <w:p>
@@ -17065,8 +17054,8 @@
         <w:pStyle w:val="Caption"/>
         <w:jc w:val="center"/>
       </w:pPr>
-      <w:bookmarkStart w:id="30" w:name="_Hlk234154236"/>
-      <w:bookmarkStart w:id="31" w:name="_Toc234846089"/>
+      <w:bookmarkStart w:id="30" w:name="_Toc234846089"/>
+      <w:bookmarkStart w:id="31" w:name="_Hlk234154236"/>
       <w:r>
         <w:t xml:space="preserve">Slika </w:t>
       </w:r>
@@ -17109,9 +17098,9 @@
       <w:r>
         <w:t xml:space="preserve"> makro odziva modela</w:t>
       </w:r>
-      <w:bookmarkEnd w:id="31"/>
-    </w:p>
-    <w:bookmarkEnd w:id="30"/>
+      <w:bookmarkEnd w:id="30"/>
+    </w:p>
+    <w:bookmarkEnd w:id="31"/>
     <w:p/>
     <w:p/>
     <w:p/>
@@ -17280,13 +17269,16 @@
         </w:numPr>
       </w:pPr>
       <w:r>
-        <w:t>77</w:t>
+        <w:t>7</w:t>
+      </w:r>
+      <w:r>
+        <w:t>8</w:t>
       </w:r>
       <w:r>
         <w:t>,</w:t>
       </w:r>
       <w:r>
-        <w:t>21</w:t>
+        <w:t>55</w:t>
       </w:r>
       <w:r>
         <w:t>%</w:t>
@@ -17348,7 +17340,7 @@
         <w:t>,</w:t>
       </w:r>
       <w:r>
-        <w:t>43</w:t>
+        <w:t>87</w:t>
       </w:r>
       <w:r>
         <w:t>%.</w:t>
@@ -17607,13 +17599,19 @@
         </w:numPr>
       </w:pPr>
       <w:r>
-        <w:t>97</w:t>
+        <w:t>9</w:t>
+      </w:r>
+      <w:r>
+        <w:t>8</w:t>
       </w:r>
       <w:r>
         <w:t>,</w:t>
       </w:r>
       <w:r>
-        <w:t>87%</w:t>
+        <w:t>58</w:t>
+      </w:r>
+      <w:r>
+        <w:t>%</w:t>
       </w:r>
       <w:r>
         <w:tab/>
@@ -17669,7 +17667,10 @@
         <w:t>,</w:t>
       </w:r>
       <w:r>
-        <w:t>63%.</w:t>
+        <w:t>87</w:t>
+      </w:r>
+      <w:r>
+        <w:t>%.</w:t>
       </w:r>
     </w:p>
     <w:p>
@@ -17958,13 +17959,16 @@
         </w:numPr>
       </w:pPr>
       <w:r>
-        <w:t>80</w:t>
+        <w:t>8</w:t>
+      </w:r>
+      <w:r>
+        <w:t>1</w:t>
       </w:r>
       <w:r>
         <w:t>,</w:t>
       </w:r>
       <w:r>
-        <w:t>00</w:t>
+        <w:t>82</w:t>
       </w:r>
       <w:r>
         <w:t>%</w:t>
@@ -18035,13 +18039,16 @@
         <w:t xml:space="preserve"> dobijenih Python modela iznosi </w:t>
       </w:r>
       <w:r>
-        <w:t>80</w:t>
+        <w:t>8</w:t>
+      </w:r>
+      <w:r>
+        <w:t>1</w:t>
       </w:r>
       <w:r>
         <w:t>,</w:t>
       </w:r>
       <w:r>
-        <w:t>85</w:t>
+        <w:t>45</w:t>
       </w:r>
       <w:r>
         <w:t>%.</w:t>

</xml_diff>

<commit_message>
Added word sources and and polished grammer.
</commit_message>
<xml_diff>
--- a/Word/diplomski_rad_word2007.docx
+++ b/Word/diplomski_rad_word2007.docx
@@ -333,7 +333,7 @@
           <w:szCs w:val="32"/>
           <w:lang w:val="bs-Latn-BA"/>
         </w:rPr>
-        <w:t>juli</w:t>
+        <w:t>August</w:t>
       </w:r>
       <w:r>
         <w:rPr>
@@ -488,7 +488,7 @@
           <w:szCs w:val="24"/>
           <w:lang w:val="bs-Latn-BA"/>
         </w:rPr>
-        <w:t>7</w:t>
+        <w:t>8</w:t>
       </w:r>
       <w:r>
         <w:rPr>
@@ -847,7 +847,13 @@
     </w:p>
     <w:p>
       <w:r>
-        <w:t>Rješavanje problema je implementirano na identičan način u oba okruženja uz strogo definisane parametre. Dati parametri definišu pravila poput identične implementacije konvolucione neuronske mreže u oba okruženja, korištenja istih hiperparametara (funkcija troška, optimizator, stopa učenja, veličina serije), istog početnog stanja neuronske mreže, te treniranja više puta u cilju smanjenja devijacija. Problem je riješen korištenjem TorchSharp za .NET i PyTorch za Python biblioteka. Implementirana je konvolucina neuronska mreža koja je trenirana pomoću javno dostupnih podataka sa platforme Kaggle. Orkestracija je realizovana uz pomoć .NET Aspire tehnologije, povezivanjem dva odvojena API interfejsa, te je kreirana web aplikacija koja omogućava treniranje, analizu i poređenje treniranih modela.</w:t>
+        <w:t>Rješavanje problema je implementirano na identičan način u oba okruženja uz strogo definisane parametre. Dati parametri definišu pravila poput identične implementacije konvolucione neuronske mreže u oba okruženja, korištenja istih hiperparametara (funkcija troška, optimizator, stopa učenja, veličina serije), istog početnog stanja neuronske mreže, te treniranja više puta u cilju smanjenja devijacija. Problem je rješen korištenjem TorchSharp za .NET i PyTorch za Python biblioteka. Implementirana je konvoluci</w:t>
+      </w:r>
+      <w:r>
+        <w:t>o</w:t>
+      </w:r>
+      <w:r>
+        <w:t>na neuronska mreža koja je trenirana pomoću javno dostupnih podataka sa platforme Kaggle. Orkestracija je realizovana uz pomoć .NET Aspire tehnologije, povezivanjem dva odvojena API interfejsa, te je kreirana web aplikacija koja omogućava treniranje, analizu i poređenje treniranih modela.</w:t>
       </w:r>
     </w:p>
     <w:p/>
@@ -925,7 +931,19 @@
         <w:rPr>
           <w:lang w:val="en-US"/>
         </w:rPr>
-        <w:t>This research compares the resolution of a deep learning problem, specifically lung cancer detection, within Python and .NET environments, and analyzes the obtained results.</w:t>
+        <w:t xml:space="preserve">This research </w:t>
+      </w:r>
+      <w:r>
+        <w:rPr>
+          <w:lang w:val="en-US"/>
+        </w:rPr>
+        <w:t>compares approaches to solving a deep learning problem</w:t>
+      </w:r>
+      <w:r>
+        <w:rPr>
+          <w:lang w:val="en-US"/>
+        </w:rPr>
+        <w:t>, specifically lung cancer detection, within Python and .NET environments, and analyzes the obtained results.</w:t>
       </w:r>
     </w:p>
     <w:p>
@@ -1145,7 +1163,7 @@
           <w:r>
             <w:fldChar w:fldCharType="separate"/>
           </w:r>
-          <w:hyperlink w:anchor="_Toc234846016" w:history="1">
+          <w:hyperlink w:anchor="_Toc236486932" w:history="1">
             <w:r>
               <w:rPr>
                 <w:rStyle w:val="Hyperlink"/>
@@ -1172,7 +1190,7 @@
                 <w:noProof/>
                 <w:webHidden/>
               </w:rPr>
-              <w:instrText xml:space="preserve"> PAGEREF _Toc234846016 \h </w:instrText>
+              <w:instrText xml:space="preserve"> PAGEREF _Toc236486932 \h </w:instrText>
             </w:r>
             <w:r>
               <w:rPr>
@@ -1217,7 +1235,7 @@
               <w:lang w:val="en-US"/>
             </w:rPr>
           </w:pPr>
-          <w:hyperlink w:anchor="_Toc234846017" w:history="1">
+          <w:hyperlink w:anchor="_Toc236486933" w:history="1">
             <w:r>
               <w:rPr>
                 <w:rStyle w:val="Hyperlink"/>
@@ -1260,7 +1278,7 @@
                 <w:noProof/>
                 <w:webHidden/>
               </w:rPr>
-              <w:instrText xml:space="preserve"> PAGEREF _Toc234846017 \h </w:instrText>
+              <w:instrText xml:space="preserve"> PAGEREF _Toc236486933 \h </w:instrText>
             </w:r>
             <w:r>
               <w:rPr>
@@ -1304,7 +1322,7 @@
               <w:lang w:val="en-US"/>
             </w:rPr>
           </w:pPr>
-          <w:hyperlink w:anchor="_Toc234846018" w:history="1">
+          <w:hyperlink w:anchor="_Toc236486934" w:history="1">
             <w:r>
               <w:rPr>
                 <w:rStyle w:val="Hyperlink"/>
@@ -1331,7 +1349,7 @@
                 <w:noProof/>
                 <w:webHidden/>
               </w:rPr>
-              <w:instrText xml:space="preserve"> PAGEREF _Toc234846018 \h </w:instrText>
+              <w:instrText xml:space="preserve"> PAGEREF _Toc236486934 \h </w:instrText>
             </w:r>
             <w:r>
               <w:rPr>
@@ -1376,7 +1394,7 @@
               <w:lang w:val="en-US"/>
             </w:rPr>
           </w:pPr>
-          <w:hyperlink w:anchor="_Toc234846019" w:history="1">
+          <w:hyperlink w:anchor="_Toc236486935" w:history="1">
             <w:r>
               <w:rPr>
                 <w:rStyle w:val="Hyperlink"/>
@@ -1419,7 +1437,7 @@
                 <w:noProof/>
                 <w:webHidden/>
               </w:rPr>
-              <w:instrText xml:space="preserve"> PAGEREF _Toc234846019 \h </w:instrText>
+              <w:instrText xml:space="preserve"> PAGEREF _Toc236486935 \h </w:instrText>
             </w:r>
             <w:r>
               <w:rPr>
@@ -1464,7 +1482,7 @@
               <w:lang w:val="en-US"/>
             </w:rPr>
           </w:pPr>
-          <w:hyperlink w:anchor="_Toc234846020" w:history="1">
+          <w:hyperlink w:anchor="_Toc236486936" w:history="1">
             <w:r>
               <w:rPr>
                 <w:rStyle w:val="Hyperlink"/>
@@ -1507,7 +1525,7 @@
                 <w:noProof/>
                 <w:webHidden/>
               </w:rPr>
-              <w:instrText xml:space="preserve"> PAGEREF _Toc234846020 \h </w:instrText>
+              <w:instrText xml:space="preserve"> PAGEREF _Toc236486936 \h </w:instrText>
             </w:r>
             <w:r>
               <w:rPr>
@@ -1552,7 +1570,7 @@
               <w:lang w:val="en-US"/>
             </w:rPr>
           </w:pPr>
-          <w:hyperlink w:anchor="_Toc234846021" w:history="1">
+          <w:hyperlink w:anchor="_Toc236486937" w:history="1">
             <w:r>
               <w:rPr>
                 <w:rStyle w:val="Hyperlink"/>
@@ -1595,7 +1613,7 @@
                 <w:noProof/>
                 <w:webHidden/>
               </w:rPr>
-              <w:instrText xml:space="preserve"> PAGEREF _Toc234846021 \h </w:instrText>
+              <w:instrText xml:space="preserve"> PAGEREF _Toc236486937 \h </w:instrText>
             </w:r>
             <w:r>
               <w:rPr>
@@ -1640,7 +1658,7 @@
               <w:lang w:val="en-US"/>
             </w:rPr>
           </w:pPr>
-          <w:hyperlink w:anchor="_Toc234846022" w:history="1">
+          <w:hyperlink w:anchor="_Toc236486938" w:history="1">
             <w:r>
               <w:rPr>
                 <w:rStyle w:val="Hyperlink"/>
@@ -1683,7 +1701,7 @@
                 <w:noProof/>
                 <w:webHidden/>
               </w:rPr>
-              <w:instrText xml:space="preserve"> PAGEREF _Toc234846022 \h </w:instrText>
+              <w:instrText xml:space="preserve"> PAGEREF _Toc236486938 \h </w:instrText>
             </w:r>
             <w:r>
               <w:rPr>
@@ -1728,7 +1746,7 @@
               <w:lang w:val="en-US"/>
             </w:rPr>
           </w:pPr>
-          <w:hyperlink w:anchor="_Toc234846023" w:history="1">
+          <w:hyperlink w:anchor="_Toc236486939" w:history="1">
             <w:r>
               <w:rPr>
                 <w:rStyle w:val="Hyperlink"/>
@@ -1771,7 +1789,7 @@
                 <w:noProof/>
                 <w:webHidden/>
               </w:rPr>
-              <w:instrText xml:space="preserve"> PAGEREF _Toc234846023 \h </w:instrText>
+              <w:instrText xml:space="preserve"> PAGEREF _Toc236486939 \h </w:instrText>
             </w:r>
             <w:r>
               <w:rPr>
@@ -1814,7 +1832,7 @@
               <w:lang w:val="en-US"/>
             </w:rPr>
           </w:pPr>
-          <w:hyperlink w:anchor="_Toc234846024" w:history="1">
+          <w:hyperlink w:anchor="_Toc236486940" w:history="1">
             <w:r>
               <w:rPr>
                 <w:rStyle w:val="Hyperlink"/>
@@ -1855,7 +1873,7 @@
                 <w:noProof/>
                 <w:webHidden/>
               </w:rPr>
-              <w:instrText xml:space="preserve"> PAGEREF _Toc234846024 \h </w:instrText>
+              <w:instrText xml:space="preserve"> PAGEREF _Toc236486940 \h </w:instrText>
             </w:r>
             <w:r>
               <w:rPr>
@@ -1898,7 +1916,7 @@
               <w:lang w:val="en-US"/>
             </w:rPr>
           </w:pPr>
-          <w:hyperlink w:anchor="_Toc234846025" w:history="1">
+          <w:hyperlink w:anchor="_Toc236486941" w:history="1">
             <w:r>
               <w:rPr>
                 <w:rStyle w:val="Hyperlink"/>
@@ -1939,7 +1957,7 @@
                 <w:noProof/>
                 <w:webHidden/>
               </w:rPr>
-              <w:instrText xml:space="preserve"> PAGEREF _Toc234846025 \h </w:instrText>
+              <w:instrText xml:space="preserve"> PAGEREF _Toc236486941 \h </w:instrText>
             </w:r>
             <w:r>
               <w:rPr>
@@ -1982,7 +2000,7 @@
               <w:lang w:val="en-US"/>
             </w:rPr>
           </w:pPr>
-          <w:hyperlink w:anchor="_Toc234846026" w:history="1">
+          <w:hyperlink w:anchor="_Toc236486942" w:history="1">
             <w:r>
               <w:rPr>
                 <w:rStyle w:val="Hyperlink"/>
@@ -2023,7 +2041,7 @@
                 <w:noProof/>
                 <w:webHidden/>
               </w:rPr>
-              <w:instrText xml:space="preserve"> PAGEREF _Toc234846026 \h </w:instrText>
+              <w:instrText xml:space="preserve"> PAGEREF _Toc236486942 \h </w:instrText>
             </w:r>
             <w:r>
               <w:rPr>
@@ -2067,7 +2085,7 @@
               <w:lang w:val="en-US"/>
             </w:rPr>
           </w:pPr>
-          <w:hyperlink w:anchor="_Toc234846027" w:history="1">
+          <w:hyperlink w:anchor="_Toc236486943" w:history="1">
             <w:r>
               <w:rPr>
                 <w:rStyle w:val="Hyperlink"/>
@@ -2094,7 +2112,7 @@
                 <w:noProof/>
                 <w:webHidden/>
               </w:rPr>
-              <w:instrText xml:space="preserve"> PAGEREF _Toc234846027 \h </w:instrText>
+              <w:instrText xml:space="preserve"> PAGEREF _Toc236486943 \h </w:instrText>
             </w:r>
             <w:r>
               <w:rPr>
@@ -2139,7 +2157,7 @@
               <w:lang w:val="en-US"/>
             </w:rPr>
           </w:pPr>
-          <w:hyperlink w:anchor="_Toc234846028" w:history="1">
+          <w:hyperlink w:anchor="_Toc236486944" w:history="1">
             <w:r>
               <w:rPr>
                 <w:rStyle w:val="Hyperlink"/>
@@ -2198,7 +2216,7 @@
                 <w:noProof/>
                 <w:webHidden/>
               </w:rPr>
-              <w:instrText xml:space="preserve"> PAGEREF _Toc234846028 \h </w:instrText>
+              <w:instrText xml:space="preserve"> PAGEREF _Toc236486944 \h </w:instrText>
             </w:r>
             <w:r>
               <w:rPr>
@@ -2243,7 +2261,7 @@
               <w:lang w:val="en-US"/>
             </w:rPr>
           </w:pPr>
-          <w:hyperlink w:anchor="_Toc234846029" w:history="1">
+          <w:hyperlink w:anchor="_Toc236486945" w:history="1">
             <w:r>
               <w:rPr>
                 <w:rStyle w:val="Hyperlink"/>
@@ -2302,7 +2320,7 @@
                 <w:noProof/>
                 <w:webHidden/>
               </w:rPr>
-              <w:instrText xml:space="preserve"> PAGEREF _Toc234846029 \h </w:instrText>
+              <w:instrText xml:space="preserve"> PAGEREF _Toc236486945 \h </w:instrText>
             </w:r>
             <w:r>
               <w:rPr>
@@ -2347,7 +2365,7 @@
               <w:lang w:val="en-US"/>
             </w:rPr>
           </w:pPr>
-          <w:hyperlink w:anchor="_Toc234846030" w:history="1">
+          <w:hyperlink w:anchor="_Toc236486946" w:history="1">
             <w:r>
               <w:rPr>
                 <w:rStyle w:val="Hyperlink"/>
@@ -2390,7 +2408,7 @@
                 <w:noProof/>
                 <w:webHidden/>
               </w:rPr>
-              <w:instrText xml:space="preserve"> PAGEREF _Toc234846030 \h </w:instrText>
+              <w:instrText xml:space="preserve"> PAGEREF _Toc236486946 \h </w:instrText>
             </w:r>
             <w:r>
               <w:rPr>
@@ -2435,7 +2453,7 @@
               <w:lang w:val="en-US"/>
             </w:rPr>
           </w:pPr>
-          <w:hyperlink w:anchor="_Toc234846031" w:history="1">
+          <w:hyperlink w:anchor="_Toc236486947" w:history="1">
             <w:r>
               <w:rPr>
                 <w:rStyle w:val="Hyperlink"/>
@@ -2478,7 +2496,7 @@
                 <w:noProof/>
                 <w:webHidden/>
               </w:rPr>
-              <w:instrText xml:space="preserve"> PAGEREF _Toc234846031 \h </w:instrText>
+              <w:instrText xml:space="preserve"> PAGEREF _Toc236486947 \h </w:instrText>
             </w:r>
             <w:r>
               <w:rPr>
@@ -2523,7 +2541,7 @@
               <w:lang w:val="en-US"/>
             </w:rPr>
           </w:pPr>
-          <w:hyperlink w:anchor="_Toc234846032" w:history="1">
+          <w:hyperlink w:anchor="_Toc236486948" w:history="1">
             <w:r>
               <w:rPr>
                 <w:rStyle w:val="Hyperlink"/>
@@ -2566,7 +2584,7 @@
                 <w:noProof/>
                 <w:webHidden/>
               </w:rPr>
-              <w:instrText xml:space="preserve"> PAGEREF _Toc234846032 \h </w:instrText>
+              <w:instrText xml:space="preserve"> PAGEREF _Toc236486948 \h </w:instrText>
             </w:r>
             <w:r>
               <w:rPr>
@@ -2611,7 +2629,7 @@
               <w:lang w:val="en-US"/>
             </w:rPr>
           </w:pPr>
-          <w:hyperlink w:anchor="_Toc234846033" w:history="1">
+          <w:hyperlink w:anchor="_Toc236486949" w:history="1">
             <w:r>
               <w:rPr>
                 <w:rStyle w:val="Hyperlink"/>
@@ -2654,7 +2672,7 @@
                 <w:noProof/>
                 <w:webHidden/>
               </w:rPr>
-              <w:instrText xml:space="preserve"> PAGEREF _Toc234846033 \h </w:instrText>
+              <w:instrText xml:space="preserve"> PAGEREF _Toc236486949 \h </w:instrText>
             </w:r>
             <w:r>
               <w:rPr>
@@ -2699,7 +2717,7 @@
               <w:lang w:val="en-US"/>
             </w:rPr>
           </w:pPr>
-          <w:hyperlink w:anchor="_Toc234846034" w:history="1">
+          <w:hyperlink w:anchor="_Toc236486950" w:history="1">
             <w:r>
               <w:rPr>
                 <w:rStyle w:val="Hyperlink"/>
@@ -2742,7 +2760,7 @@
                 <w:noProof/>
                 <w:webHidden/>
               </w:rPr>
-              <w:instrText xml:space="preserve"> PAGEREF _Toc234846034 \h </w:instrText>
+              <w:instrText xml:space="preserve"> PAGEREF _Toc236486950 \h </w:instrText>
             </w:r>
             <w:r>
               <w:rPr>
@@ -2787,7 +2805,7 @@
               <w:lang w:val="en-US"/>
             </w:rPr>
           </w:pPr>
-          <w:hyperlink w:anchor="_Toc234846035" w:history="1">
+          <w:hyperlink w:anchor="_Toc236486951" w:history="1">
             <w:r>
               <w:rPr>
                 <w:rStyle w:val="Hyperlink"/>
@@ -2830,7 +2848,7 @@
                 <w:noProof/>
                 <w:webHidden/>
               </w:rPr>
-              <w:instrText xml:space="preserve"> PAGEREF _Toc234846035 \h </w:instrText>
+              <w:instrText xml:space="preserve"> PAGEREF _Toc236486951 \h </w:instrText>
             </w:r>
             <w:r>
               <w:rPr>
@@ -2874,7 +2892,7 @@
               <w:lang w:val="en-US"/>
             </w:rPr>
           </w:pPr>
-          <w:hyperlink w:anchor="_Toc234846036" w:history="1">
+          <w:hyperlink w:anchor="_Toc236486952" w:history="1">
             <w:r>
               <w:rPr>
                 <w:rStyle w:val="Hyperlink"/>
@@ -2901,7 +2919,7 @@
                 <w:noProof/>
                 <w:webHidden/>
               </w:rPr>
-              <w:instrText xml:space="preserve"> PAGEREF _Toc234846036 \h </w:instrText>
+              <w:instrText xml:space="preserve"> PAGEREF _Toc236486952 \h </w:instrText>
             </w:r>
             <w:r>
               <w:rPr>
@@ -2946,7 +2964,7 @@
               <w:lang w:val="en-US"/>
             </w:rPr>
           </w:pPr>
-          <w:hyperlink w:anchor="_Toc234846037" w:history="1">
+          <w:hyperlink w:anchor="_Toc236486953" w:history="1">
             <w:r>
               <w:rPr>
                 <w:rStyle w:val="Hyperlink"/>
@@ -2991,7 +3009,7 @@
                 <w:noProof/>
                 <w:webHidden/>
               </w:rPr>
-              <w:instrText xml:space="preserve"> PAGEREF _Toc234846037 \h </w:instrText>
+              <w:instrText xml:space="preserve"> PAGEREF _Toc236486953 \h </w:instrText>
             </w:r>
             <w:r>
               <w:rPr>
@@ -3036,7 +3054,7 @@
               <w:lang w:val="en-US"/>
             </w:rPr>
           </w:pPr>
-          <w:hyperlink w:anchor="_Toc234846038" w:history="1">
+          <w:hyperlink w:anchor="_Toc236486954" w:history="1">
             <w:r>
               <w:rPr>
                 <w:rStyle w:val="Hyperlink"/>
@@ -3081,7 +3099,7 @@
                 <w:noProof/>
                 <w:webHidden/>
               </w:rPr>
-              <w:instrText xml:space="preserve"> PAGEREF _Toc234846038 \h </w:instrText>
+              <w:instrText xml:space="preserve"> PAGEREF _Toc236486954 \h </w:instrText>
             </w:r>
             <w:r>
               <w:rPr>
@@ -3126,7 +3144,7 @@
               <w:lang w:val="en-US"/>
             </w:rPr>
           </w:pPr>
-          <w:hyperlink w:anchor="_Toc234846039" w:history="1">
+          <w:hyperlink w:anchor="_Toc236486955" w:history="1">
             <w:r>
               <w:rPr>
                 <w:rStyle w:val="Hyperlink"/>
@@ -3169,7 +3187,7 @@
                 <w:noProof/>
                 <w:webHidden/>
               </w:rPr>
-              <w:instrText xml:space="preserve"> PAGEREF _Toc234846039 \h </w:instrText>
+              <w:instrText xml:space="preserve"> PAGEREF _Toc236486955 \h </w:instrText>
             </w:r>
             <w:r>
               <w:rPr>
@@ -3214,7 +3232,7 @@
               <w:lang w:val="en-US"/>
             </w:rPr>
           </w:pPr>
-          <w:hyperlink w:anchor="_Toc234846040" w:history="1">
+          <w:hyperlink w:anchor="_Toc236486956" w:history="1">
             <w:r>
               <w:rPr>
                 <w:rStyle w:val="Hyperlink"/>
@@ -3257,7 +3275,7 @@
                 <w:noProof/>
                 <w:webHidden/>
               </w:rPr>
-              <w:instrText xml:space="preserve"> PAGEREF _Toc234846040 \h </w:instrText>
+              <w:instrText xml:space="preserve"> PAGEREF _Toc236486956 \h </w:instrText>
             </w:r>
             <w:r>
               <w:rPr>
@@ -3302,7 +3320,7 @@
               <w:lang w:val="en-US"/>
             </w:rPr>
           </w:pPr>
-          <w:hyperlink w:anchor="_Toc234846041" w:history="1">
+          <w:hyperlink w:anchor="_Toc236486957" w:history="1">
             <w:r>
               <w:rPr>
                 <w:rStyle w:val="Hyperlink"/>
@@ -3345,7 +3363,7 @@
                 <w:noProof/>
                 <w:webHidden/>
               </w:rPr>
-              <w:instrText xml:space="preserve"> PAGEREF _Toc234846041 \h </w:instrText>
+              <w:instrText xml:space="preserve"> PAGEREF _Toc236486957 \h </w:instrText>
             </w:r>
             <w:r>
               <w:rPr>
@@ -3390,7 +3408,7 @@
               <w:lang w:val="en-US"/>
             </w:rPr>
           </w:pPr>
-          <w:hyperlink w:anchor="_Toc234846042" w:history="1">
+          <w:hyperlink w:anchor="_Toc236486958" w:history="1">
             <w:r>
               <w:rPr>
                 <w:rStyle w:val="Hyperlink"/>
@@ -3433,7 +3451,7 @@
                 <w:noProof/>
                 <w:webHidden/>
               </w:rPr>
-              <w:instrText xml:space="preserve"> PAGEREF _Toc234846042 \h </w:instrText>
+              <w:instrText xml:space="preserve"> PAGEREF _Toc236486958 \h </w:instrText>
             </w:r>
             <w:r>
               <w:rPr>
@@ -3478,7 +3496,7 @@
               <w:lang w:val="en-US"/>
             </w:rPr>
           </w:pPr>
-          <w:hyperlink w:anchor="_Toc234846043" w:history="1">
+          <w:hyperlink w:anchor="_Toc236486959" w:history="1">
             <w:r>
               <w:rPr>
                 <w:rStyle w:val="Hyperlink"/>
@@ -3521,7 +3539,7 @@
                 <w:noProof/>
                 <w:webHidden/>
               </w:rPr>
-              <w:instrText xml:space="preserve"> PAGEREF _Toc234846043 \h </w:instrText>
+              <w:instrText xml:space="preserve"> PAGEREF _Toc236486959 \h </w:instrText>
             </w:r>
             <w:r>
               <w:rPr>
@@ -3565,7 +3583,7 @@
               <w:lang w:val="en-US"/>
             </w:rPr>
           </w:pPr>
-          <w:hyperlink w:anchor="_Toc234846044" w:history="1">
+          <w:hyperlink w:anchor="_Toc236486960" w:history="1">
             <w:r>
               <w:rPr>
                 <w:rStyle w:val="Hyperlink"/>
@@ -3592,7 +3610,7 @@
                 <w:noProof/>
                 <w:webHidden/>
               </w:rPr>
-              <w:instrText xml:space="preserve"> PAGEREF _Toc234846044 \h </w:instrText>
+              <w:instrText xml:space="preserve"> PAGEREF _Toc236486960 \h </w:instrText>
             </w:r>
             <w:r>
               <w:rPr>
@@ -3634,10 +3652,6 @@
       <w:pPr>
         <w:spacing w:line="276" w:lineRule="auto"/>
       </w:pPr>
-      <w:r>
-        <w:lastRenderedPageBreak/>
-        <w:br w:type="page"/>
-      </w:r>
     </w:p>
     <w:p>
       <w:pPr>
@@ -3653,7 +3667,6 @@
           <w:sz w:val="52"/>
           <w:szCs w:val="52"/>
         </w:rPr>
-        <w:lastRenderedPageBreak/>
         <w:t>Popis slika</w:t>
       </w:r>
     </w:p>
@@ -4518,242 +4531,142 @@
           <w:szCs w:val="52"/>
         </w:rPr>
         <w:lastRenderedPageBreak/>
-        <w:t>Popis tablica</w:t>
+        <w:t>Popis skraćenica</w:t>
       </w:r>
     </w:p>
     <w:p>
       <w:pPr>
         <w:spacing w:line="276" w:lineRule="auto"/>
-        <w:rPr>
-          <w:b/>
-          <w:sz w:val="52"/>
-          <w:szCs w:val="52"/>
-        </w:rPr>
-      </w:pPr>
-    </w:p>
-    <w:p>
-      <w:pPr>
-        <w:pStyle w:val="TableofFigures"/>
-        <w:tabs>
-          <w:tab w:val="right" w:leader="dot" w:pos="9350"/>
-        </w:tabs>
-        <w:rPr>
-          <w:rFonts w:asciiTheme="minorHAnsi" w:eastAsiaTheme="minorEastAsia" w:hAnsiTheme="minorHAnsi"/>
-          <w:noProof/>
-          <w:sz w:val="22"/>
-          <w:lang w:eastAsia="hr-HR"/>
-        </w:rPr>
-      </w:pPr>
-      <w:r>
-        <w:fldChar w:fldCharType="begin"/>
-      </w:r>
-      <w:r>
-        <w:instrText xml:space="preserve"> TOC \h \z \c "Tabela" </w:instrText>
-      </w:r>
-      <w:r>
-        <w:fldChar w:fldCharType="separate"/>
-      </w:r>
-      <w:hyperlink w:anchor="_Toc329251899" w:history="1">
-        <w:r>
-          <w:rPr>
-            <w:rStyle w:val="Hyperlink"/>
-            <w:noProof/>
-          </w:rPr>
-          <w:t>Tabela 1: Naziv tabele</w:t>
-        </w:r>
-        <w:r>
-          <w:rPr>
-            <w:noProof/>
-            <w:webHidden/>
-          </w:rPr>
-          <w:tab/>
-        </w:r>
-        <w:r>
-          <w:rPr>
-            <w:noProof/>
-            <w:webHidden/>
-          </w:rPr>
-          <w:fldChar w:fldCharType="begin"/>
-        </w:r>
-        <w:r>
-          <w:rPr>
-            <w:noProof/>
-            <w:webHidden/>
-          </w:rPr>
-          <w:instrText xml:space="preserve"> PAGEREF _Toc329251899 \h </w:instrText>
-        </w:r>
-        <w:r>
-          <w:rPr>
-            <w:noProof/>
-            <w:webHidden/>
-          </w:rPr>
-        </w:r>
-        <w:r>
-          <w:rPr>
-            <w:noProof/>
-            <w:webHidden/>
-          </w:rPr>
-          <w:fldChar w:fldCharType="separate"/>
-        </w:r>
-        <w:r>
-          <w:rPr>
-            <w:noProof/>
-            <w:webHidden/>
-          </w:rPr>
-          <w:t>4</w:t>
-        </w:r>
-        <w:r>
-          <w:rPr>
-            <w:noProof/>
-            <w:webHidden/>
-          </w:rPr>
-          <w:fldChar w:fldCharType="end"/>
-        </w:r>
-      </w:hyperlink>
-    </w:p>
-    <w:p>
-      <w:pPr>
-        <w:pStyle w:val="TableofFigures"/>
-        <w:tabs>
-          <w:tab w:val="right" w:leader="dot" w:pos="9350"/>
-        </w:tabs>
-        <w:rPr>
-          <w:rFonts w:asciiTheme="minorHAnsi" w:eastAsiaTheme="minorEastAsia" w:hAnsiTheme="minorHAnsi"/>
-          <w:noProof/>
-          <w:sz w:val="22"/>
-          <w:lang w:eastAsia="hr-HR"/>
-        </w:rPr>
-      </w:pPr>
-      <w:hyperlink w:anchor="_Toc329251900" w:history="1">
-        <w:r>
-          <w:rPr>
-            <w:rStyle w:val="Hyperlink"/>
-            <w:noProof/>
-          </w:rPr>
-          <w:t>Tabela 2 Veoma široka tabela</w:t>
-        </w:r>
-        <w:r>
-          <w:rPr>
-            <w:noProof/>
-            <w:webHidden/>
-          </w:rPr>
-          <w:tab/>
-        </w:r>
-        <w:r>
-          <w:rPr>
-            <w:noProof/>
-            <w:webHidden/>
-          </w:rPr>
-          <w:fldChar w:fldCharType="begin"/>
-        </w:r>
-        <w:r>
-          <w:rPr>
-            <w:noProof/>
-            <w:webHidden/>
-          </w:rPr>
-          <w:instrText xml:space="preserve"> PAGEREF _Toc329251900 \h </w:instrText>
-        </w:r>
-        <w:r>
-          <w:rPr>
-            <w:noProof/>
-            <w:webHidden/>
-          </w:rPr>
-        </w:r>
-        <w:r>
-          <w:rPr>
-            <w:noProof/>
-            <w:webHidden/>
-          </w:rPr>
-          <w:fldChar w:fldCharType="separate"/>
-        </w:r>
-        <w:r>
-          <w:rPr>
-            <w:noProof/>
-            <w:webHidden/>
-          </w:rPr>
-          <w:t>5</w:t>
-        </w:r>
-        <w:r>
-          <w:rPr>
-            <w:noProof/>
-            <w:webHidden/>
-          </w:rPr>
-          <w:fldChar w:fldCharType="end"/>
-        </w:r>
-      </w:hyperlink>
+      </w:pPr>
     </w:p>
     <w:p>
       <w:pPr>
         <w:spacing w:line="276" w:lineRule="auto"/>
       </w:pPr>
       <w:r>
-        <w:fldChar w:fldCharType="end"/>
-      </w:r>
+        <w:t>CNN Convolutional neural network</w:t>
+      </w:r>
+    </w:p>
+    <w:p>
+      <w:pPr>
+        <w:spacing w:line="276" w:lineRule="auto"/>
+      </w:pPr>
+      <w:r>
+        <w:t>ReLU Rectified Linear Unit</w:t>
+      </w:r>
+    </w:p>
+    <w:p>
+      <w:pPr>
+        <w:spacing w:line="276" w:lineRule="auto"/>
+      </w:pPr>
+      <w:r>
+        <w:t>N</w:t>
+      </w:r>
+      <w:r>
+        <w:t>LP</w:t>
+      </w:r>
+      <w:r>
+        <w:t xml:space="preserve"> Natural Language Processing</w:t>
+      </w:r>
+    </w:p>
+    <w:p>
+      <w:pPr>
+        <w:spacing w:line="276" w:lineRule="auto"/>
+      </w:pPr>
+      <w:r>
+        <w:t>AI Artificial Intelligence</w:t>
+      </w:r>
+    </w:p>
+    <w:p>
+      <w:pPr>
+        <w:spacing w:line="276" w:lineRule="auto"/>
+      </w:pPr>
+      <w:r>
+        <w:t>GPU Graphics Processing Unit</w:t>
+      </w:r>
+    </w:p>
+    <w:p>
+      <w:pPr>
+        <w:spacing w:line="276" w:lineRule="auto"/>
+      </w:pPr>
+      <w:r>
+        <w:t>TP True Positive</w:t>
+      </w:r>
+    </w:p>
+    <w:p>
+      <w:pPr>
+        <w:spacing w:line="276" w:lineRule="auto"/>
+      </w:pPr>
+      <w:r>
+        <w:t>FP False Positive</w:t>
+      </w:r>
+    </w:p>
+    <w:p>
+      <w:pPr>
+        <w:spacing w:line="276" w:lineRule="auto"/>
+      </w:pPr>
+      <w:r>
+        <w:t>FN False Negative</w:t>
+      </w:r>
+    </w:p>
+    <w:p>
+      <w:pPr>
+        <w:spacing w:line="276" w:lineRule="auto"/>
+      </w:pPr>
+      <w:r>
+        <w:t>TN True Negative</w:t>
+      </w:r>
+    </w:p>
+    <w:p>
+      <w:pPr>
+        <w:spacing w:line="276" w:lineRule="auto"/>
+      </w:pPr>
+      <w:r>
+        <w:t>IQ-OTH/NCCD Iraq-Oncology Teaching Hospital/National Center for Cancer Diseases</w:t>
+      </w:r>
+    </w:p>
+    <w:p>
+      <w:pPr>
+        <w:spacing w:line="276" w:lineRule="auto"/>
+      </w:pPr>
+      <w:r>
+        <w:t>CT Computed Tomography</w:t>
+      </w:r>
+    </w:p>
+    <w:p>
+      <w:pPr>
+        <w:spacing w:line="276" w:lineRule="auto"/>
+      </w:pPr>
+      <w:r>
+        <w:t>API Application Programming Interface</w:t>
+      </w:r>
+    </w:p>
+    <w:p>
+      <w:pPr>
+        <w:spacing w:line="276" w:lineRule="auto"/>
+      </w:pPr>
+      <w:r>
+        <w:t>HTTP Hypertext Transfer Protocol</w:t>
+      </w:r>
+    </w:p>
+    <w:p>
+      <w:pPr>
+        <w:spacing w:line="276" w:lineRule="auto"/>
+      </w:pPr>
+    </w:p>
+    <w:p>
+      <w:pPr>
+        <w:spacing w:line="276" w:lineRule="auto"/>
+      </w:pPr>
       <w:r>
         <w:br w:type="page"/>
       </w:r>
     </w:p>
     <w:p>
       <w:pPr>
-        <w:rPr>
-          <w:b/>
-          <w:sz w:val="52"/>
-          <w:szCs w:val="52"/>
-        </w:rPr>
-      </w:pPr>
-      <w:r>
-        <w:rPr>
-          <w:b/>
-          <w:sz w:val="52"/>
-          <w:szCs w:val="52"/>
-        </w:rPr>
-        <w:lastRenderedPageBreak/>
-        <w:t>Popis skraćenica</w:t>
-      </w:r>
-    </w:p>
-    <w:p>
-      <w:pPr>
-        <w:spacing w:line="276" w:lineRule="auto"/>
-      </w:pPr>
-      <w:r>
-        <w:t>SAD</w:t>
-      </w:r>
-      <w:r>
-        <w:tab/>
-        <w:t>Sjedinjene Američke Države</w:t>
-      </w:r>
-      <w:r>
-        <w:br/>
-        <w:t xml:space="preserve">RAM </w:t>
-      </w:r>
-      <w:r>
-        <w:tab/>
-        <w:t>Random Access Memo</w:t>
-      </w:r>
-    </w:p>
-    <w:p>
-      <w:pPr>
-        <w:spacing w:line="276" w:lineRule="auto"/>
-      </w:pPr>
-    </w:p>
-    <w:p>
-      <w:pPr>
-        <w:spacing w:line="276" w:lineRule="auto"/>
-      </w:pPr>
-    </w:p>
-    <w:p>
-      <w:pPr>
-        <w:spacing w:line="276" w:lineRule="auto"/>
-      </w:pPr>
-      <w:r>
-        <w:br w:type="page"/>
-      </w:r>
-    </w:p>
-    <w:p>
-      <w:pPr>
         <w:pStyle w:val="Heading1"/>
       </w:pPr>
-      <w:bookmarkStart w:id="1" w:name="_Toc234846016"/>
+      <w:bookmarkStart w:id="1" w:name="_Toc236486932"/>
       <w:proofErr w:type="spellStart"/>
       <w:r>
         <w:lastRenderedPageBreak/>
@@ -4774,7 +4687,13 @@
     </w:p>
     <w:p>
       <w:r>
-        <w:t>Algoritmi koji rješavaju date probleme se odlikuju visokom matematičkom i računarskom kompleksnošću, što njihovu implementaciju "od nule" čini veoma zahtjevnom. Iz toga razloga, danas su razvijeni razni alati i biblioteke poput PyTorch-a, TensorFlow-a i Keras-a, koji kriju datu kompleksnost i pružaju lagan interfejs za korištenje naprednih algoritama. Kroz navedene biblioteke omogućena je primjena tehnika poput linearne regresije za predviđanje numeričkih vrijednosti, konvolucijskih neuronskih mreža za detekciju anomalija na slikama te logističke regresije za klasifikacijske probleme, kao što je detekcija spam pošte.</w:t>
+        <w:t>Algoritmi koji rješavaju date probleme se odlikuju visokom matematičkom i računarskom kompleksnošću, što njihovu implementaciju "od nule" čini veoma zahtjevnom. Iz toga razloga, danas su razvijeni razni alati i biblioteke poput PyTorch, TensorFlow i Keras, koji kriju datu kompleksnost i pružaju lagan interfejs za korištenje naprednih algoritama. Kroz navedene biblioteke omogućena je primjena tehnika poput linearne regresije za predviđanje numeričkih vrijednosti, konvoluci</w:t>
+      </w:r>
+      <w:r>
+        <w:t>onih</w:t>
+      </w:r>
+      <w:r>
+        <w:t xml:space="preserve"> neuronskih mreža za detekciju anomalija na slikama te logističke regresije za klasifikacijske probleme, kao što je detekcija spam pošte.</w:t>
       </w:r>
     </w:p>
     <w:p>
@@ -4806,32 +4725,86 @@
         <w:t>ommits</w:t>
       </w:r>
       <w:r>
-        <w:t xml:space="preserve">), više od 4000 kontributora, te se koristi u preko 800 hiljada drugih projekata. Po </w:t>
-      </w:r>
-      <w:r>
-        <w:fldChar w:fldCharType="begin"/>
-      </w:r>
-      <w:r>
-        <w:instrText xml:space="preserve"> HYPERLINK "https://github.blog/news-insights/octoverse/octoverse-a-new-developer-joins-github-every-second-as-ai-leads-typescript-to-1/" </w:instrText>
-      </w:r>
-      <w:r>
-        <w:fldChar w:fldCharType="separate"/>
-      </w:r>
-      <w:r>
-        <w:rPr>
-          <w:rStyle w:val="Hyperlink"/>
-        </w:rPr>
-        <w:t>istraživanjima</w:t>
-      </w:r>
-      <w:r>
-        <w:rPr>
-          <w:rStyle w:val="Hyperlink"/>
-        </w:rPr>
-        <w:fldChar w:fldCharType="end"/>
+        <w:t xml:space="preserve">), više od 4000 kontributora, te se koristi u preko 800 hiljada drugih projekata. </w:t>
+      </w:r>
+      <w:sdt>
+        <w:sdtPr>
+          <w:id w:val="-2110494140"/>
+          <w:citation/>
+        </w:sdtPr>
+        <w:sdtContent>
+          <w:r>
+            <w:fldChar w:fldCharType="begin"/>
+          </w:r>
+          <w:r>
+            <w:rPr>
+              <w:lang w:val="en-US"/>
+            </w:rPr>
+            <w:instrText xml:space="preserve">CITATION PyT \l 1033 </w:instrText>
+          </w:r>
+          <w:r>
+            <w:fldChar w:fldCharType="separate"/>
+          </w:r>
+          <w:r>
+            <w:rPr>
+              <w:noProof/>
+              <w:lang w:val="en-US"/>
+            </w:rPr>
+            <w:t>[1]</w:t>
+          </w:r>
+          <w:r>
+            <w:fldChar w:fldCharType="end"/>
+          </w:r>
+        </w:sdtContent>
+      </w:sdt>
+      <w:r>
+        <w:t xml:space="preserve"> </w:t>
+      </w:r>
+      <w:r>
+        <w:t xml:space="preserve">Po </w:t>
+      </w:r>
+      <w:r>
+        <w:t>istraživa</w:t>
+      </w:r>
+      <w:r>
+        <w:t>njima</w:t>
       </w:r>
       <w:r>
         <w:t xml:space="preserve"> stranice GitHub iz 2025. godine, Python zadržava vodeću poziciju, te je gotovo pola svih novih projekata iz oblasti mašinskog učenja napisana u Pythonu.</w:t>
       </w:r>
+      <w:r>
+        <w:t xml:space="preserve"> </w:t>
+      </w:r>
+      <w:sdt>
+        <w:sdtPr>
+          <w:id w:val="-375006912"/>
+          <w:citation/>
+        </w:sdtPr>
+        <w:sdtContent>
+          <w:r>
+            <w:fldChar w:fldCharType="begin"/>
+          </w:r>
+          <w:r>
+            <w:rPr>
+              <w:lang w:val="en-US"/>
+            </w:rPr>
+            <w:instrText xml:space="preserve"> CITATION Git25 \l 1033 </w:instrText>
+          </w:r>
+          <w:r>
+            <w:fldChar w:fldCharType="separate"/>
+          </w:r>
+          <w:r>
+            <w:rPr>
+              <w:noProof/>
+              <w:lang w:val="en-US"/>
+            </w:rPr>
+            <w:t>[2]</w:t>
+          </w:r>
+          <w:r>
+            <w:fldChar w:fldCharType="end"/>
+          </w:r>
+        </w:sdtContent>
+      </w:sdt>
     </w:p>
     <w:p>
       <w:r>
@@ -4870,7 +4843,7 @@
       <w:pPr>
         <w:pStyle w:val="Heading2"/>
       </w:pPr>
-      <w:bookmarkStart w:id="2" w:name="_Toc234846017"/>
+      <w:bookmarkStart w:id="2" w:name="_Toc236486933"/>
       <w:r>
         <w:lastRenderedPageBreak/>
         <w:t>Cilj Rada</w:t>
@@ -5857,7 +5830,7 @@
       <w:pPr>
         <w:pStyle w:val="Heading1"/>
       </w:pPr>
-      <w:bookmarkStart w:id="3" w:name="_Toc234846018"/>
+      <w:bookmarkStart w:id="3" w:name="_Toc236486934"/>
       <w:proofErr w:type="spellStart"/>
       <w:r>
         <w:lastRenderedPageBreak/>
@@ -5883,7 +5856,7 @@
       <w:pPr>
         <w:pStyle w:val="Heading2"/>
       </w:pPr>
-      <w:bookmarkStart w:id="4" w:name="_Toc234846019"/>
+      <w:bookmarkStart w:id="4" w:name="_Toc236486935"/>
       <w:r>
         <w:t>Šta su neuronske mreže?</w:t>
       </w:r>
@@ -6083,7 +6056,7 @@
       <w:pPr>
         <w:pStyle w:val="Heading2"/>
       </w:pPr>
-      <w:bookmarkStart w:id="5" w:name="_Toc234846020"/>
+      <w:bookmarkStart w:id="5" w:name="_Toc236486936"/>
       <w:r>
         <w:lastRenderedPageBreak/>
         <w:t>Kako neuronska mreža uči?</w:t>
@@ -6354,7 +6327,13 @@
     </w:p>
     <w:p>
       <w:r>
-        <w:t xml:space="preserve">Kako bi mreža bila u mogućnosti da modelira kompleksne, nelinearne problem na dati izlaz se primjenjuje odgovarajuća aktivacijska funckija (eng. </w:t>
+        <w:t>Kako bi mreža bila u mogućnosti da modelira kompleksne, nelinearne problem</w:t>
+      </w:r>
+      <w:r>
+        <w:t>e</w:t>
+      </w:r>
+      <w:r>
+        <w:t xml:space="preserve"> na dati izlaz se primjenjuje odgovarajuća aktivacijska funckija (eng. </w:t>
       </w:r>
       <w:r>
         <w:rPr>
@@ -6391,7 +6370,13 @@
     </w:p>
     <w:p>
       <w:r>
-        <w:t xml:space="preserve">Funkcija troška sama po sebi pokazuje govori koliko je mreža neprecizna, ona ne ukazuje na to kako je potrebno izmijeniti parametre u svrhu njezinog poboljšanja. Za tu svrhu se koristi algoritam povratne propagacije (eng. </w:t>
+        <w:t xml:space="preserve">Funkcija troška sama po sebi </w:t>
+      </w:r>
+      <w:r>
+        <w:t xml:space="preserve">pokazuje </w:t>
+      </w:r>
+      <w:r>
+        <w:t xml:space="preserve">koliko je mreža neprecizna, ona ne ukazuje na to kako je potrebno izmijeniti parametre u svrhu njezinog poboljšanja. Za tu svrhu se koristi algoritam povratne propagacije (eng. </w:t>
       </w:r>
       <w:r>
         <w:rPr>
@@ -6443,7 +6428,7 @@
       <w:pPr>
         <w:pStyle w:val="Heading2"/>
       </w:pPr>
-      <w:bookmarkStart w:id="6" w:name="_Toc234846021"/>
+      <w:bookmarkStart w:id="6" w:name="_Toc236486937"/>
       <w:r>
         <w:lastRenderedPageBreak/>
         <w:t>CNN – Konvolucione neuronske mreže</w:t>
@@ -6551,7 +6536,13 @@
         <w:t>Pooling layers</w:t>
       </w:r>
       <w:r>
-        <w:t>) – slično konvolucionim slojevima, koriste filter ili kernel koji prelazi preko čitave slike, ali je uloga sloja sažimanja agregacija informacija o datum prostoru i smanjenje dimenzija slike. Na primjer, postoji max pooling sloj koji će preći preko datog dijela slike (npr. koristeći 2x2 kernel) i izvući samo najveću vrijednost. Time se smanjuje računarsko opterećenje,  dok se istovremeno zadržavaju najvažnije informacije.</w:t>
+        <w:t>) – slično konvolucionim slojevima, koriste filter ili kernel koji prelazi preko čitave slike, ali je uloga sloja sažimanja agregacija informacija o dat</w:t>
+      </w:r>
+      <w:r>
+        <w:t>o</w:t>
+      </w:r>
+      <w:r>
+        <w:t>m prostoru i smanjenje dimenzija slike. Na primjer, postoji max pooling sloj koji će preći preko datog dijela slike (npr. koristeći 2x2 kernel) i izvući samo najveću vrijednost. Time se smanjuje računarsko opterećenje,  dok se istovremeno zadržavaju najvažnije informacije.</w:t>
       </w:r>
     </w:p>
     <w:p>
@@ -6574,12 +6565,24 @@
         <w:t>Fully connected layers</w:t>
       </w:r>
       <w:r>
-        <w:t xml:space="preserve">) – predstavljaju slojeve gdje je svaki neuron povezan svim neuronima iz prethodnog sloja, a koji čine osnovu klasičnih neuronskih mreža. Ovi slojevi se nalaze na samom kraju mrežu i njima se proslijeđuju informacije o slici koje su prethodni slojevi izvukli, nakon čega oni donose konačnu odluku. </w:t>
-      </w:r>
-    </w:p>
-    <w:p>
-      <w:r>
-        <w:t>Najveća razlika izmežu običnih neuronskih mreža i konvolucionih neuronskih mreža jeste njihova arhitektura. Obične neuronske mreže sadrže isključivo potpuno povezani slojeve, dok konvolucione mreže kombinuju konvolucione slojeve, slojeve sažimanja i potpuno povezane slojeve.</w:t>
+        <w:t>) – predstavljaju slojeve gdje je svaki neuron povezan svim neuronima iz prethodnog sloja, a koji čine osnovu klasičnih neuronskih mreža. Ovi slojevi se nalaze na samom kraju mrež</w:t>
+      </w:r>
+      <w:r>
+        <w:t>e</w:t>
+      </w:r>
+      <w:r>
+        <w:t xml:space="preserve"> i njima se proslijeđuju informacije o slici koje su prethodni slojevi izvukli, nakon čega oni donose konačnu odluku. </w:t>
+      </w:r>
+    </w:p>
+    <w:p>
+      <w:r>
+        <w:t>Najveća razlika izme</w:t>
+      </w:r>
+      <w:r>
+        <w:t>đ</w:t>
+      </w:r>
+      <w:r>
+        <w:t>u običnih neuronskih mreža i konvolucionih neuronskih mreža jeste njihova arhitektura. Obične neuronske mreže sadrže isključivo potpuno povezani slojeve, dok konvolucione mreže kombinuju konvolucione slojeve, slojeve sažimanja i potpuno povezane slojeve.</w:t>
       </w:r>
     </w:p>
     <w:p>
@@ -6728,7 +6731,7 @@
       <w:pPr>
         <w:pStyle w:val="Heading2"/>
       </w:pPr>
-      <w:bookmarkStart w:id="7" w:name="_Toc234846022"/>
+      <w:bookmarkStart w:id="7" w:name="_Toc236486938"/>
       <w:r>
         <w:lastRenderedPageBreak/>
         <w:t>PyTorch vs. TorchSharp</w:t>
@@ -6750,11 +6753,80 @@
       <w:r>
         <w:t>) koja korisnicima daje na raspolaganje veliki broj algoritama mašinskog učenja, specifično algoritama dubokog učenja. Opseg algoritama je širok te uključuje relativno jednostavne algoritme poput linearne regresije, do konvolucionih neuronskih mreža te transformer modela. Originalno je implementiran od strane Facebook AI Research tima i pretvoren u biblioteku otvorenog koda 2017. godine.</w:t>
       </w:r>
+      <w:r>
+        <w:t xml:space="preserve"> </w:t>
+      </w:r>
+      <w:r>
+        <w:t xml:space="preserve"> </w:t>
+      </w:r>
+      <w:sdt>
+        <w:sdtPr>
+          <w:id w:val="1745606471"/>
+          <w:citation/>
+        </w:sdtPr>
+        <w:sdtContent>
+          <w:r>
+            <w:fldChar w:fldCharType="begin"/>
+          </w:r>
+          <w:r>
+            <w:rPr>
+              <w:lang w:val="en-US"/>
+            </w:rPr>
+            <w:instrText xml:space="preserve">CITATION Pas19 \l 1033 </w:instrText>
+          </w:r>
+          <w:r>
+            <w:fldChar w:fldCharType="separate"/>
+          </w:r>
+          <w:r>
+            <w:rPr>
+              <w:noProof/>
+              <w:lang w:val="en-US"/>
+            </w:rPr>
+            <w:t>[3]</w:t>
+          </w:r>
+          <w:r>
+            <w:fldChar w:fldCharType="end"/>
+          </w:r>
+        </w:sdtContent>
+      </w:sdt>
     </w:p>
     <w:p>
       <w:r>
         <w:t>TorchSharp je .NET biblioteka otvorenog koda, koja, poput PyTorcha, korisnicima daje na raspolaganje jednostavno korištenje raznih algoritama mašinskog učenja. Sam način korištenja biblioteke je vrlo sličan PyTorch biblioteci.</w:t>
       </w:r>
+      <w:r>
+        <w:t xml:space="preserve"> </w:t>
+      </w:r>
+      <w:sdt>
+        <w:sdtPr>
+          <w:id w:val="-802847205"/>
+          <w:citation/>
+        </w:sdtPr>
+        <w:sdtContent>
+          <w:r>
+            <w:fldChar w:fldCharType="begin"/>
+          </w:r>
+          <w:r>
+            <w:rPr>
+              <w:lang w:val="en-US"/>
+            </w:rPr>
+            <w:instrText xml:space="preserve"> CITATION Tor \l 1033 </w:instrText>
+          </w:r>
+          <w:r>
+            <w:fldChar w:fldCharType="separate"/>
+          </w:r>
+          <w:r>
+            <w:rPr>
+              <w:noProof/>
+              <w:lang w:val="en-US"/>
+            </w:rPr>
+            <w:t>[4]</w:t>
+          </w:r>
+          <w:r>
+            <w:fldChar w:fldCharType="end"/>
+          </w:r>
+        </w:sdtContent>
+      </w:sdt>
     </w:p>
     <w:p>
       <w:r>
@@ -6790,7 +6862,7 @@
         <w:t>Global Interpreter Lock</w:t>
       </w:r>
       <w:r>
-        <w:t>) i predstavlja prirodnije okruženje za inženjere unutar .NET ekosistema, dok istovremeno zadržava identične performanse treniranja.</w:t>
+        <w:t>) i predstavlja prirodnije okruženje za inženjere unutar .NET ekosistema.</w:t>
       </w:r>
     </w:p>
     <w:p>
@@ -6805,7 +6877,7 @@
       <w:pPr>
         <w:pStyle w:val="Heading2"/>
       </w:pPr>
-      <w:bookmarkStart w:id="8" w:name="_Toc234846023"/>
+      <w:bookmarkStart w:id="8" w:name="_Toc236486939"/>
       <w:r>
         <w:lastRenderedPageBreak/>
         <w:t>Metrike modela</w:t>
@@ -6827,7 +6899,7 @@
       <w:pPr>
         <w:pStyle w:val="Heading3"/>
       </w:pPr>
-      <w:bookmarkStart w:id="9" w:name="_Toc234846024"/>
+      <w:bookmarkStart w:id="9" w:name="_Toc236486940"/>
       <w:r>
         <w:t>Brzina treniranja</w:t>
       </w:r>
@@ -6863,7 +6935,7 @@
       <w:pPr>
         <w:pStyle w:val="Heading3"/>
       </w:pPr>
-      <w:bookmarkStart w:id="10" w:name="_Toc234846025"/>
+      <w:bookmarkStart w:id="10" w:name="_Toc236486941"/>
       <w:r>
         <w:t>Klasifikacijske metrike</w:t>
       </w:r>
@@ -6951,7 +7023,43 @@
         <w:t>)</w:t>
       </w:r>
       <w:r>
-        <w:t>. Za</w:t>
+        <w:t xml:space="preserve"> </w:t>
+      </w:r>
+      <w:sdt>
+        <w:sdtPr>
+          <w:id w:val="40718680"/>
+          <w:citation/>
+        </w:sdtPr>
+        <w:sdtContent>
+          <w:r>
+            <w:fldChar w:fldCharType="begin"/>
+          </w:r>
+          <w:r>
+            <w:rPr>
+              <w:lang w:val="en-US"/>
+            </w:rPr>
+            <w:instrText xml:space="preserve">CITATION DMW11 \l 1033 </w:instrText>
+          </w:r>
+          <w:r>
+            <w:fldChar w:fldCharType="separate"/>
+          </w:r>
+          <w:r>
+            <w:rPr>
+              <w:noProof/>
+              <w:lang w:val="en-US"/>
+            </w:rPr>
+            <w:t>[5]</w:t>
+          </w:r>
+          <w:r>
+            <w:fldChar w:fldCharType="end"/>
+          </w:r>
+        </w:sdtContent>
+      </w:sdt>
+      <w:r>
+        <w:t xml:space="preserve">. </w:t>
+      </w:r>
+      <w:r>
+        <w:t>Za</w:t>
       </w:r>
       <w:r>
         <w:t xml:space="preserve"> proračun</w:t>
@@ -7569,7 +7677,7 @@
       <w:pPr>
         <w:pStyle w:val="Heading3"/>
       </w:pPr>
-      <w:bookmarkStart w:id="11" w:name="_Toc234846026"/>
+      <w:bookmarkStart w:id="11" w:name="_Toc236486942"/>
       <w:r>
         <w:t>Metrike za više</w:t>
       </w:r>
@@ -7895,7 +8003,7 @@
         <w:t xml:space="preserve">Makro metrike tretiraju svaku klasu jednako, nezavisno od broja primjera u toj klasi. </w:t>
       </w:r>
       <w:r>
-        <w:t>Data metrika je vrlo korisnika za probleme u kojima postoji neravnoteža u broju primjera za različite klase.</w:t>
+        <w:t>Data metrika je vrlo korisna za probleme u kojima postoji neravnoteža u broju primjera za različite klase.</w:t>
       </w:r>
     </w:p>
     <w:p>
@@ -8852,7 +8960,7 @@
       <w:pPr>
         <w:pStyle w:val="Heading1"/>
       </w:pPr>
-      <w:bookmarkStart w:id="12" w:name="_Toc234846027"/>
+      <w:bookmarkStart w:id="12" w:name="_Toc236486943"/>
       <w:proofErr w:type="spellStart"/>
       <w:r>
         <w:lastRenderedPageBreak/>
@@ -8889,7 +8997,7 @@
       <w:pPr>
         <w:pStyle w:val="Heading2"/>
       </w:pPr>
-      <w:bookmarkStart w:id="13" w:name="_Toc234846028"/>
+      <w:bookmarkStart w:id="13" w:name="_Toc236486944"/>
       <w:r>
         <w:t>Korišteni skup podataka (</w:t>
       </w:r>
@@ -9141,6 +9249,102 @@
       <w:r>
         <w:t xml:space="preserve">ži CT snimke pacijenata sa rakom pluća u različitim fazama, kao i snimke zdravih pacijenata. </w:t>
       </w:r>
+      <w:sdt>
+        <w:sdtPr>
+          <w:id w:val="-506749159"/>
+          <w:citation/>
+        </w:sdtPr>
+        <w:sdtContent>
+          <w:r>
+            <w:fldChar w:fldCharType="begin"/>
+          </w:r>
+          <w:r>
+            <w:rPr>
+              <w:lang w:val="en-US"/>
+            </w:rPr>
+            <w:instrText xml:space="preserve">CITATION HFA20 \l 1033 </w:instrText>
+          </w:r>
+          <w:r>
+            <w:fldChar w:fldCharType="separate"/>
+          </w:r>
+          <w:r>
+            <w:rPr>
+              <w:noProof/>
+              <w:lang w:val="en-US"/>
+            </w:rPr>
+            <w:t>[6]</w:t>
+          </w:r>
+          <w:r>
+            <w:fldChar w:fldCharType="end"/>
+          </w:r>
+        </w:sdtContent>
+      </w:sdt>
+      <w:r>
+        <w:t xml:space="preserve"> </w:t>
+      </w:r>
+      <w:sdt>
+        <w:sdtPr>
+          <w:id w:val="2032301000"/>
+          <w:citation/>
+        </w:sdtPr>
+        <w:sdtContent>
+          <w:r>
+            <w:fldChar w:fldCharType="begin"/>
+          </w:r>
+          <w:r>
+            <w:rPr>
+              <w:lang w:val="en-US"/>
+            </w:rPr>
+            <w:instrText xml:space="preserve">CITATION HFK21 \l 1033 </w:instrText>
+          </w:r>
+          <w:r>
+            <w:fldChar w:fldCharType="separate"/>
+          </w:r>
+          <w:r>
+            <w:rPr>
+              <w:noProof/>
+              <w:lang w:val="en-US"/>
+            </w:rPr>
+            <w:t>[7]</w:t>
+          </w:r>
+          <w:r>
+            <w:fldChar w:fldCharType="end"/>
+          </w:r>
+        </w:sdtContent>
+      </w:sdt>
+      <w:r>
+        <w:t xml:space="preserve"> </w:t>
+      </w:r>
+      <w:sdt>
+        <w:sdtPr>
+          <w:id w:val="-564567242"/>
+          <w:citation/>
+        </w:sdtPr>
+        <w:sdtContent>
+          <w:r>
+            <w:fldChar w:fldCharType="begin"/>
+          </w:r>
+          <w:r>
+            <w:rPr>
+              <w:lang w:val="en-US"/>
+            </w:rPr>
+            <w:instrText xml:space="preserve">CITATION aly \l 1033 </w:instrText>
+          </w:r>
+          <w:r>
+            <w:fldChar w:fldCharType="separate"/>
+          </w:r>
+          <w:r>
+            <w:rPr>
+              <w:noProof/>
+              <w:lang w:val="en-US"/>
+            </w:rPr>
+            <w:t>[8]</w:t>
+          </w:r>
+          <w:r>
+            <w:fldChar w:fldCharType="end"/>
+          </w:r>
+        </w:sdtContent>
+      </w:sdt>
     </w:p>
     <w:p>
       <w:r>
@@ -9284,7 +9488,7 @@
       <w:pPr>
         <w:pStyle w:val="Heading2"/>
       </w:pPr>
-      <w:bookmarkStart w:id="14" w:name="_Toc234846029"/>
+      <w:bookmarkStart w:id="14" w:name="_Toc236486945"/>
       <w:r>
         <w:lastRenderedPageBreak/>
         <w:t>Preprocesiranje slika (</w:t>
@@ -9460,7 +9664,7 @@
       <w:pPr>
         <w:pStyle w:val="Heading2"/>
       </w:pPr>
-      <w:bookmarkStart w:id="15" w:name="_Toc234846030"/>
+      <w:bookmarkStart w:id="15" w:name="_Toc236486946"/>
       <w:r>
         <w:lastRenderedPageBreak/>
         <w:t>Razdvajanje podataka na skup za treniranje i validaciju</w:t>
@@ -9540,7 +9744,7 @@
       <w:pPr>
         <w:pStyle w:val="Heading2"/>
       </w:pPr>
-      <w:bookmarkStart w:id="16" w:name="_Toc234846031"/>
+      <w:bookmarkStart w:id="16" w:name="_Toc236486947"/>
       <w:r>
         <w:lastRenderedPageBreak/>
         <w:t xml:space="preserve">Dizajn i arhitektura CNN modela, </w:t>
@@ -11228,7 +11432,31 @@
         <w:rPr>
           <w:lang w:val="en-GB"/>
         </w:rPr>
-        <w:t xml:space="preserve"> 63x63. (</w:t>
+        <w:t xml:space="preserve"> 6</w:t>
+      </w:r>
+      <w:r>
+        <w:rPr>
+          <w:lang w:val="en-GB"/>
+        </w:rPr>
+        <w:t>2</w:t>
+      </w:r>
+      <w:r>
+        <w:rPr>
+          <w:lang w:val="en-GB"/>
+        </w:rPr>
+        <w:t>x6</w:t>
+      </w:r>
+      <w:r>
+        <w:rPr>
+          <w:lang w:val="en-GB"/>
+        </w:rPr>
+        <w:t>2</w:t>
+      </w:r>
+      <w:r>
+        <w:rPr>
+          <w:lang w:val="en-GB"/>
+        </w:rPr>
+        <w:t>. (</w:t>
       </w:r>
       <w:proofErr w:type="spellStart"/>
       <w:r>
@@ -11368,7 +11596,19 @@
         <w:rPr>
           <w:lang w:val="en-GB"/>
         </w:rPr>
-        <w:t xml:space="preserve"> 63.5 </w:t>
+        <w:t xml:space="preserve"> 6</w:t>
+      </w:r>
+      <w:r>
+        <w:rPr>
+          <w:lang w:val="en-GB"/>
+        </w:rPr>
+        <w:t>2</w:t>
+      </w:r>
+      <w:r>
+        <w:rPr>
+          <w:lang w:val="en-GB"/>
+        </w:rPr>
+        <w:t xml:space="preserve">.5 </w:t>
       </w:r>
       <w:proofErr w:type="spellStart"/>
       <w:r>
@@ -11382,7 +11622,19 @@
         <w:rPr>
           <w:lang w:val="en-GB"/>
         </w:rPr>
-        <w:t xml:space="preserve"> 63).</w:t>
+        <w:t xml:space="preserve"> 6</w:t>
+      </w:r>
+      <w:r>
+        <w:rPr>
+          <w:lang w:val="en-GB"/>
+        </w:rPr>
+        <w:t>2</w:t>
+      </w:r>
+      <w:r>
+        <w:rPr>
+          <w:lang w:val="en-GB"/>
+        </w:rPr>
+        <w:t>).</w:t>
       </w:r>
     </w:p>
     <w:p>
@@ -11587,7 +11839,44 @@
         <w:rPr>
           <w:lang w:val="en-GB"/>
         </w:rPr>
-        <w:t xml:space="preserve"> 63x63x64 = 254016 </w:t>
+        <w:t xml:space="preserve"> 6</w:t>
+      </w:r>
+      <w:r>
+        <w:rPr>
+          <w:lang w:val="en-GB"/>
+        </w:rPr>
+        <w:t>2</w:t>
+      </w:r>
+      <w:r>
+        <w:rPr>
+          <w:lang w:val="en-GB"/>
+        </w:rPr>
+        <w:t>x6</w:t>
+      </w:r>
+      <w:r>
+        <w:rPr>
+          <w:lang w:val="en-GB"/>
+        </w:rPr>
+        <w:t>2</w:t>
+      </w:r>
+      <w:r>
+        <w:rPr>
+          <w:lang w:val="en-GB"/>
+        </w:rPr>
+        <w:t xml:space="preserve">x64 = </w:t>
+      </w:r>
+      <w:proofErr w:type="gramStart"/>
+      <w:r>
+        <w:rPr>
+          <w:lang w:val="en-GB"/>
+        </w:rPr>
+        <w:t xml:space="preserve">246016 </w:t>
+      </w:r>
+      <w:r>
+        <w:rPr>
+          <w:lang w:val="en-GB"/>
+        </w:rPr>
+        <w:t xml:space="preserve"> </w:t>
       </w:r>
       <w:proofErr w:type="spellStart"/>
       <w:r>
@@ -11597,6 +11886,7 @@
         <w:t>vrijednosti</w:t>
       </w:r>
       <w:proofErr w:type="spellEnd"/>
+      <w:proofErr w:type="gramEnd"/>
       <w:r>
         <w:rPr>
           <w:lang w:val="en-GB"/>
@@ -11903,235 +12193,290 @@
         </w:rPr>
         <w:t xml:space="preserve"> </w:t>
       </w:r>
-      <w:hyperlink r:id="rId18" w:history="1">
-        <w:proofErr w:type="spellStart"/>
-        <w:r>
+      <w:proofErr w:type="spellStart"/>
+      <w:r>
+        <w:rPr>
+          <w:lang w:val="en-GB"/>
+        </w:rPr>
+        <w:t>praktičnom</w:t>
+      </w:r>
+      <w:proofErr w:type="spellEnd"/>
+      <w:r>
+        <w:rPr>
+          <w:lang w:val="en-GB"/>
+        </w:rPr>
+        <w:t xml:space="preserve"> </w:t>
+      </w:r>
+      <w:proofErr w:type="spellStart"/>
+      <w:r>
+        <w:rPr>
+          <w:lang w:val="en-GB"/>
+        </w:rPr>
+        <w:t>pr</w:t>
+      </w:r>
+      <w:r>
+        <w:rPr>
+          <w:lang w:val="en-GB"/>
+        </w:rPr>
+        <w:t>i</w:t>
+      </w:r>
+      <w:r>
+        <w:rPr>
+          <w:lang w:val="en-GB"/>
+        </w:rPr>
+        <w:t>mjeru</w:t>
+      </w:r>
+      <w:proofErr w:type="spellEnd"/>
+      <w:r>
+        <w:rPr>
+          <w:lang w:val="en-GB"/>
+        </w:rPr>
+        <w:t xml:space="preserve"> </w:t>
+      </w:r>
+      <w:proofErr w:type="spellStart"/>
+      <w:r>
+        <w:rPr>
+          <w:lang w:val="en-GB"/>
+        </w:rPr>
+        <w:t>sa</w:t>
+      </w:r>
+      <w:proofErr w:type="spellEnd"/>
+      <w:r>
+        <w:rPr>
+          <w:lang w:val="en-GB"/>
+        </w:rPr>
+        <w:t xml:space="preserve"> </w:t>
+      </w:r>
+      <w:proofErr w:type="spellStart"/>
+      <w:r>
+        <w:rPr>
+          <w:lang w:val="en-GB"/>
+        </w:rPr>
+        <w:t>platforme</w:t>
+      </w:r>
+      <w:proofErr w:type="spellEnd"/>
+      <w:r>
+        <w:rPr>
+          <w:lang w:val="en-GB"/>
+        </w:rPr>
+        <w:t xml:space="preserve"> Kaggle, </w:t>
+      </w:r>
+      <w:proofErr w:type="spellStart"/>
+      <w:r>
+        <w:rPr>
+          <w:lang w:val="en-GB"/>
+        </w:rPr>
+        <w:t>gdje</w:t>
+      </w:r>
+      <w:proofErr w:type="spellEnd"/>
+      <w:r>
+        <w:rPr>
+          <w:lang w:val="en-GB"/>
+        </w:rPr>
+        <w:t xml:space="preserve"> je </w:t>
+      </w:r>
+      <w:proofErr w:type="spellStart"/>
+      <w:r>
+        <w:rPr>
+          <w:lang w:val="en-GB"/>
+        </w:rPr>
+        <w:t>slična</w:t>
+      </w:r>
+      <w:proofErr w:type="spellEnd"/>
+      <w:r>
+        <w:rPr>
+          <w:lang w:val="en-GB"/>
+        </w:rPr>
+        <w:t xml:space="preserve"> </w:t>
+      </w:r>
+      <w:proofErr w:type="spellStart"/>
+      <w:r>
+        <w:rPr>
+          <w:lang w:val="en-GB"/>
+        </w:rPr>
+        <w:t>topologija</w:t>
+      </w:r>
+      <w:proofErr w:type="spellEnd"/>
+      <w:r>
+        <w:rPr>
+          <w:lang w:val="en-GB"/>
+        </w:rPr>
+        <w:t xml:space="preserve"> </w:t>
+      </w:r>
+      <w:proofErr w:type="spellStart"/>
+      <w:r>
+        <w:rPr>
+          <w:lang w:val="en-GB"/>
+        </w:rPr>
+        <w:t>uspješno</w:t>
+      </w:r>
+      <w:proofErr w:type="spellEnd"/>
+      <w:r>
+        <w:rPr>
+          <w:lang w:val="en-GB"/>
+        </w:rPr>
+        <w:t xml:space="preserve"> </w:t>
+      </w:r>
+      <w:proofErr w:type="spellStart"/>
+      <w:r>
+        <w:rPr>
+          <w:lang w:val="en-GB"/>
+        </w:rPr>
+        <w:t>korištena</w:t>
+      </w:r>
+      <w:proofErr w:type="spellEnd"/>
+      <w:r>
+        <w:rPr>
+          <w:lang w:val="en-GB"/>
+        </w:rPr>
+        <w:t xml:space="preserve"> </w:t>
+      </w:r>
+      <w:proofErr w:type="spellStart"/>
+      <w:r>
+        <w:rPr>
+          <w:lang w:val="en-GB"/>
+        </w:rPr>
+        <w:t>upravo</w:t>
+      </w:r>
+      <w:proofErr w:type="spellEnd"/>
+      <w:r>
+        <w:rPr>
+          <w:lang w:val="en-GB"/>
+        </w:rPr>
+        <w:t xml:space="preserve"> za problem </w:t>
+      </w:r>
+      <w:proofErr w:type="spellStart"/>
+      <w:r>
+        <w:rPr>
+          <w:lang w:val="en-GB"/>
+        </w:rPr>
+        <w:t>predikcije</w:t>
+      </w:r>
+      <w:proofErr w:type="spellEnd"/>
+      <w:r>
+        <w:rPr>
+          <w:lang w:val="en-GB"/>
+        </w:rPr>
+        <w:t xml:space="preserve"> </w:t>
+      </w:r>
+      <w:proofErr w:type="spellStart"/>
+      <w:r>
+        <w:rPr>
+          <w:lang w:val="en-GB"/>
+        </w:rPr>
+        <w:t>raka</w:t>
+      </w:r>
+      <w:proofErr w:type="spellEnd"/>
+      <w:r>
+        <w:rPr>
+          <w:lang w:val="en-GB"/>
+        </w:rPr>
+        <w:t xml:space="preserve"> </w:t>
+      </w:r>
+      <w:proofErr w:type="spellStart"/>
+      <w:r>
+        <w:rPr>
+          <w:lang w:val="en-GB"/>
+        </w:rPr>
+        <w:t>pluća</w:t>
+      </w:r>
+      <w:proofErr w:type="spellEnd"/>
+      <w:r>
+        <w:rPr>
+          <w:lang w:val="en-GB"/>
+        </w:rPr>
+        <w:t xml:space="preserve"> </w:t>
+      </w:r>
+      <w:proofErr w:type="spellStart"/>
+      <w:r>
+        <w:rPr>
+          <w:lang w:val="en-GB"/>
+        </w:rPr>
+        <w:t>korištenim</w:t>
+      </w:r>
+      <w:proofErr w:type="spellEnd"/>
+      <w:r>
+        <w:rPr>
+          <w:lang w:val="en-GB"/>
+        </w:rPr>
+        <w:t xml:space="preserve"> </w:t>
+      </w:r>
+      <w:proofErr w:type="spellStart"/>
+      <w:r>
+        <w:rPr>
+          <w:lang w:val="en-GB"/>
+        </w:rPr>
+        <w:t>skupom</w:t>
+      </w:r>
+      <w:proofErr w:type="spellEnd"/>
+      <w:r>
+        <w:rPr>
+          <w:lang w:val="en-GB"/>
+        </w:rPr>
+        <w:t xml:space="preserve"> </w:t>
+      </w:r>
+      <w:proofErr w:type="spellStart"/>
+      <w:r>
+        <w:rPr>
+          <w:lang w:val="en-GB"/>
+        </w:rPr>
+        <w:t>podataka</w:t>
+      </w:r>
+      <w:proofErr w:type="spellEnd"/>
+      <w:r>
+        <w:rPr>
+          <w:lang w:val="en-GB"/>
+        </w:rPr>
+        <w:t>.</w:t>
+      </w:r>
+      <w:r>
+        <w:rPr>
+          <w:lang w:val="en-GB"/>
+        </w:rPr>
+        <w:t xml:space="preserve"> </w:t>
+      </w:r>
+      <w:sdt>
+        <w:sdtPr>
           <w:rPr>
-            <w:rStyle w:val="Hyperlink"/>
             <w:lang w:val="en-GB"/>
           </w:rPr>
-          <w:t>praktičnom</w:t>
-        </w:r>
-        <w:proofErr w:type="spellEnd"/>
-        <w:r>
-          <w:rPr>
-            <w:rStyle w:val="Hyperlink"/>
-            <w:lang w:val="en-GB"/>
-          </w:rPr>
-          <w:t xml:space="preserve"> </w:t>
-        </w:r>
-        <w:proofErr w:type="spellStart"/>
-        <w:r>
-          <w:rPr>
-            <w:rStyle w:val="Hyperlink"/>
-            <w:lang w:val="en-GB"/>
-          </w:rPr>
-          <w:t>primjeru</w:t>
-        </w:r>
-        <w:proofErr w:type="spellEnd"/>
-      </w:hyperlink>
-      <w:r>
-        <w:rPr>
-          <w:lang w:val="en-GB"/>
-        </w:rPr>
-        <w:t xml:space="preserve"> </w:t>
-      </w:r>
-      <w:proofErr w:type="spellStart"/>
-      <w:r>
-        <w:rPr>
-          <w:lang w:val="en-GB"/>
-        </w:rPr>
-        <w:t>sa</w:t>
-      </w:r>
-      <w:proofErr w:type="spellEnd"/>
-      <w:r>
-        <w:rPr>
-          <w:lang w:val="en-GB"/>
-        </w:rPr>
-        <w:t xml:space="preserve"> </w:t>
-      </w:r>
-      <w:proofErr w:type="spellStart"/>
-      <w:r>
-        <w:rPr>
-          <w:lang w:val="en-GB"/>
-        </w:rPr>
-        <w:t>platforme</w:t>
-      </w:r>
-      <w:proofErr w:type="spellEnd"/>
-      <w:r>
-        <w:rPr>
-          <w:lang w:val="en-GB"/>
-        </w:rPr>
-        <w:t xml:space="preserve"> Kaggle, </w:t>
-      </w:r>
-      <w:proofErr w:type="spellStart"/>
-      <w:r>
-        <w:rPr>
-          <w:lang w:val="en-GB"/>
-        </w:rPr>
-        <w:t>gdje</w:t>
-      </w:r>
-      <w:proofErr w:type="spellEnd"/>
-      <w:r>
-        <w:rPr>
-          <w:lang w:val="en-GB"/>
-        </w:rPr>
-        <w:t xml:space="preserve"> je </w:t>
-      </w:r>
-      <w:proofErr w:type="spellStart"/>
-      <w:r>
-        <w:rPr>
-          <w:lang w:val="en-GB"/>
-        </w:rPr>
-        <w:t>slična</w:t>
-      </w:r>
-      <w:proofErr w:type="spellEnd"/>
-      <w:r>
-        <w:rPr>
-          <w:lang w:val="en-GB"/>
-        </w:rPr>
-        <w:t xml:space="preserve"> </w:t>
-      </w:r>
-      <w:proofErr w:type="spellStart"/>
-      <w:r>
-        <w:rPr>
-          <w:lang w:val="en-GB"/>
-        </w:rPr>
-        <w:t>topologija</w:t>
-      </w:r>
-      <w:proofErr w:type="spellEnd"/>
-      <w:r>
-        <w:rPr>
-          <w:lang w:val="en-GB"/>
-        </w:rPr>
-        <w:t xml:space="preserve"> </w:t>
-      </w:r>
-      <w:proofErr w:type="spellStart"/>
-      <w:r>
-        <w:rPr>
-          <w:lang w:val="en-GB"/>
-        </w:rPr>
-        <w:t>uspješno</w:t>
-      </w:r>
-      <w:proofErr w:type="spellEnd"/>
-      <w:r>
-        <w:rPr>
-          <w:lang w:val="en-GB"/>
-        </w:rPr>
-        <w:t xml:space="preserve"> </w:t>
-      </w:r>
-      <w:proofErr w:type="spellStart"/>
-      <w:r>
-        <w:rPr>
-          <w:lang w:val="en-GB"/>
-        </w:rPr>
-        <w:t>korištena</w:t>
-      </w:r>
-      <w:proofErr w:type="spellEnd"/>
-      <w:r>
-        <w:rPr>
-          <w:lang w:val="en-GB"/>
-        </w:rPr>
-        <w:t xml:space="preserve"> </w:t>
-      </w:r>
-      <w:proofErr w:type="spellStart"/>
-      <w:r>
-        <w:rPr>
-          <w:lang w:val="en-GB"/>
-        </w:rPr>
-        <w:t>upravo</w:t>
-      </w:r>
-      <w:proofErr w:type="spellEnd"/>
-      <w:r>
-        <w:rPr>
-          <w:lang w:val="en-GB"/>
-        </w:rPr>
-        <w:t xml:space="preserve"> za problem </w:t>
-      </w:r>
-      <w:proofErr w:type="spellStart"/>
-      <w:r>
-        <w:rPr>
-          <w:lang w:val="en-GB"/>
-        </w:rPr>
-        <w:t>predikcije</w:t>
-      </w:r>
-      <w:proofErr w:type="spellEnd"/>
-      <w:r>
-        <w:rPr>
-          <w:lang w:val="en-GB"/>
-        </w:rPr>
-        <w:t xml:space="preserve"> </w:t>
-      </w:r>
-      <w:proofErr w:type="spellStart"/>
-      <w:r>
-        <w:rPr>
-          <w:lang w:val="en-GB"/>
-        </w:rPr>
-        <w:t>raka</w:t>
-      </w:r>
-      <w:proofErr w:type="spellEnd"/>
-      <w:r>
-        <w:rPr>
-          <w:lang w:val="en-GB"/>
-        </w:rPr>
-        <w:t xml:space="preserve"> </w:t>
-      </w:r>
-      <w:proofErr w:type="spellStart"/>
-      <w:r>
-        <w:rPr>
-          <w:lang w:val="en-GB"/>
-        </w:rPr>
-        <w:t>pluća</w:t>
-      </w:r>
-      <w:proofErr w:type="spellEnd"/>
-      <w:r>
-        <w:rPr>
-          <w:lang w:val="en-GB"/>
-        </w:rPr>
-        <w:t xml:space="preserve"> </w:t>
-      </w:r>
-      <w:proofErr w:type="spellStart"/>
-      <w:r>
-        <w:rPr>
-          <w:lang w:val="en-GB"/>
-        </w:rPr>
-        <w:t>korištenim</w:t>
-      </w:r>
-      <w:proofErr w:type="spellEnd"/>
-      <w:r>
-        <w:rPr>
-          <w:lang w:val="en-GB"/>
-        </w:rPr>
-        <w:t xml:space="preserve"> </w:t>
-      </w:r>
-      <w:proofErr w:type="spellStart"/>
-      <w:r>
-        <w:rPr>
-          <w:lang w:val="en-GB"/>
-        </w:rPr>
-        <w:t>skupom</w:t>
-      </w:r>
-      <w:proofErr w:type="spellEnd"/>
-      <w:r>
-        <w:rPr>
-          <w:lang w:val="en-GB"/>
-        </w:rPr>
-        <w:t xml:space="preserve"> </w:t>
-      </w:r>
-      <w:proofErr w:type="spellStart"/>
-      <w:r>
-        <w:rPr>
-          <w:lang w:val="en-GB"/>
-        </w:rPr>
-        <w:t>podataka</w:t>
-      </w:r>
-      <w:proofErr w:type="spellEnd"/>
-      <w:r>
-        <w:rPr>
-          <w:lang w:val="en-GB"/>
-        </w:rPr>
-        <w:t>.</w:t>
-      </w:r>
+          <w:id w:val="-1401134635"/>
+          <w:citation/>
+        </w:sdtPr>
+        <w:sdtContent>
+          <w:r>
+            <w:rPr>
+              <w:lang w:val="en-GB"/>
+            </w:rPr>
+            <w:fldChar w:fldCharType="begin"/>
+          </w:r>
+          <w:r>
+            <w:rPr>
+              <w:lang w:val="en-US"/>
+            </w:rPr>
+            <w:instrText xml:space="preserve"> CITATION Adi19 \l 1033 </w:instrText>
+          </w:r>
+          <w:r>
+            <w:rPr>
+              <w:lang w:val="en-GB"/>
+            </w:rPr>
+            <w:fldChar w:fldCharType="separate"/>
+          </w:r>
+          <w:r>
+            <w:rPr>
+              <w:noProof/>
+              <w:lang w:val="en-US"/>
+            </w:rPr>
+            <w:t>[9]</w:t>
+          </w:r>
+          <w:r>
+            <w:rPr>
+              <w:lang w:val="en-GB"/>
+            </w:rPr>
+            <w:fldChar w:fldCharType="end"/>
+          </w:r>
+        </w:sdtContent>
+      </w:sdt>
     </w:p>
     <w:p>
       <w:pPr>
@@ -14048,6 +14393,48 @@
         </w:rPr>
         <w:t xml:space="preserve">. </w:t>
       </w:r>
+      <w:sdt>
+        <w:sdtPr>
+          <w:rPr>
+            <w:lang w:val="en-US"/>
+          </w:rPr>
+          <w:id w:val="-1055079558"/>
+          <w:citation/>
+        </w:sdtPr>
+        <w:sdtContent>
+          <w:r>
+            <w:rPr>
+              <w:lang w:val="en-US"/>
+            </w:rPr>
+            <w:fldChar w:fldCharType="begin"/>
+          </w:r>
+          <w:r>
+            <w:rPr>
+              <w:lang w:val="en-US"/>
+            </w:rPr>
+            <w:instrText xml:space="preserve">CITATION Die15 \l 1033 </w:instrText>
+          </w:r>
+          <w:r>
+            <w:rPr>
+              <w:lang w:val="en-US"/>
+            </w:rPr>
+            <w:fldChar w:fldCharType="separate"/>
+          </w:r>
+          <w:r>
+            <w:rPr>
+              <w:noProof/>
+              <w:lang w:val="en-US"/>
+            </w:rPr>
+            <w:t>[10]</w:t>
+          </w:r>
+          <w:r>
+            <w:rPr>
+              <w:lang w:val="en-US"/>
+            </w:rPr>
+            <w:fldChar w:fldCharType="end"/>
+          </w:r>
+        </w:sdtContent>
+      </w:sdt>
     </w:p>
     <w:p>
       <w:r>
@@ -14148,7 +14535,7 @@
       <w:pPr>
         <w:pStyle w:val="Heading2"/>
       </w:pPr>
-      <w:bookmarkStart w:id="17" w:name="_Toc234846032"/>
+      <w:bookmarkStart w:id="17" w:name="_Toc236486948"/>
       <w:r>
         <w:lastRenderedPageBreak/>
         <w:t>Broj epoha i veličina serije</w:t>
@@ -14324,7 +14711,7 @@
       <w:pPr>
         <w:pStyle w:val="Heading2"/>
       </w:pPr>
-      <w:bookmarkStart w:id="18" w:name="_Toc234846033"/>
+      <w:bookmarkStart w:id="18" w:name="_Toc236486949"/>
       <w:r>
         <w:lastRenderedPageBreak/>
         <w:t>Orkestracija i .NET Aspire</w:t>
@@ -14419,7 +14806,7 @@
       <w:pPr>
         <w:pStyle w:val="Heading2"/>
       </w:pPr>
-      <w:bookmarkStart w:id="19" w:name="_Toc234846034"/>
+      <w:bookmarkStart w:id="19" w:name="_Toc236486950"/>
       <w:r>
         <w:lastRenderedPageBreak/>
         <w:t>Korisnički</w:t>
@@ -14482,7 +14869,7 @@
                     <pic:cNvPicPr/>
                   </pic:nvPicPr>
                   <pic:blipFill>
-                    <a:blip r:embed="rId19">
+                    <a:blip r:embed="rId18">
                       <a:extLst>
                         <a:ext uri="{28A0092B-C50C-407E-A947-70E740481C1C}">
                           <a14:useLocalDpi xmlns:a14="http://schemas.microsoft.com/office/drawing/2010/main" val="0"/>
@@ -14548,7 +14935,13 @@
     </w:p>
     <w:p>
       <w:r>
-        <w:t>Druga stranica služi za treniranje modela, kao što je prikazano na Slici 2. Na datoj stranici korisnik ima opciju unosa imena modela, odabira ekosistema u kojem će se model trenirati i mogućnost rotiranja slika.</w:t>
+        <w:t xml:space="preserve">Druga stranica služi za treniranje modela, kao što je prikazano na Slici 2. Na datoj stranici korisnik ima opciju unosa imena modela, </w:t>
+      </w:r>
+      <w:r>
+        <w:t xml:space="preserve">broja epoha, </w:t>
+      </w:r>
+      <w:r>
+        <w:t>odabira ekosistema u kojem će se model trenirati i mogućnost rotiranja slika.</w:t>
       </w:r>
     </w:p>
     <w:p>
@@ -14576,7 +14969,7 @@
                     <pic:cNvPicPr/>
                   </pic:nvPicPr>
                   <pic:blipFill>
-                    <a:blip r:embed="rId20">
+                    <a:blip r:embed="rId19">
                       <a:extLst>
                         <a:ext uri="{28A0092B-C50C-407E-A947-70E740481C1C}">
                           <a14:useLocalDpi xmlns:a14="http://schemas.microsoft.com/office/drawing/2010/main" val="0"/>
@@ -14672,7 +15065,7 @@
                     <pic:cNvPicPr/>
                   </pic:nvPicPr>
                   <pic:blipFill>
-                    <a:blip r:embed="rId21" cstate="print">
+                    <a:blip r:embed="rId20" cstate="print">
                       <a:extLst>
                         <a:ext uri="{28A0092B-C50C-407E-A947-70E740481C1C}">
                           <a14:useLocalDpi xmlns:a14="http://schemas.microsoft.com/office/drawing/2010/main" val="0"/>
@@ -14767,7 +15160,7 @@
                     <pic:cNvPicPr/>
                   </pic:nvPicPr>
                   <pic:blipFill>
-                    <a:blip r:embed="rId22" cstate="print">
+                    <a:blip r:embed="rId21" cstate="print">
                       <a:extLst>
                         <a:ext uri="{28A0092B-C50C-407E-A947-70E740481C1C}">
                           <a14:useLocalDpi xmlns:a14="http://schemas.microsoft.com/office/drawing/2010/main" val="0"/>
@@ -14869,7 +15262,7 @@
                     <pic:cNvPicPr/>
                   </pic:nvPicPr>
                   <pic:blipFill>
-                    <a:blip r:embed="rId23">
+                    <a:blip r:embed="rId22">
                       <a:extLst>
                         <a:ext uri="{28A0092B-C50C-407E-A947-70E740481C1C}">
                           <a14:useLocalDpi xmlns:a14="http://schemas.microsoft.com/office/drawing/2010/main" val="0"/>
@@ -14959,7 +15352,7 @@
       <w:pPr>
         <w:pStyle w:val="Heading2"/>
       </w:pPr>
-      <w:bookmarkStart w:id="25" w:name="_Toc234846035"/>
+      <w:bookmarkStart w:id="25" w:name="_Toc236486951"/>
       <w:r>
         <w:lastRenderedPageBreak/>
         <w:t>Metodologija testiranja i kontrola varijabli</w:t>
@@ -14997,9 +15390,6 @@
         <w:pStyle w:val="ListParagraph"/>
       </w:pPr>
       <w:r>
-        <w:t xml:space="preserve"> </w:t>
-      </w:r>
-      <w:r>
         <w:t>Za validno poređenje korištene su identične verzije LibTorch i CUDA biblioteka, koje predstavljaju C++ mehanizam odgovoran za proces treniranja mreže i izvršavanje paralelnih tenzorskih operacija. Korištena verzija LibTorch biblioteke je 2.10.0 (Pytorch verzija 2.10.0 za Python i TorchSharp-cuda-windows 0.107.0 za .NET), dok je korištena CUDA verzija 12.8.</w:t>
       </w:r>
     </w:p>
@@ -15088,19 +15478,31 @@
         <w:rPr>
           <w:lang w:val="de-DE"/>
         </w:rPr>
-        <w:t xml:space="preserve">S obzirom da hiperparametri direktno diktiraju način učenja i tačnost krajnjeg modela, u oba okruženja je implementirana ista arhitektura </w:t>
+        <w:t xml:space="preserve">S obzirom </w:t>
       </w:r>
       <w:r>
         <w:rPr>
           <w:lang w:val="de-DE"/>
         </w:rPr>
+        <w:t>na to da</w:t>
+      </w:r>
+      <w:r>
+        <w:rPr>
+          <w:lang w:val="de-DE"/>
+        </w:rPr>
+        <w:t xml:space="preserve"> hiperparametri direktno diktiraju način učenja i tačnost krajnjeg modela, u oba okruženja je implementirana ista arhitektura </w:t>
+      </w:r>
+      <w:r>
+        <w:rPr>
+          <w:lang w:val="de-DE"/>
+        </w:rPr>
         <w:t>neuronske</w:t>
       </w:r>
       <w:r>
         <w:rPr>
           <w:lang w:val="de-DE"/>
         </w:rPr>
-        <w:t xml:space="preserve"> mreže sa preslikanim parametrima. To uključuje korištenje iste funkcije troška (Cross-Entropy Loss), istog optimizatora (Adam) sa stopom učenja (0.00001), isti broj epoha (100) te identičnu veličinu serije (8).</w:t>
+        <w:t xml:space="preserve"> mreže sa preslikanim parametrima. To uključuje korištenje iste funkcije troška (Cross-Entropy Loss), istog optimizatora (Adam) sa stopom učenja (0.0001), isti broj epoha (100) te identičnu veličinu serije (8).</w:t>
       </w:r>
     </w:p>
     <w:p>
@@ -16114,7 +16516,55 @@
         <w:rPr>
           <w:lang w:val="de-DE"/>
         </w:rPr>
-        <w:t>Iako su početni parametri fiksirani, sam proces treniranja je veoma kompleksan i može doći do varijacije prilikom istovremenog izvršavanja operacija na grafičkoj kartici. Da bismo imali što objektivniju sliku treniranja, proces treniranja je pokrenut u pet nezavisnih iteracija u oba okruženja. Rezultati i metrike prikazani u ovom radu predstavljaju usrednjene (prosječne) vrijednosti dobijene iz tih iteracija, što garantuje visoku pouzdanost zaključka.</w:t>
+        <w:t xml:space="preserve">Iako su početni parametri fiksirani, sam proces treniranja je veoma kompleksan i može doći do varijacije prilikom istovremenog izvršavanja operacija na grafičkoj kartici. Da bismo imali što objektivniju sliku treniranja, proces treniranja je pokrenut u </w:t>
+      </w:r>
+      <w:r>
+        <w:rPr>
+          <w:lang w:val="de-DE"/>
+        </w:rPr>
+        <w:t>tri</w:t>
+      </w:r>
+      <w:r>
+        <w:rPr>
+          <w:lang w:val="de-DE"/>
+        </w:rPr>
+        <w:t xml:space="preserve"> nezavisn</w:t>
+      </w:r>
+      <w:r>
+        <w:rPr>
+          <w:lang w:val="de-DE"/>
+        </w:rPr>
+        <w:t>e</w:t>
+      </w:r>
+      <w:r>
+        <w:rPr>
+          <w:lang w:val="de-DE"/>
+        </w:rPr>
+        <w:t xml:space="preserve"> iteracij</w:t>
+      </w:r>
+      <w:r>
+        <w:rPr>
+          <w:lang w:val="de-DE"/>
+        </w:rPr>
+        <w:t xml:space="preserve">e </w:t>
+      </w:r>
+      <w:r>
+        <w:rPr>
+          <w:lang w:val="de-DE"/>
+        </w:rPr>
+        <w:t>u oba okruženja. Rezultati i metrike prikazani u ovom radu predstavljaju</w:t>
+      </w:r>
+      <w:r>
+        <w:rPr>
+          <w:lang w:val="de-DE"/>
+        </w:rPr>
+        <w:t xml:space="preserve"> </w:t>
+      </w:r>
+      <w:r>
+        <w:rPr>
+          <w:lang w:val="de-DE"/>
+        </w:rPr>
+        <w:t>prosječne vrijednosti dobijene iz tih iteracija, što garantuje visoku pouzdanost zaključka.</w:t>
       </w:r>
     </w:p>
     <w:p>
@@ -16346,7 +16796,7 @@
       <w:pPr>
         <w:pStyle w:val="Heading1"/>
       </w:pPr>
-      <w:bookmarkStart w:id="26" w:name="_Toc234846036"/>
+      <w:bookmarkStart w:id="26" w:name="_Toc236486952"/>
       <w:proofErr w:type="spellStart"/>
       <w:r>
         <w:lastRenderedPageBreak/>
@@ -16415,7 +16865,7 @@
           <w:lang w:val="bs-Latn-BA"/>
         </w:rPr>
       </w:pPr>
-      <w:bookmarkStart w:id="27" w:name="_Toc234846037"/>
+      <w:bookmarkStart w:id="27" w:name="_Toc236486953"/>
       <w:r>
         <w:rPr>
           <w:lang w:val="bs-Latn-BA"/>
@@ -16749,7 +17199,7 @@
           <w:lang w:val="bs-Latn-BA"/>
         </w:rPr>
       </w:pPr>
-      <w:bookmarkStart w:id="28" w:name="_Toc234846038"/>
+      <w:bookmarkStart w:id="28" w:name="_Toc236486954"/>
       <w:r>
         <w:rPr>
           <w:lang w:val="bs-Latn-BA"/>
@@ -16785,7 +17235,13 @@
         <w:t>old start</w:t>
       </w:r>
       <w:r>
-        <w:t>). Nakon prvog pokretanja model je učitan u memoriju te je svaka naredna analiza puno brža, tako da svaka naredna analiza traje 0 sekundi.</w:t>
+        <w:t xml:space="preserve">). Nakon prvog pokretanja model je učitan u memoriju te je svaka naredna analiza puno brža, tako da svaka naredna analiza traje </w:t>
+      </w:r>
+      <w:r>
+        <w:t xml:space="preserve">praktično </w:t>
+      </w:r>
+      <w:r>
+        <w:t>0 sekundi.</w:t>
       </w:r>
     </w:p>
     <w:p>
@@ -16805,7 +17261,7 @@
       <w:pPr>
         <w:pStyle w:val="Heading2"/>
       </w:pPr>
-      <w:bookmarkStart w:id="29" w:name="_Toc234846039"/>
+      <w:bookmarkStart w:id="29" w:name="_Toc236486955"/>
       <w:r>
         <w:lastRenderedPageBreak/>
         <w:t>Makro odziv</w:t>
@@ -17023,7 +17479,7 @@
                     <pic:cNvPicPr/>
                   </pic:nvPicPr>
                   <pic:blipFill>
-                    <a:blip r:embed="rId24"/>
+                    <a:blip r:embed="rId23"/>
                     <a:stretch>
                       <a:fillRect/>
                     </a:stretch>
@@ -17108,7 +17564,7 @@
       <w:pPr>
         <w:pStyle w:val="Heading2"/>
       </w:pPr>
-      <w:bookmarkStart w:id="32" w:name="_Toc234846040"/>
+      <w:bookmarkStart w:id="32" w:name="_Toc236486956"/>
       <w:r>
         <w:lastRenderedPageBreak/>
         <w:t>Makro F1 mjera</w:t>
@@ -17382,7 +17838,7 @@
                     <pic:cNvPicPr/>
                   </pic:nvPicPr>
                   <pic:blipFill>
-                    <a:blip r:embed="rId25"/>
+                    <a:blip r:embed="rId24"/>
                     <a:stretch>
                       <a:fillRect/>
                     </a:stretch>
@@ -17476,7 +17932,7 @@
       <w:pPr>
         <w:pStyle w:val="Heading2"/>
       </w:pPr>
-      <w:bookmarkStart w:id="34" w:name="_Toc234846041"/>
+      <w:bookmarkStart w:id="34" w:name="_Toc236486957"/>
       <w:r>
         <w:lastRenderedPageBreak/>
         <w:t>Odziv maligne klase</w:t>
@@ -17564,7 +18020,10 @@
         <w:t>,</w:t>
       </w:r>
       <w:r>
-        <w:t>91%.</w:t>
+        <w:t>82</w:t>
+      </w:r>
+      <w:r>
+        <w:t>%.</w:t>
       </w:r>
     </w:p>
     <w:p>
@@ -17698,6 +18157,402 @@
             <wp:extent cx="5943600" cy="2330450"/>
             <wp:effectExtent l="19050" t="19050" r="0" b="0"/>
             <wp:docPr id="11" name="Picture 11"/>
+            <wp:cNvGraphicFramePr>
+              <a:graphicFrameLocks xmlns:a="http://schemas.openxmlformats.org/drawingml/2006/main" noChangeAspect="1"/>
+            </wp:cNvGraphicFramePr>
+            <a:graphic xmlns:a="http://schemas.openxmlformats.org/drawingml/2006/main">
+              <a:graphicData uri="http://schemas.openxmlformats.org/drawingml/2006/picture">
+                <pic:pic xmlns:pic="http://schemas.openxmlformats.org/drawingml/2006/picture">
+                  <pic:nvPicPr>
+                    <pic:cNvPr id="1" name=""/>
+                    <pic:cNvPicPr/>
+                  </pic:nvPicPr>
+                  <pic:blipFill>
+                    <a:blip r:embed="rId25"/>
+                    <a:stretch>
+                      <a:fillRect/>
+                    </a:stretch>
+                  </pic:blipFill>
+                  <pic:spPr>
+                    <a:xfrm>
+                      <a:off x="0" y="0"/>
+                      <a:ext cx="5943600" cy="2330450"/>
+                    </a:xfrm>
+                    <a:prstGeom prst="rect">
+                      <a:avLst/>
+                    </a:prstGeom>
+                    <a:ln w="6350">
+                      <a:solidFill>
+                        <a:schemeClr val="tx1"/>
+                      </a:solidFill>
+                    </a:ln>
+                  </pic:spPr>
+                </pic:pic>
+              </a:graphicData>
+            </a:graphic>
+          </wp:inline>
+        </w:drawing>
+      </w:r>
+    </w:p>
+    <w:p>
+      <w:pPr>
+        <w:pStyle w:val="Caption"/>
+        <w:jc w:val="center"/>
+      </w:pPr>
+      <w:bookmarkStart w:id="35" w:name="_Toc234846091"/>
+      <w:r>
+        <w:t xml:space="preserve">Slika </w:t>
+      </w:r>
+      <w:r>
+        <w:fldChar w:fldCharType="begin"/>
+      </w:r>
+      <w:r>
+        <w:instrText xml:space="preserve"> SEQ Slika \* ARABIC </w:instrText>
+      </w:r>
+      <w:r>
+        <w:fldChar w:fldCharType="separate"/>
+      </w:r>
+      <w:r>
+        <w:rPr>
+          <w:noProof/>
+        </w:rPr>
+        <w:t>8</w:t>
+      </w:r>
+      <w:r>
+        <w:fldChar w:fldCharType="end"/>
+      </w:r>
+      <w:r>
+        <w:t xml:space="preserve">. </w:t>
+      </w:r>
+      <w:r>
+        <w:t>Poređenje</w:t>
+      </w:r>
+      <w:r>
+        <w:t xml:space="preserve"> </w:t>
+      </w:r>
+      <w:r>
+        <w:t>odziva malignih klasa</w:t>
+      </w:r>
+      <w:r>
+        <w:t xml:space="preserve"> modela</w:t>
+      </w:r>
+      <w:bookmarkEnd w:id="35"/>
+    </w:p>
+    <w:p>
+      <w:pPr>
+        <w:pStyle w:val="Paragraf"/>
+      </w:pPr>
+    </w:p>
+    <w:p>
+      <w:pPr>
+        <w:pStyle w:val="Paragraf"/>
+      </w:pPr>
+    </w:p>
+    <w:p>
+      <w:pPr>
+        <w:pStyle w:val="Paragraf"/>
+      </w:pPr>
+    </w:p>
+    <w:p>
+      <w:pPr>
+        <w:pStyle w:val="Paragraf"/>
+      </w:pPr>
+    </w:p>
+    <w:p>
+      <w:pPr>
+        <w:pStyle w:val="Heading2"/>
+      </w:pPr>
+      <w:bookmarkStart w:id="36" w:name="_Toc236486958"/>
+      <w:r>
+        <w:lastRenderedPageBreak/>
+        <w:t>Tačnost</w:t>
+      </w:r>
+      <w:bookmarkEnd w:id="36"/>
+    </w:p>
+    <w:p>
+      <w:pPr>
+        <w:pStyle w:val="Paragraf"/>
+      </w:pPr>
+    </w:p>
+    <w:p>
+      <w:r>
+        <w:t>Vrijednost</w:t>
+      </w:r>
+      <w:r>
+        <w:t>i</w:t>
+      </w:r>
+      <w:r>
+        <w:t xml:space="preserve"> </w:t>
+      </w:r>
+      <w:r>
+        <w:t>tačnosti</w:t>
+      </w:r>
+      <w:r>
+        <w:t xml:space="preserve"> dobijenih C# modela iznos</w:t>
+      </w:r>
+      <w:r>
+        <w:t>e</w:t>
+      </w:r>
+      <w:r>
+        <w:t>:</w:t>
+      </w:r>
+    </w:p>
+    <w:p>
+      <w:pPr>
+        <w:pStyle w:val="Paragraf"/>
+        <w:numPr>
+          <w:ilvl w:val="0"/>
+          <w:numId w:val="26"/>
+        </w:numPr>
+      </w:pPr>
+      <w:r>
+        <w:t>82</w:t>
+      </w:r>
+      <w:r>
+        <w:t>,</w:t>
+      </w:r>
+      <w:r>
+        <w:t>55</w:t>
+      </w:r>
+      <w:r>
+        <w:t>%</w:t>
+      </w:r>
+    </w:p>
+    <w:p>
+      <w:pPr>
+        <w:pStyle w:val="Paragraf"/>
+        <w:numPr>
+          <w:ilvl w:val="0"/>
+          <w:numId w:val="26"/>
+        </w:numPr>
+      </w:pPr>
+      <w:r>
+        <w:t>83</w:t>
+      </w:r>
+      <w:r>
+        <w:t>,</w:t>
+      </w:r>
+      <w:r>
+        <w:t>27</w:t>
+      </w:r>
+      <w:r>
+        <w:t>%</w:t>
+      </w:r>
+    </w:p>
+    <w:p>
+      <w:pPr>
+        <w:pStyle w:val="Paragraf"/>
+        <w:numPr>
+          <w:ilvl w:val="0"/>
+          <w:numId w:val="26"/>
+        </w:numPr>
+      </w:pPr>
+      <w:r>
+        <w:t>81</w:t>
+      </w:r>
+      <w:r>
+        <w:t>,</w:t>
+      </w:r>
+      <w:r>
+        <w:t>82</w:t>
+      </w:r>
+      <w:r>
+        <w:t>%</w:t>
+      </w:r>
+    </w:p>
+    <w:p>
+      <w:r>
+        <w:t xml:space="preserve">Prosječna vrijednost </w:t>
+      </w:r>
+      <w:r>
+        <w:t xml:space="preserve">tačnosti </w:t>
+      </w:r>
+      <w:r>
+        <w:t xml:space="preserve">dobijenih C# modela iznosi </w:t>
+      </w:r>
+      <w:r>
+        <w:t>82</w:t>
+      </w:r>
+      <w:r>
+        <w:t>,</w:t>
+      </w:r>
+      <w:r>
+        <w:t>55</w:t>
+      </w:r>
+      <w:r>
+        <w:t>%.</w:t>
+      </w:r>
+    </w:p>
+    <w:p>
+      <w:pPr>
+        <w:pStyle w:val="Paragraf"/>
+        <w:ind w:left="340" w:firstLine="0"/>
+      </w:pPr>
+    </w:p>
+    <w:p>
+      <w:r>
+        <w:t>Vrijednost</w:t>
+      </w:r>
+      <w:r>
+        <w:t>i</w:t>
+      </w:r>
+      <w:r>
+        <w:t xml:space="preserve"> tačnosti</w:t>
+      </w:r>
+      <w:r>
+        <w:t xml:space="preserve"> dobijenih Python modela iznos</w:t>
+      </w:r>
+      <w:r>
+        <w:t>e</w:t>
+      </w:r>
+      <w:r>
+        <w:t>:</w:t>
+      </w:r>
+    </w:p>
+    <w:p>
+      <w:pPr>
+        <w:pStyle w:val="Paragraf"/>
+        <w:numPr>
+          <w:ilvl w:val="0"/>
+          <w:numId w:val="25"/>
+        </w:numPr>
+      </w:pPr>
+      <w:r>
+        <w:t>8</w:t>
+      </w:r>
+      <w:r>
+        <w:t>1</w:t>
+      </w:r>
+      <w:r>
+        <w:t>,</w:t>
+      </w:r>
+      <w:r>
+        <w:t>82</w:t>
+      </w:r>
+      <w:r>
+        <w:t>%</w:t>
+      </w:r>
+    </w:p>
+    <w:p>
+      <w:pPr>
+        <w:pStyle w:val="Paragraf"/>
+        <w:numPr>
+          <w:ilvl w:val="0"/>
+          <w:numId w:val="25"/>
+        </w:numPr>
+      </w:pPr>
+      <w:r>
+        <w:t>82</w:t>
+      </w:r>
+      <w:r>
+        <w:t>,</w:t>
+      </w:r>
+      <w:r>
+        <w:t>18</w:t>
+      </w:r>
+      <w:r>
+        <w:t>%</w:t>
+      </w:r>
+    </w:p>
+    <w:p>
+      <w:pPr>
+        <w:pStyle w:val="Paragraf"/>
+        <w:numPr>
+          <w:ilvl w:val="0"/>
+          <w:numId w:val="25"/>
+        </w:numPr>
+      </w:pPr>
+      <w:r>
+        <w:t>80</w:t>
+      </w:r>
+      <w:r>
+        <w:t>,</w:t>
+      </w:r>
+      <w:r>
+        <w:t>36</w:t>
+      </w:r>
+      <w:r>
+        <w:t>%</w:t>
+      </w:r>
+    </w:p>
+    <w:p>
+      <w:r>
+        <w:t xml:space="preserve">Prosječna vrijednost </w:t>
+      </w:r>
+      <w:r>
+        <w:t>ta</w:t>
+      </w:r>
+      <w:r>
+        <w:rPr>
+          <w:lang w:val="bs-Latn-BA"/>
+        </w:rPr>
+        <w:t>č</w:t>
+      </w:r>
+      <w:r>
+        <w:t>no</w:t>
+      </w:r>
+      <w:r>
+        <w:t>sti</w:t>
+      </w:r>
+      <w:r>
+        <w:t xml:space="preserve"> dobijenih Python modela iznosi </w:t>
+      </w:r>
+      <w:r>
+        <w:t>8</w:t>
+      </w:r>
+      <w:r>
+        <w:t>1</w:t>
+      </w:r>
+      <w:r>
+        <w:t>,</w:t>
+      </w:r>
+      <w:r>
+        <w:t>45</w:t>
+      </w:r>
+      <w:r>
+        <w:t>%.</w:t>
+      </w:r>
+    </w:p>
+    <w:p>
+      <w:r>
+        <w:t xml:space="preserve">Na slici </w:t>
+      </w:r>
+      <w:r>
+        <w:t>9</w:t>
+      </w:r>
+      <w:r>
+        <w:t xml:space="preserve">. je prikazan graf poređenja </w:t>
+      </w:r>
+      <w:r>
+        <w:t>ta</w:t>
+      </w:r>
+      <w:r>
+        <w:rPr>
+          <w:lang w:val="bs-Latn-BA"/>
+        </w:rPr>
+        <w:t>čnosti</w:t>
+      </w:r>
+      <w:r>
+        <w:t xml:space="preserve"> </w:t>
+      </w:r>
+      <w:r>
+        <w:t>treniranih modela.</w:t>
+      </w:r>
+    </w:p>
+    <w:p>
+      <w:pPr>
+        <w:pStyle w:val="Paragraf"/>
+        <w:keepNext/>
+      </w:pPr>
+      <w:r>
+        <w:rPr>
+          <w:noProof/>
+        </w:rPr>
+        <w:drawing>
+          <wp:inline distT="0" distB="0" distL="0" distR="0" wp14:anchorId="525B71C9" wp14:editId="7BDD91E6">
+            <wp:extent cx="5943600" cy="2330450"/>
+            <wp:effectExtent l="19050" t="19050" r="0" b="0"/>
+            <wp:docPr id="13" name="Picture 13"/>
             <wp:cNvGraphicFramePr>
               <a:graphicFrameLocks xmlns:a="http://schemas.openxmlformats.org/drawingml/2006/main" noChangeAspect="1"/>
             </wp:cNvGraphicFramePr>
@@ -17740,402 +18595,6 @@
         <w:pStyle w:val="Caption"/>
         <w:jc w:val="center"/>
       </w:pPr>
-      <w:bookmarkStart w:id="35" w:name="_Toc234846091"/>
-      <w:r>
-        <w:t xml:space="preserve">Slika </w:t>
-      </w:r>
-      <w:r>
-        <w:fldChar w:fldCharType="begin"/>
-      </w:r>
-      <w:r>
-        <w:instrText xml:space="preserve"> SEQ Slika \* ARABIC </w:instrText>
-      </w:r>
-      <w:r>
-        <w:fldChar w:fldCharType="separate"/>
-      </w:r>
-      <w:r>
-        <w:rPr>
-          <w:noProof/>
-        </w:rPr>
-        <w:t>8</w:t>
-      </w:r>
-      <w:r>
-        <w:fldChar w:fldCharType="end"/>
-      </w:r>
-      <w:r>
-        <w:t xml:space="preserve">. </w:t>
-      </w:r>
-      <w:r>
-        <w:t>Poređenje</w:t>
-      </w:r>
-      <w:r>
-        <w:t xml:space="preserve"> </w:t>
-      </w:r>
-      <w:r>
-        <w:t>odziva malignih klasa</w:t>
-      </w:r>
-      <w:r>
-        <w:t xml:space="preserve"> modela</w:t>
-      </w:r>
-      <w:bookmarkEnd w:id="35"/>
-    </w:p>
-    <w:p>
-      <w:pPr>
-        <w:pStyle w:val="Paragraf"/>
-      </w:pPr>
-    </w:p>
-    <w:p>
-      <w:pPr>
-        <w:pStyle w:val="Paragraf"/>
-      </w:pPr>
-    </w:p>
-    <w:p>
-      <w:pPr>
-        <w:pStyle w:val="Paragraf"/>
-      </w:pPr>
-    </w:p>
-    <w:p>
-      <w:pPr>
-        <w:pStyle w:val="Paragraf"/>
-      </w:pPr>
-    </w:p>
-    <w:p>
-      <w:pPr>
-        <w:pStyle w:val="Heading2"/>
-      </w:pPr>
-      <w:bookmarkStart w:id="36" w:name="_Toc234846042"/>
-      <w:r>
-        <w:lastRenderedPageBreak/>
-        <w:t>Tačnost</w:t>
-      </w:r>
-      <w:bookmarkEnd w:id="36"/>
-    </w:p>
-    <w:p>
-      <w:pPr>
-        <w:pStyle w:val="Paragraf"/>
-      </w:pPr>
-    </w:p>
-    <w:p>
-      <w:r>
-        <w:t>Vrijednost</w:t>
-      </w:r>
-      <w:r>
-        <w:t>i</w:t>
-      </w:r>
-      <w:r>
-        <w:t xml:space="preserve"> </w:t>
-      </w:r>
-      <w:r>
-        <w:t>tačnosti</w:t>
-      </w:r>
-      <w:r>
-        <w:t xml:space="preserve"> dobijenih C# modela iznos</w:t>
-      </w:r>
-      <w:r>
-        <w:t>e</w:t>
-      </w:r>
-      <w:r>
-        <w:t>:</w:t>
-      </w:r>
-    </w:p>
-    <w:p>
-      <w:pPr>
-        <w:pStyle w:val="Paragraf"/>
-        <w:numPr>
-          <w:ilvl w:val="0"/>
-          <w:numId w:val="26"/>
-        </w:numPr>
-      </w:pPr>
-      <w:r>
-        <w:t>82</w:t>
-      </w:r>
-      <w:r>
-        <w:t>,</w:t>
-      </w:r>
-      <w:r>
-        <w:t>55</w:t>
-      </w:r>
-      <w:r>
-        <w:t>%</w:t>
-      </w:r>
-    </w:p>
-    <w:p>
-      <w:pPr>
-        <w:pStyle w:val="Paragraf"/>
-        <w:numPr>
-          <w:ilvl w:val="0"/>
-          <w:numId w:val="26"/>
-        </w:numPr>
-      </w:pPr>
-      <w:r>
-        <w:t>83</w:t>
-      </w:r>
-      <w:r>
-        <w:t>,</w:t>
-      </w:r>
-      <w:r>
-        <w:t>27</w:t>
-      </w:r>
-      <w:r>
-        <w:t>%</w:t>
-      </w:r>
-    </w:p>
-    <w:p>
-      <w:pPr>
-        <w:pStyle w:val="Paragraf"/>
-        <w:numPr>
-          <w:ilvl w:val="0"/>
-          <w:numId w:val="26"/>
-        </w:numPr>
-      </w:pPr>
-      <w:r>
-        <w:t>81</w:t>
-      </w:r>
-      <w:r>
-        <w:t>,</w:t>
-      </w:r>
-      <w:r>
-        <w:t>82</w:t>
-      </w:r>
-      <w:r>
-        <w:t>%</w:t>
-      </w:r>
-    </w:p>
-    <w:p>
-      <w:r>
-        <w:t xml:space="preserve">Prosječna vrijednost </w:t>
-      </w:r>
-      <w:r>
-        <w:t xml:space="preserve">tačnosti </w:t>
-      </w:r>
-      <w:r>
-        <w:t xml:space="preserve">dobijenih C# modela iznosi </w:t>
-      </w:r>
-      <w:r>
-        <w:t>82</w:t>
-      </w:r>
-      <w:r>
-        <w:t>,</w:t>
-      </w:r>
-      <w:r>
-        <w:t>55</w:t>
-      </w:r>
-      <w:r>
-        <w:t>%.</w:t>
-      </w:r>
-    </w:p>
-    <w:p>
-      <w:pPr>
-        <w:pStyle w:val="Paragraf"/>
-        <w:ind w:left="340" w:firstLine="0"/>
-      </w:pPr>
-    </w:p>
-    <w:p>
-      <w:r>
-        <w:t>Vrijednost</w:t>
-      </w:r>
-      <w:r>
-        <w:t>i</w:t>
-      </w:r>
-      <w:r>
-        <w:t xml:space="preserve"> tačnosti</w:t>
-      </w:r>
-      <w:r>
-        <w:t xml:space="preserve"> dobijenih Python modela iznos</w:t>
-      </w:r>
-      <w:r>
-        <w:t>e</w:t>
-      </w:r>
-      <w:r>
-        <w:t>:</w:t>
-      </w:r>
-    </w:p>
-    <w:p>
-      <w:pPr>
-        <w:pStyle w:val="Paragraf"/>
-        <w:numPr>
-          <w:ilvl w:val="0"/>
-          <w:numId w:val="25"/>
-        </w:numPr>
-      </w:pPr>
-      <w:r>
-        <w:t>8</w:t>
-      </w:r>
-      <w:r>
-        <w:t>1</w:t>
-      </w:r>
-      <w:r>
-        <w:t>,</w:t>
-      </w:r>
-      <w:r>
-        <w:t>82</w:t>
-      </w:r>
-      <w:r>
-        <w:t>%</w:t>
-      </w:r>
-    </w:p>
-    <w:p>
-      <w:pPr>
-        <w:pStyle w:val="Paragraf"/>
-        <w:numPr>
-          <w:ilvl w:val="0"/>
-          <w:numId w:val="25"/>
-        </w:numPr>
-      </w:pPr>
-      <w:r>
-        <w:t>82</w:t>
-      </w:r>
-      <w:r>
-        <w:t>,</w:t>
-      </w:r>
-      <w:r>
-        <w:t>18</w:t>
-      </w:r>
-      <w:r>
-        <w:t>%</w:t>
-      </w:r>
-    </w:p>
-    <w:p>
-      <w:pPr>
-        <w:pStyle w:val="Paragraf"/>
-        <w:numPr>
-          <w:ilvl w:val="0"/>
-          <w:numId w:val="25"/>
-        </w:numPr>
-      </w:pPr>
-      <w:r>
-        <w:t>80</w:t>
-      </w:r>
-      <w:r>
-        <w:t>,</w:t>
-      </w:r>
-      <w:r>
-        <w:t>36</w:t>
-      </w:r>
-      <w:r>
-        <w:t>%</w:t>
-      </w:r>
-    </w:p>
-    <w:p>
-      <w:r>
-        <w:t xml:space="preserve">Prosječna vrijednost </w:t>
-      </w:r>
-      <w:r>
-        <w:t>ta</w:t>
-      </w:r>
-      <w:r>
-        <w:rPr>
-          <w:lang w:val="bs-Latn-BA"/>
-        </w:rPr>
-        <w:t>č</w:t>
-      </w:r>
-      <w:r>
-        <w:t>no</w:t>
-      </w:r>
-      <w:r>
-        <w:t>sti</w:t>
-      </w:r>
-      <w:r>
-        <w:t xml:space="preserve"> dobijenih Python modela iznosi </w:t>
-      </w:r>
-      <w:r>
-        <w:t>8</w:t>
-      </w:r>
-      <w:r>
-        <w:t>1</w:t>
-      </w:r>
-      <w:r>
-        <w:t>,</w:t>
-      </w:r>
-      <w:r>
-        <w:t>45</w:t>
-      </w:r>
-      <w:r>
-        <w:t>%.</w:t>
-      </w:r>
-    </w:p>
-    <w:p>
-      <w:r>
-        <w:t xml:space="preserve">Na slici </w:t>
-      </w:r>
-      <w:r>
-        <w:t>9</w:t>
-      </w:r>
-      <w:r>
-        <w:t xml:space="preserve">. je prikazan graf poređenja </w:t>
-      </w:r>
-      <w:r>
-        <w:t>ta</w:t>
-      </w:r>
-      <w:r>
-        <w:rPr>
-          <w:lang w:val="bs-Latn-BA"/>
-        </w:rPr>
-        <w:t>čnosti</w:t>
-      </w:r>
-      <w:r>
-        <w:t xml:space="preserve"> </w:t>
-      </w:r>
-      <w:r>
-        <w:t>treniranih modela.</w:t>
-      </w:r>
-    </w:p>
-    <w:p>
-      <w:pPr>
-        <w:pStyle w:val="Paragraf"/>
-        <w:keepNext/>
-      </w:pPr>
-      <w:r>
-        <w:rPr>
-          <w:noProof/>
-        </w:rPr>
-        <w:drawing>
-          <wp:inline distT="0" distB="0" distL="0" distR="0" wp14:anchorId="525B71C9" wp14:editId="7BDD91E6">
-            <wp:extent cx="5943600" cy="2330450"/>
-            <wp:effectExtent l="19050" t="19050" r="0" b="0"/>
-            <wp:docPr id="13" name="Picture 13"/>
-            <wp:cNvGraphicFramePr>
-              <a:graphicFrameLocks xmlns:a="http://schemas.openxmlformats.org/drawingml/2006/main" noChangeAspect="1"/>
-            </wp:cNvGraphicFramePr>
-            <a:graphic xmlns:a="http://schemas.openxmlformats.org/drawingml/2006/main">
-              <a:graphicData uri="http://schemas.openxmlformats.org/drawingml/2006/picture">
-                <pic:pic xmlns:pic="http://schemas.openxmlformats.org/drawingml/2006/picture">
-                  <pic:nvPicPr>
-                    <pic:cNvPr id="1" name=""/>
-                    <pic:cNvPicPr/>
-                  </pic:nvPicPr>
-                  <pic:blipFill>
-                    <a:blip r:embed="rId27"/>
-                    <a:stretch>
-                      <a:fillRect/>
-                    </a:stretch>
-                  </pic:blipFill>
-                  <pic:spPr>
-                    <a:xfrm>
-                      <a:off x="0" y="0"/>
-                      <a:ext cx="5943600" cy="2330450"/>
-                    </a:xfrm>
-                    <a:prstGeom prst="rect">
-                      <a:avLst/>
-                    </a:prstGeom>
-                    <a:ln w="6350">
-                      <a:solidFill>
-                        <a:schemeClr val="tx1"/>
-                      </a:solidFill>
-                    </a:ln>
-                  </pic:spPr>
-                </pic:pic>
-              </a:graphicData>
-            </a:graphic>
-          </wp:inline>
-        </w:drawing>
-      </w:r>
-    </w:p>
-    <w:p>
-      <w:pPr>
-        <w:pStyle w:val="Caption"/>
-        <w:jc w:val="center"/>
-      </w:pPr>
       <w:bookmarkStart w:id="37" w:name="_Toc234846092"/>
       <w:r>
         <w:t xml:space="preserve">Slika </w:t>
@@ -18231,7 +18690,7 @@
                     <pic:cNvPicPr/>
                   </pic:nvPicPr>
                   <pic:blipFill>
-                    <a:blip r:embed="rId28"/>
+                    <a:blip r:embed="rId27"/>
                     <a:stretch>
                       <a:fillRect/>
                     </a:stretch>
@@ -18324,7 +18783,7 @@
                     <pic:cNvPicPr/>
                   </pic:nvPicPr>
                   <pic:blipFill>
-                    <a:blip r:embed="rId29"/>
+                    <a:blip r:embed="rId28"/>
                     <a:stretch>
                       <a:fillRect/>
                     </a:stretch>
@@ -18410,7 +18869,7 @@
       <w:pPr>
         <w:pStyle w:val="Heading2"/>
       </w:pPr>
-      <w:bookmarkStart w:id="40" w:name="_Toc234846043"/>
+      <w:bookmarkStart w:id="40" w:name="_Toc236486959"/>
       <w:r>
         <w:lastRenderedPageBreak/>
         <w:t>Analiza rezultata</w:t>
@@ -18427,10 +18886,22 @@
         <w:t>Analizom prikazanih metrika za</w:t>
       </w:r>
       <w:r>
-        <w:t xml:space="preserve"> vrijeme treniranja, makro odziva, makro F1 mjera i odziva malignene </w:t>
-      </w:r>
-      <w:r>
-        <w:t xml:space="preserve">klase, primjetno je da su rezultati </w:t>
+        <w:t xml:space="preserve"> vrijeme treniranja, makro odziva, makro F1 mjera</w:t>
+      </w:r>
+      <w:r>
+        <w:t xml:space="preserve">, </w:t>
+      </w:r>
+      <w:r>
+        <w:t xml:space="preserve">odziva maligne </w:t>
+      </w:r>
+      <w:r>
+        <w:t>klase</w:t>
+      </w:r>
+      <w:r>
+        <w:t xml:space="preserve"> i tačnosti</w:t>
+      </w:r>
+      <w:r>
+        <w:t xml:space="preserve">, primjetno je da su rezultati </w:t>
       </w:r>
       <w:r>
         <w:t xml:space="preserve">veoma slični u oba okruženja. </w:t>
@@ -18733,7 +19204,7 @@
       <w:pPr>
         <w:pStyle w:val="Heading1"/>
       </w:pPr>
-      <w:bookmarkStart w:id="41" w:name="_Toc234846044"/>
+      <w:bookmarkStart w:id="41" w:name="_Toc236486960"/>
       <w:r>
         <w:lastRenderedPageBreak/>
         <w:t>Zaključak</w:t>
@@ -18747,7 +19218,13 @@
     </w:p>
     <w:p>
       <w:r>
-        <w:t>Dati rad je analizirao razlike u treniranju modela dubokog učenja unutar Python i .NET okruženja na primjeru problema raka pluća. Za rješavanje problema korištena je konvolucijska neuronska mreža koja je implementirana na identičan način u oba okruženja. Metodologija treniranja i testiranja definisana je u cilju što objektivnije uporedbe modela i okruženja.</w:t>
+        <w:t>Dati rad je analizirao razlike u treniranju modela dubokog učenja unutar Python i .NET okruženja na primjeru problema raka pluća. Za rješavanje problema korištena je konvoluci</w:t>
+      </w:r>
+      <w:r>
+        <w:t>ona</w:t>
+      </w:r>
+      <w:r>
+        <w:t xml:space="preserve"> neuronska mreža koja je implementirana na identičan način u oba okruženja. Metodologija treniranja i testiranja definisana je u cilju što objektivnije uporedbe modela i okruženja.</w:t>
       </w:r>
     </w:p>
     <w:p>
@@ -18780,7 +19257,7 @@
     <w:p>
       <w:pPr>
         <w:sectPr>
-          <w:headerReference w:type="default" r:id="rId30"/>
+          <w:headerReference w:type="default" r:id="rId29"/>
           <w:pgSz w:w="12240" w:h="15840"/>
           <w:pgMar w:top="1440" w:right="1440" w:bottom="1440" w:left="1440" w:header="708" w:footer="708" w:gutter="0"/>
           <w:cols w:space="708"/>
@@ -18818,243 +19295,606 @@
             <w:t>Bibliografija</w:t>
           </w:r>
         </w:p>
-        <w:sdt>
-          <w:sdtPr>
-            <w:id w:val="111145805"/>
-            <w:bibliography/>
-          </w:sdtPr>
-          <w:sdtEndPr/>
-          <w:sdtContent>
-            <w:p>
-              <w:pPr>
-                <w:rPr>
-                  <w:rFonts w:asciiTheme="minorHAnsi" w:hAnsiTheme="minorHAnsi"/>
-                  <w:noProof/>
-                  <w:sz w:val="22"/>
-                  <w:lang w:val="en-US"/>
-                </w:rPr>
-              </w:pPr>
-              <w:r>
-                <w:fldChar w:fldCharType="begin"/>
-              </w:r>
-              <w:r>
-                <w:instrText xml:space="preserve"> BIBLIOGRAPHY </w:instrText>
-              </w:r>
-              <w:r>
-                <w:fldChar w:fldCharType="separate"/>
-              </w:r>
-            </w:p>
-            <w:tbl>
-              <w:tblPr>
-                <w:tblW w:w="5000" w:type="pct"/>
-                <w:tblCellSpacing w:w="15" w:type="dxa"/>
-                <w:tblCellMar>
-                  <w:top w:w="15" w:type="dxa"/>
-                  <w:left w:w="15" w:type="dxa"/>
-                  <w:bottom w:w="15" w:type="dxa"/>
-                  <w:right w:w="15" w:type="dxa"/>
-                </w:tblCellMar>
-                <w:tblLook w:val="04A0" w:firstRow="1" w:lastRow="0" w:firstColumn="1" w:lastColumn="0" w:noHBand="0" w:noVBand="1"/>
-              </w:tblPr>
-              <w:tblGrid>
-                <w:gridCol w:w="355"/>
-                <w:gridCol w:w="9095"/>
-              </w:tblGrid>
-              <w:tr>
-                <w:trPr>
-                  <w:divId w:val="1705058161"/>
-                  <w:tblCellSpacing w:w="15" w:type="dxa"/>
-                </w:trPr>
-                <w:tc>
-                  <w:tcPr>
-                    <w:tcW w:w="50" w:type="pct"/>
-                    <w:hideMark/>
-                  </w:tcPr>
-                  <w:p>
-                    <w:pPr>
-                      <w:pStyle w:val="Bibliography"/>
-                      <w:rPr>
-                        <w:noProof/>
-                        <w:szCs w:val="24"/>
-                      </w:rPr>
-                    </w:pPr>
-                    <w:r>
-                      <w:rPr>
-                        <w:noProof/>
-                      </w:rPr>
-                      <w:t xml:space="preserve">[1] </w:t>
-                    </w:r>
-                  </w:p>
-                </w:tc>
-                <w:tc>
-                  <w:tcPr>
-                    <w:tcW w:w="0" w:type="auto"/>
-                    <w:hideMark/>
-                  </w:tcPr>
-                  <w:p>
-                    <w:pPr>
-                      <w:pStyle w:val="Bibliography"/>
-                      <w:rPr>
-                        <w:noProof/>
-                      </w:rPr>
-                    </w:pPr>
-                    <w:r>
-                      <w:rPr>
-                        <w:noProof/>
-                      </w:rPr>
-                      <w:t xml:space="preserve">R. Ziemer, »An overview of modulation and coding for wireless communications,« </w:t>
-                    </w:r>
-                    <w:r>
-                      <w:rPr>
-                        <w:i/>
-                        <w:iCs/>
-                        <w:noProof/>
-                      </w:rPr>
-                      <w:t xml:space="preserve">46th Vehicular Technology Conference, </w:t>
-                    </w:r>
-                    <w:r>
-                      <w:rPr>
-                        <w:noProof/>
-                      </w:rPr>
-                      <w:t xml:space="preserve">pp. 26-30, 1996. </w:t>
-                    </w:r>
-                  </w:p>
-                </w:tc>
-              </w:tr>
-              <w:tr>
-                <w:trPr>
-                  <w:divId w:val="1705058161"/>
-                  <w:tblCellSpacing w:w="15" w:type="dxa"/>
-                </w:trPr>
-                <w:tc>
-                  <w:tcPr>
-                    <w:tcW w:w="50" w:type="pct"/>
-                    <w:hideMark/>
-                  </w:tcPr>
-                  <w:p>
-                    <w:pPr>
-                      <w:pStyle w:val="Bibliography"/>
-                      <w:rPr>
-                        <w:noProof/>
-                      </w:rPr>
-                    </w:pPr>
-                    <w:r>
-                      <w:rPr>
-                        <w:noProof/>
-                      </w:rPr>
-                      <w:t xml:space="preserve">[2] </w:t>
-                    </w:r>
-                  </w:p>
-                </w:tc>
-                <w:tc>
-                  <w:tcPr>
-                    <w:tcW w:w="0" w:type="auto"/>
-                    <w:hideMark/>
-                  </w:tcPr>
-                  <w:p>
-                    <w:pPr>
-                      <w:pStyle w:val="Bibliography"/>
-                      <w:rPr>
-                        <w:noProof/>
-                      </w:rPr>
-                    </w:pPr>
-                    <w:r>
-                      <w:rPr>
-                        <w:noProof/>
-                      </w:rPr>
-                      <w:t xml:space="preserve">H. F. a. O. Hooijen, »Power Line Communications: An Overview,« </w:t>
-                    </w:r>
-                    <w:r>
-                      <w:rPr>
-                        <w:i/>
-                        <w:iCs/>
-                        <w:noProof/>
-                      </w:rPr>
-                      <w:t xml:space="preserve">The Transactions on of The S.A. Electrical Engineers, </w:t>
-                    </w:r>
-                    <w:r>
-                      <w:rPr>
-                        <w:noProof/>
-                      </w:rPr>
-                      <w:t xml:space="preserve">pp. 154-161, 1995. </w:t>
-                    </w:r>
-                  </w:p>
-                </w:tc>
-              </w:tr>
-              <w:tr>
-                <w:trPr>
-                  <w:divId w:val="1705058161"/>
-                  <w:tblCellSpacing w:w="15" w:type="dxa"/>
-                </w:trPr>
-                <w:tc>
-                  <w:tcPr>
-                    <w:tcW w:w="50" w:type="pct"/>
-                    <w:hideMark/>
-                  </w:tcPr>
-                  <w:p>
-                    <w:pPr>
-                      <w:pStyle w:val="Bibliography"/>
-                      <w:rPr>
-                        <w:noProof/>
-                      </w:rPr>
-                    </w:pPr>
-                    <w:r>
-                      <w:rPr>
-                        <w:noProof/>
-                      </w:rPr>
-                      <w:t xml:space="preserve">[3] </w:t>
-                    </w:r>
-                  </w:p>
-                </w:tc>
-                <w:tc>
-                  <w:tcPr>
-                    <w:tcW w:w="0" w:type="auto"/>
-                    <w:hideMark/>
-                  </w:tcPr>
-                  <w:p>
-                    <w:pPr>
-                      <w:pStyle w:val="Bibliography"/>
-                      <w:rPr>
-                        <w:noProof/>
-                      </w:rPr>
-                    </w:pPr>
-                    <w:r>
-                      <w:rPr>
-                        <w:noProof/>
-                      </w:rPr>
-                      <w:t>»IEEE P1901 Working Group 2010,« Standard for Broadband over Powerline Networks:, [Mrežno]. Available: http://grouper.ieee.org/groups/1901/.</w:t>
-                    </w:r>
-                  </w:p>
-                </w:tc>
-              </w:tr>
-            </w:tbl>
-            <w:p>
-              <w:pPr>
-                <w:divId w:val="1705058161"/>
-                <w:rPr>
-                  <w:rFonts w:eastAsia="Times New Roman"/>
-                  <w:noProof/>
-                </w:rPr>
-              </w:pPr>
-            </w:p>
-            <w:p>
-              <w:r>
-                <w:fldChar w:fldCharType="end"/>
-              </w:r>
-            </w:p>
-          </w:sdtContent>
-        </w:sdt>
+        <w:p>
+          <w:pPr>
+            <w:rPr>
+              <w:rFonts w:asciiTheme="minorHAnsi" w:hAnsiTheme="minorHAnsi"/>
+              <w:noProof/>
+              <w:sz w:val="22"/>
+              <w:lang w:val="en-US"/>
+            </w:rPr>
+          </w:pPr>
+          <w:r>
+            <w:fldChar w:fldCharType="begin"/>
+          </w:r>
+          <w:r>
+            <w:rPr>
+              <w:lang w:val="en-US"/>
+            </w:rPr>
+            <w:instrText xml:space="preserve"> BIBLIOGRAPHY  \l 1033 </w:instrText>
+          </w:r>
+          <w:r>
+            <w:fldChar w:fldCharType="separate"/>
+          </w:r>
+        </w:p>
+        <w:tbl>
+          <w:tblPr>
+            <w:tblW w:w="5000" w:type="pct"/>
+            <w:tblCellSpacing w:w="15" w:type="dxa"/>
+            <w:tblCellMar>
+              <w:top w:w="15" w:type="dxa"/>
+              <w:left w:w="15" w:type="dxa"/>
+              <w:bottom w:w="15" w:type="dxa"/>
+              <w:right w:w="15" w:type="dxa"/>
+            </w:tblCellMar>
+            <w:tblLook w:val="04A0" w:firstRow="1" w:lastRow="0" w:firstColumn="1" w:lastColumn="0" w:noHBand="0" w:noVBand="1"/>
+          </w:tblPr>
+          <w:tblGrid>
+            <w:gridCol w:w="475"/>
+            <w:gridCol w:w="8975"/>
+          </w:tblGrid>
+          <w:tr>
+            <w:trPr>
+              <w:divId w:val="1530223782"/>
+              <w:tblCellSpacing w:w="15" w:type="dxa"/>
+            </w:trPr>
+            <w:tc>
+              <w:tcPr>
+                <w:tcW w:w="50" w:type="pct"/>
+                <w:hideMark/>
+              </w:tcPr>
+              <w:p>
+                <w:pPr>
+                  <w:pStyle w:val="Bibliography"/>
+                  <w:rPr>
+                    <w:noProof/>
+                    <w:szCs w:val="24"/>
+                  </w:rPr>
+                </w:pPr>
+                <w:r>
+                  <w:rPr>
+                    <w:noProof/>
+                  </w:rPr>
+                  <w:t xml:space="preserve">[1] </w:t>
+                </w:r>
+              </w:p>
+            </w:tc>
+            <w:tc>
+              <w:tcPr>
+                <w:tcW w:w="0" w:type="auto"/>
+                <w:hideMark/>
+              </w:tcPr>
+              <w:p>
+                <w:pPr>
+                  <w:pStyle w:val="Bibliography"/>
+                  <w:rPr>
+                    <w:noProof/>
+                  </w:rPr>
+                </w:pPr>
+                <w:r>
+                  <w:rPr>
+                    <w:noProof/>
+                  </w:rPr>
+                  <w:t>PyTorch, "PyTorch GitHub Repository," GitHub, [Online]. Available: https://github.com/pytorch/pytorch.</w:t>
+                </w:r>
+              </w:p>
+            </w:tc>
+          </w:tr>
+          <w:tr>
+            <w:trPr>
+              <w:divId w:val="1530223782"/>
+              <w:tblCellSpacing w:w="15" w:type="dxa"/>
+            </w:trPr>
+            <w:tc>
+              <w:tcPr>
+                <w:tcW w:w="50" w:type="pct"/>
+                <w:hideMark/>
+              </w:tcPr>
+              <w:p>
+                <w:pPr>
+                  <w:pStyle w:val="Bibliography"/>
+                  <w:rPr>
+                    <w:noProof/>
+                  </w:rPr>
+                </w:pPr>
+                <w:r>
+                  <w:rPr>
+                    <w:noProof/>
+                  </w:rPr>
+                  <w:t xml:space="preserve">[2] </w:t>
+                </w:r>
+              </w:p>
+            </w:tc>
+            <w:tc>
+              <w:tcPr>
+                <w:tcW w:w="0" w:type="auto"/>
+                <w:hideMark/>
+              </w:tcPr>
+              <w:p>
+                <w:pPr>
+                  <w:pStyle w:val="Bibliography"/>
+                  <w:rPr>
+                    <w:noProof/>
+                  </w:rPr>
+                </w:pPr>
+                <w:r>
+                  <w:rPr>
+                    <w:noProof/>
+                  </w:rPr>
+                  <w:t>GitHub, "Octoverse: A new developer joins GitHub every second as AI leads TypeScript to #1," GitHub, 28 October 2025. [Online]. Available: https://github.blog/news-insights/octoverse/octoverse-a-new-developer-joins-github-every-second-as-ai-leads-typescript-to-1/.</w:t>
+                </w:r>
+              </w:p>
+            </w:tc>
+          </w:tr>
+          <w:tr>
+            <w:trPr>
+              <w:divId w:val="1530223782"/>
+              <w:tblCellSpacing w:w="15" w:type="dxa"/>
+            </w:trPr>
+            <w:tc>
+              <w:tcPr>
+                <w:tcW w:w="50" w:type="pct"/>
+                <w:hideMark/>
+              </w:tcPr>
+              <w:p>
+                <w:pPr>
+                  <w:pStyle w:val="Bibliography"/>
+                  <w:rPr>
+                    <w:noProof/>
+                  </w:rPr>
+                </w:pPr>
+                <w:r>
+                  <w:rPr>
+                    <w:noProof/>
+                  </w:rPr>
+                  <w:t xml:space="preserve">[3] </w:t>
+                </w:r>
+              </w:p>
+            </w:tc>
+            <w:tc>
+              <w:tcPr>
+                <w:tcW w:w="0" w:type="auto"/>
+                <w:hideMark/>
+              </w:tcPr>
+              <w:p>
+                <w:pPr>
+                  <w:pStyle w:val="Bibliography"/>
+                  <w:rPr>
+                    <w:noProof/>
+                  </w:rPr>
+                </w:pPr>
+                <w:r>
+                  <w:rPr>
+                    <w:noProof/>
+                  </w:rPr>
+                  <w:t xml:space="preserve">Paszke, A. et al., "PyTorch: An Imperative Style, High-Performance Deep Learning Library," </w:t>
+                </w:r>
+                <w:r>
+                  <w:rPr>
+                    <w:i/>
+                    <w:iCs/>
+                    <w:noProof/>
+                  </w:rPr>
+                  <w:t xml:space="preserve">Advances in Neural Information Processing Systems, </w:t>
+                </w:r>
+                <w:r>
+                  <w:rPr>
+                    <w:noProof/>
+                  </w:rPr>
+                  <w:t xml:space="preserve">vol. 32, 2019. </w:t>
+                </w:r>
+              </w:p>
+            </w:tc>
+          </w:tr>
+          <w:tr>
+            <w:trPr>
+              <w:divId w:val="1530223782"/>
+              <w:tblCellSpacing w:w="15" w:type="dxa"/>
+            </w:trPr>
+            <w:tc>
+              <w:tcPr>
+                <w:tcW w:w="50" w:type="pct"/>
+                <w:hideMark/>
+              </w:tcPr>
+              <w:p>
+                <w:pPr>
+                  <w:pStyle w:val="Bibliography"/>
+                  <w:rPr>
+                    <w:noProof/>
+                  </w:rPr>
+                </w:pPr>
+                <w:r>
+                  <w:rPr>
+                    <w:noProof/>
+                  </w:rPr>
+                  <w:t xml:space="preserve">[4] </w:t>
+                </w:r>
+              </w:p>
+            </w:tc>
+            <w:tc>
+              <w:tcPr>
+                <w:tcW w:w="0" w:type="auto"/>
+                <w:hideMark/>
+              </w:tcPr>
+              <w:p>
+                <w:pPr>
+                  <w:pStyle w:val="Bibliography"/>
+                  <w:rPr>
+                    <w:noProof/>
+                  </w:rPr>
+                </w:pPr>
+                <w:r>
+                  <w:rPr>
+                    <w:noProof/>
+                  </w:rPr>
+                  <w:t>TorchSharp, "TorchSharp Github Repository," GitHub, [Online]. Available: https://github.com/dotnet/torchsharp.</w:t>
+                </w:r>
+              </w:p>
+            </w:tc>
+          </w:tr>
+          <w:tr>
+            <w:trPr>
+              <w:divId w:val="1530223782"/>
+              <w:tblCellSpacing w:w="15" w:type="dxa"/>
+            </w:trPr>
+            <w:tc>
+              <w:tcPr>
+                <w:tcW w:w="50" w:type="pct"/>
+                <w:hideMark/>
+              </w:tcPr>
+              <w:p>
+                <w:pPr>
+                  <w:pStyle w:val="Bibliography"/>
+                  <w:rPr>
+                    <w:noProof/>
+                  </w:rPr>
+                </w:pPr>
+                <w:r>
+                  <w:rPr>
+                    <w:noProof/>
+                  </w:rPr>
+                  <w:t xml:space="preserve">[5] </w:t>
+                </w:r>
+              </w:p>
+            </w:tc>
+            <w:tc>
+              <w:tcPr>
+                <w:tcW w:w="0" w:type="auto"/>
+                <w:hideMark/>
+              </w:tcPr>
+              <w:p>
+                <w:pPr>
+                  <w:pStyle w:val="Bibliography"/>
+                  <w:rPr>
+                    <w:noProof/>
+                  </w:rPr>
+                </w:pPr>
+                <w:r>
+                  <w:rPr>
+                    <w:noProof/>
+                  </w:rPr>
+                  <w:t xml:space="preserve">D. M. W. Powers, "Evaluation: from precision, recall and F-measure to ROC, informedness, markedness and correlation," </w:t>
+                </w:r>
+                <w:r>
+                  <w:rPr>
+                    <w:i/>
+                    <w:iCs/>
+                    <w:noProof/>
+                  </w:rPr>
+                  <w:t xml:space="preserve">Journal of Machine Learning Technologies, </w:t>
+                </w:r>
+                <w:r>
+                  <w:rPr>
+                    <w:noProof/>
+                  </w:rPr>
+                  <w:t xml:space="preserve">vol. 2, 2011. </w:t>
+                </w:r>
+              </w:p>
+            </w:tc>
+          </w:tr>
+          <w:tr>
+            <w:trPr>
+              <w:divId w:val="1530223782"/>
+              <w:tblCellSpacing w:w="15" w:type="dxa"/>
+            </w:trPr>
+            <w:tc>
+              <w:tcPr>
+                <w:tcW w:w="50" w:type="pct"/>
+                <w:hideMark/>
+              </w:tcPr>
+              <w:p>
+                <w:pPr>
+                  <w:pStyle w:val="Bibliography"/>
+                  <w:rPr>
+                    <w:noProof/>
+                  </w:rPr>
+                </w:pPr>
+                <w:r>
+                  <w:rPr>
+                    <w:noProof/>
+                  </w:rPr>
+                  <w:t xml:space="preserve">[6] </w:t>
+                </w:r>
+              </w:p>
+            </w:tc>
+            <w:tc>
+              <w:tcPr>
+                <w:tcW w:w="0" w:type="auto"/>
+                <w:hideMark/>
+              </w:tcPr>
+              <w:p>
+                <w:pPr>
+                  <w:pStyle w:val="Bibliography"/>
+                  <w:rPr>
+                    <w:noProof/>
+                  </w:rPr>
+                </w:pPr>
+                <w:r>
+                  <w:rPr>
+                    <w:noProof/>
+                  </w:rPr>
+                  <w:t xml:space="preserve">H. Al-Yasriy, M. S. Al-Husieny, F. Y. Mohsen, E. A. Khalil and Z. S. Hassan, "Diagnosis of Lung Cancer Based on CT Scans Using CNN," </w:t>
+                </w:r>
+                <w:r>
+                  <w:rPr>
+                    <w:i/>
+                    <w:iCs/>
+                    <w:noProof/>
+                  </w:rPr>
+                  <w:t xml:space="preserve">IOP Conference Series: Materials Science and Engineering, </w:t>
+                </w:r>
+                <w:r>
+                  <w:rPr>
+                    <w:noProof/>
+                  </w:rPr>
+                  <w:t xml:space="preserve">vol. 928, 2020. </w:t>
+                </w:r>
+              </w:p>
+            </w:tc>
+          </w:tr>
+          <w:tr>
+            <w:trPr>
+              <w:divId w:val="1530223782"/>
+              <w:tblCellSpacing w:w="15" w:type="dxa"/>
+            </w:trPr>
+            <w:tc>
+              <w:tcPr>
+                <w:tcW w:w="50" w:type="pct"/>
+                <w:hideMark/>
+              </w:tcPr>
+              <w:p>
+                <w:pPr>
+                  <w:pStyle w:val="Bibliography"/>
+                  <w:rPr>
+                    <w:noProof/>
+                  </w:rPr>
+                </w:pPr>
+                <w:r>
+                  <w:rPr>
+                    <w:noProof/>
+                  </w:rPr>
+                  <w:t xml:space="preserve">[7] </w:t>
+                </w:r>
+              </w:p>
+            </w:tc>
+            <w:tc>
+              <w:tcPr>
+                <w:tcW w:w="0" w:type="auto"/>
+                <w:hideMark/>
+              </w:tcPr>
+              <w:p>
+                <w:pPr>
+                  <w:pStyle w:val="Bibliography"/>
+                  <w:rPr>
+                    <w:noProof/>
+                  </w:rPr>
+                </w:pPr>
+                <w:r>
+                  <w:rPr>
+                    <w:noProof/>
+                  </w:rPr>
+                  <w:t xml:space="preserve">H. F. Kareem, M. S. Al-Husieny, F. Y. Mohsen, E. A. Khalil and Z. S. Hassan, "Evaluation of SVM Performance in the Detection of Lung Cancer in Marked CT Scan Dataset," </w:t>
+                </w:r>
+                <w:r>
+                  <w:rPr>
+                    <w:i/>
+                    <w:iCs/>
+                    <w:noProof/>
+                  </w:rPr>
+                  <w:t xml:space="preserve">Indonesian Journal of Electrical Engineering and Computer Science, </w:t>
+                </w:r>
+                <w:r>
+                  <w:rPr>
+                    <w:noProof/>
+                  </w:rPr>
+                  <w:t xml:space="preserve">vol. 21, 2021. </w:t>
+                </w:r>
+              </w:p>
+            </w:tc>
+          </w:tr>
+          <w:tr>
+            <w:trPr>
+              <w:divId w:val="1530223782"/>
+              <w:tblCellSpacing w:w="15" w:type="dxa"/>
+            </w:trPr>
+            <w:tc>
+              <w:tcPr>
+                <w:tcW w:w="50" w:type="pct"/>
+                <w:hideMark/>
+              </w:tcPr>
+              <w:p>
+                <w:pPr>
+                  <w:pStyle w:val="Bibliography"/>
+                  <w:rPr>
+                    <w:noProof/>
+                  </w:rPr>
+                </w:pPr>
+                <w:r>
+                  <w:rPr>
+                    <w:noProof/>
+                  </w:rPr>
+                  <w:t xml:space="preserve">[8] </w:t>
+                </w:r>
+              </w:p>
+            </w:tc>
+            <w:tc>
+              <w:tcPr>
+                <w:tcW w:w="0" w:type="auto"/>
+                <w:hideMark/>
+              </w:tcPr>
+              <w:p>
+                <w:pPr>
+                  <w:pStyle w:val="Bibliography"/>
+                  <w:rPr>
+                    <w:noProof/>
+                  </w:rPr>
+                </w:pPr>
+                <w:r>
+                  <w:rPr>
+                    <w:noProof/>
+                  </w:rPr>
+                  <w:t xml:space="preserve">H. Alyasriy and M. Al-Huseiny, "The IQ-OTH/NCCD lung cancer dataset," </w:t>
+                </w:r>
+                <w:r>
+                  <w:rPr>
+                    <w:i/>
+                    <w:iCs/>
+                    <w:noProof/>
+                  </w:rPr>
+                  <w:t xml:space="preserve">Mendeley Data, </w:t>
+                </w:r>
+                <w:r>
+                  <w:rPr>
+                    <w:noProof/>
+                  </w:rPr>
+                  <w:t xml:space="preserve">vol. 4, 2023. </w:t>
+                </w:r>
+              </w:p>
+            </w:tc>
+          </w:tr>
+          <w:tr>
+            <w:trPr>
+              <w:divId w:val="1530223782"/>
+              <w:tblCellSpacing w:w="15" w:type="dxa"/>
+            </w:trPr>
+            <w:tc>
+              <w:tcPr>
+                <w:tcW w:w="50" w:type="pct"/>
+                <w:hideMark/>
+              </w:tcPr>
+              <w:p>
+                <w:pPr>
+                  <w:pStyle w:val="Bibliography"/>
+                  <w:rPr>
+                    <w:noProof/>
+                  </w:rPr>
+                </w:pPr>
+                <w:r>
+                  <w:rPr>
+                    <w:noProof/>
+                  </w:rPr>
+                  <w:t xml:space="preserve">[9] </w:t>
+                </w:r>
+              </w:p>
+            </w:tc>
+            <w:tc>
+              <w:tcPr>
+                <w:tcW w:w="0" w:type="auto"/>
+                <w:hideMark/>
+              </w:tcPr>
+              <w:p>
+                <w:pPr>
+                  <w:pStyle w:val="Bibliography"/>
+                  <w:rPr>
+                    <w:noProof/>
+                  </w:rPr>
+                </w:pPr>
+                <w:r>
+                  <w:rPr>
+                    <w:noProof/>
+                  </w:rPr>
+                  <w:t>A. Mahimkar, "Lung Cancer Prediction on Image Data," Kaggle, 2019. [Online]. Available: https://www.kaggle.com/code/adityamahimkar/lung-cancer-prediction-on-image-data/notebook.</w:t>
+                </w:r>
+              </w:p>
+            </w:tc>
+          </w:tr>
+          <w:tr>
+            <w:trPr>
+              <w:divId w:val="1530223782"/>
+              <w:tblCellSpacing w:w="15" w:type="dxa"/>
+            </w:trPr>
+            <w:tc>
+              <w:tcPr>
+                <w:tcW w:w="50" w:type="pct"/>
+                <w:hideMark/>
+              </w:tcPr>
+              <w:p>
+                <w:pPr>
+                  <w:pStyle w:val="Bibliography"/>
+                  <w:rPr>
+                    <w:noProof/>
+                  </w:rPr>
+                </w:pPr>
+                <w:r>
+                  <w:rPr>
+                    <w:noProof/>
+                  </w:rPr>
+                  <w:t xml:space="preserve">[10] </w:t>
+                </w:r>
+              </w:p>
+            </w:tc>
+            <w:tc>
+              <w:tcPr>
+                <w:tcW w:w="0" w:type="auto"/>
+                <w:hideMark/>
+              </w:tcPr>
+              <w:p>
+                <w:pPr>
+                  <w:pStyle w:val="Bibliography"/>
+                  <w:rPr>
+                    <w:noProof/>
+                  </w:rPr>
+                </w:pPr>
+                <w:r>
+                  <w:rPr>
+                    <w:noProof/>
+                  </w:rPr>
+                  <w:t xml:space="preserve">D. P. Kingma and J. Ba, "Adam: A Method for Stochastic Optimization," </w:t>
+                </w:r>
+                <w:r>
+                  <w:rPr>
+                    <w:i/>
+                    <w:iCs/>
+                    <w:noProof/>
+                  </w:rPr>
+                  <w:t xml:space="preserve">3rd International Conference on Learning Representations (ICLR), </w:t>
+                </w:r>
+                <w:r>
+                  <w:rPr>
+                    <w:noProof/>
+                  </w:rPr>
+                  <w:t xml:space="preserve">2015. </w:t>
+                </w:r>
+              </w:p>
+            </w:tc>
+          </w:tr>
+        </w:tbl>
+        <w:p>
+          <w:pPr>
+            <w:divId w:val="1530223782"/>
+            <w:rPr>
+              <w:rFonts w:eastAsia="Times New Roman"/>
+              <w:noProof/>
+            </w:rPr>
+          </w:pPr>
+        </w:p>
+        <w:p>
+          <w:r>
+            <w:fldChar w:fldCharType="end"/>
+          </w:r>
+        </w:p>
       </w:sdtContent>
     </w:sdt>
-    <w:p>
-      <w:pPr>
-        <w:spacing w:line="276" w:lineRule="auto"/>
-      </w:pPr>
-      <w:r>
-        <w:br w:type="page"/>
-      </w:r>
-    </w:p>
-    <w:p/>
     <w:sectPr>
       <w:pgSz w:w="12240" w:h="15840"/>
       <w:pgMar w:top="1440" w:right="1440" w:bottom="1440" w:left="1440" w:header="708" w:footer="708" w:gutter="0"/>
@@ -24121,6 +24961,18 @@
       <w:lang w:val="en-US"/>
     </w:rPr>
   </w:style>
+  <w:style w:type="character" w:styleId="FollowedHyperlink">
+    <w:name w:val="FollowedHyperlink"/>
+    <w:basedOn w:val="DefaultParagraphFont"/>
+    <w:uiPriority w:val="99"/>
+    <w:semiHidden/>
+    <w:unhideWhenUsed/>
+    <w:rsid w:val="00BC5F58"/>
+    <w:rPr>
+      <w:color w:val="800080" w:themeColor="followedHyperlink"/>
+      <w:u w:val="single"/>
+    </w:rPr>
+  </w:style>
 </w:styles>
 </file>
 
@@ -24410,60 +25262,231 @@
 <file path=customXml/item1.xml><?xml version="1.0" encoding="utf-8"?>
 <b:Sources xmlns:b="http://schemas.openxmlformats.org/officeDocument/2006/bibliography" xmlns="http://schemas.openxmlformats.org/officeDocument/2006/bibliography" SelectedStyle="\IEEE2006OfficeOnline.xsl" StyleName="IEEE" Version="2006">
   <b:Source>
-    <b:Tag>REZ96</b:Tag>
-    <b:SourceType>JournalArticle</b:SourceType>
-    <b:Guid>{D2538DC3-9D87-4349-95FC-6B2AF20451EF}</b:Guid>
+    <b:Tag>Git25</b:Tag>
+    <b:SourceType>InternetSite</b:SourceType>
+    <b:Guid>{AEB12AF3-1E02-47AB-AFA3-C18848B80FC2}</b:Guid>
+    <b:Title>Octoverse: A new developer joins GitHub every second as AI leads TypeScript to #1</b:Title>
+    <b:Year>2025</b:Year>
+    <b:Author>
+      <b:Author>
+        <b:Corporate>GitHub</b:Corporate>
+      </b:Author>
+    </b:Author>
+    <b:ProductionCompany>GitHub</b:ProductionCompany>
+    <b:Month>October</b:Month>
+    <b:Day>28</b:Day>
+    <b:URL>https://github.blog/news-insights/octoverse/octoverse-a-new-developer-joins-github-every-second-as-ai-leads-typescript-to-1/</b:URL>
+    <b:RefOrder>2</b:RefOrder>
+  </b:Source>
+  <b:Source>
+    <b:Tag>PyT</b:Tag>
+    <b:SourceType>InternetSite</b:SourceType>
+    <b:Guid>{26209ECB-0627-4C4C-8312-587553325A4E}</b:Guid>
+    <b:Author>
+      <b:Author>
+        <b:Corporate>PyTorch</b:Corporate>
+      </b:Author>
+    </b:Author>
+    <b:Title>PyTorch GitHub Repository</b:Title>
+    <b:ProductionCompany>GitHub</b:ProductionCompany>
+    <b:URL>https://github.com/pytorch/pytorch</b:URL>
+    <b:RefOrder>1</b:RefOrder>
+  </b:Source>
+  <b:Source>
+    <b:Tag>Tor</b:Tag>
+    <b:SourceType>InternetSite</b:SourceType>
+    <b:Guid>{7346FD51-05D1-4DBA-81F2-3F50B5702DFE}</b:Guid>
+    <b:Title>TorchSharp Github Repository</b:Title>
+    <b:Author>
+      <b:Author>
+        <b:Corporate>TorchSharp</b:Corporate>
+      </b:Author>
+    </b:Author>
+    <b:ProductionCompany>GitHub</b:ProductionCompany>
+    <b:URL>https://github.com/dotnet/torchsharp</b:URL>
+    <b:RefOrder>4</b:RefOrder>
+  </b:Source>
+  <b:Source>
+    <b:Tag>Adi19</b:Tag>
+    <b:SourceType>InternetSite</b:SourceType>
+    <b:Guid>{E3C519C8-EDB6-4DB5-9AA8-1EDB3C3D98E3}</b:Guid>
+    <b:Title>Lung Cancer Prediction on Image Data</b:Title>
+    <b:Year>2019</b:Year>
     <b:Author>
       <b:Author>
         <b:NameList>
           <b:Person>
-            <b:Last>Ziemer</b:Last>
-            <b:First>R.E.</b:First>
+            <b:Last>Mahimkar</b:Last>
+            <b:First>Aditya</b:First>
           </b:Person>
         </b:NameList>
       </b:Author>
     </b:Author>
-    <b:Title>An overview of modulation and coding for wireless communications</b:Title>
-    <b:Year>1996</b:Year>
-    <b:JournalName>46th Vehicular Technology Conference</b:JournalName>
-    <b:Pages>26-30</b:Pages>
-    <b:RefOrder>1</b:RefOrder>
+    <b:ProductionCompany>Kaggle</b:ProductionCompany>
+    <b:URL>https://www.kaggle.com/code/adityamahimkar/lung-cancer-prediction-on-image-data/notebook</b:URL>
+    <b:RefOrder>9</b:RefOrder>
   </b:Source>
   <b:Source>
-    <b:Tag>HCF95</b:Tag>
+    <b:Tag>Pas19</b:Tag>
     <b:SourceType>JournalArticle</b:SourceType>
-    <b:Guid>{EE75808D-763F-42A5-AD4B-8E3E88E97648}</b:Guid>
+    <b:Guid>{E1A35937-A545-4526-B422-C80E6AEEE74E}</b:Guid>
+    <b:Title>PyTorch: An Imperative Style, High-Performance Deep Learning Library</b:Title>
+    <b:Year>2019</b:Year>
+    <b:Author>
+      <b:Author>
+        <b:Corporate>Paszke, A. et al.</b:Corporate>
+      </b:Author>
+    </b:Author>
+    <b:JournalName>Advances in Neural Information Processing Systems</b:JournalName>
+    <b:Volume>32</b:Volume>
+    <b:RefOrder>3</b:RefOrder>
+  </b:Source>
+  <b:Source>
+    <b:Tag>DMW11</b:Tag>
+    <b:SourceType>JournalArticle</b:SourceType>
+    <b:Guid>{C412D69F-1571-4E9B-8D0A-8E11B9C075BE}</b:Guid>
+    <b:Title>Evaluation: from precision, recall and F-measure to ROC, informedness, markedness and correlation</b:Title>
+    <b:Year>2011</b:Year>
     <b:Author>
       <b:Author>
         <b:NameList>
           <b:Person>
-            <b:Last>Hooijen</b:Last>
-            <b:First>H.C.</b:First>
-            <b:Middle>Ferreira and O.</b:Middle>
+            <b:Last>Powers</b:Last>
+            <b:First>D.</b:First>
+            <b:Middle>M. W.</b:Middle>
           </b:Person>
         </b:NameList>
       </b:Author>
     </b:Author>
-    <b:Title>Power Line Communications: An Overview</b:Title>
-    <b:JournalName>The Transactions on of The S.A. Electrical Engineers</b:JournalName>
-    <b:Year>1995</b:Year>
-    <b:Pages>154-161</b:Pages>
-    <b:RefOrder>2</b:RefOrder>
+    <b:JournalName>Journal of Machine Learning Technologies</b:JournalName>
+    <b:Volume>2</b:Volume>
+    <b:RefOrder>5</b:RefOrder>
   </b:Source>
   <b:Source>
-    <b:Tag>IEE</b:Tag>
-    <b:SourceType>InternetSite</b:SourceType>
-    <b:Guid>{1F430EA9-B634-457A-B7C5-E749FEAB2441}</b:Guid>
-    <b:Title>IEEE P1901 Working Group 2010</b:Title>
-    <b:ProductionCompany>Standard for Broadband over Powerline Networks:</b:ProductionCompany>
-    <b:URL>http://grouper.ieee.org/groups/1901/</b:URL>
-    <b:RefOrder>3</b:RefOrder>
+    <b:Tag>HFA20</b:Tag>
+    <b:SourceType>JournalArticle</b:SourceType>
+    <b:Guid>{CCD44B28-C147-4A3A-A7DD-16AC8E72C5D1}</b:Guid>
+    <b:Author>
+      <b:Author>
+        <b:NameList>
+          <b:Person>
+            <b:Last>Al-Yasriy</b:Last>
+            <b:First>H.</b:First>
+          </b:Person>
+          <b:Person>
+            <b:Last>Al-Husieny</b:Last>
+            <b:First>M. S.</b:First>
+          </b:Person>
+          <b:Person>
+            <b:Last>Mohsen</b:Last>
+            <b:First>F. Y.</b:First>
+          </b:Person>
+          <b:Person>
+            <b:Last>Khalil</b:Last>
+            <b:First>E. A.</b:First>
+          </b:Person>
+          <b:Person>
+            <b:Last>Hassan</b:Last>
+            <b:First>Z. S.</b:First>
+          </b:Person>
+        </b:NameList>
+      </b:Author>
+    </b:Author>
+    <b:Title>Diagnosis of Lung Cancer Based on CT Scans Using CNN</b:Title>
+    <b:JournalName>IOP Conference Series: Materials Science and Engineering</b:JournalName>
+    <b:Year>2020</b:Year>
+    <b:Volume>928</b:Volume>
+    <b:RefOrder>6</b:RefOrder>
+  </b:Source>
+  <b:Source>
+    <b:Tag>HFK21</b:Tag>
+    <b:SourceType>JournalArticle</b:SourceType>
+    <b:Guid>{6ECA1DC6-82F8-4BE2-B09B-351F3A0E26AF}</b:Guid>
+    <b:Author>
+      <b:Author>
+        <b:NameList>
+          <b:Person>
+            <b:Last>Kareem</b:Last>
+            <b:First>H. F.</b:First>
+          </b:Person>
+          <b:Person>
+            <b:Last>Al-Husieny</b:Last>
+            <b:First>M. S.</b:First>
+          </b:Person>
+          <b:Person>
+            <b:Last>Mohsen</b:Last>
+            <b:First>F. Y.</b:First>
+          </b:Person>
+          <b:Person>
+            <b:Last>Khalil</b:Last>
+            <b:First>E. A.</b:First>
+          </b:Person>
+          <b:Person>
+            <b:Last>Hassan</b:Last>
+            <b:First>Z. S.</b:First>
+          </b:Person>
+        </b:NameList>
+      </b:Author>
+    </b:Author>
+    <b:Title>Evaluation of SVM Performance in the Detection of Lung Cancer in Marked CT Scan Dataset</b:Title>
+    <b:JournalName>Indonesian Journal of Electrical Engineering and Computer Science</b:JournalName>
+    <b:Year>2021</b:Year>
+    <b:Volume>21</b:Volume>
+    <b:RefOrder>7</b:RefOrder>
+  </b:Source>
+  <b:Source>
+    <b:Tag>aly</b:Tag>
+    <b:SourceType>JournalArticle</b:SourceType>
+    <b:Guid>{46E1ED6F-56B3-4DEC-BBC0-02DD6B7E3776}</b:Guid>
+    <b:Author>
+      <b:Author>
+        <b:NameList>
+          <b:Person>
+            <b:Last>Alyasriy</b:Last>
+            <b:First>Hamdalla</b:First>
+          </b:Person>
+          <b:Person>
+            <b:Last>Al-Huseiny</b:Last>
+            <b:First>Muayed</b:First>
+          </b:Person>
+        </b:NameList>
+      </b:Author>
+    </b:Author>
+    <b:Title>The IQ-OTH/NCCD lung cancer dataset</b:Title>
+    <b:JournalName>Mendeley Data</b:JournalName>
+    <b:Volume>4</b:Volume>
+    <b:Year>2023</b:Year>
+    <b:RefOrder>8</b:RefOrder>
+  </b:Source>
+  <b:Source>
+    <b:Tag>Die15</b:Tag>
+    <b:SourceType>JournalArticle</b:SourceType>
+    <b:Guid>{6048DF5D-8EAB-47A9-98C9-BC7613CA3CC2}</b:Guid>
+    <b:Title>Adam: A Method for Stochastic Optimization</b:Title>
+    <b:Year>2015</b:Year>
+    <b:Author>
+      <b:Author>
+        <b:NameList>
+          <b:Person>
+            <b:Last>Kingma</b:Last>
+            <b:Middle>P.</b:Middle>
+            <b:First>Diederik</b:First>
+          </b:Person>
+          <b:Person>
+            <b:Last>Ba</b:Last>
+            <b:First>Jimmy</b:First>
+          </b:Person>
+        </b:NameList>
+      </b:Author>
+    </b:Author>
+    <b:JournalName>3rd International Conference on Learning Representations (ICLR)</b:JournalName>
+    <b:RefOrder>10</b:RefOrder>
   </b:Source>
 </b:Sources>
 </file>
 
 <file path=customXml/itemProps1.xml><?xml version="1.0" encoding="utf-8"?>
-<ds:datastoreItem xmlns:ds="http://schemas.openxmlformats.org/officeDocument/2006/customXml" ds:itemID="{8C26FFCD-02B8-4C1B-A44B-FD143588CAFC}">
+<ds:datastoreItem xmlns:ds="http://schemas.openxmlformats.org/officeDocument/2006/customXml" ds:itemID="{C4DA6E3D-E0BD-483C-AF19-70ED169AD605}">
   <ds:schemaRefs>
     <ds:schemaRef ds:uri="http://schemas.openxmlformats.org/officeDocument/2006/bibliography"/>
   </ds:schemaRefs>

</xml_diff>